<commit_message>
an md file has beeen added for the same big update that is going to happen soon
</commit_message>
<xml_diff>
--- a/docs/tracker_rebuild_plan.docx
+++ b/docs/tracker_rebuild_plan.docx
@@ -6453,6 +6453,4930 @@
         </w:tc>
       </w:tr>
     </w:tbl>
+    <w:p>
+      <w:pPr>
+        <w:spacing w:before="0" w:after="0"/>
+      </w:pPr>
+      <w:r>
+        <w:rPr>
+          <w:sz w:val="22"/>
+          <w:szCs w:val="22"/>
+        </w:rPr>
+        <w:t xml:space="preserve"/>
+      </w:r>
+    </w:p>
+    <w:p>
+      <w:pPr>
+        <w:pBdr>
+          <w:bottom w:val="single" w:color="DDDDDD" w:sz="4"/>
+        </w:pBdr>
+        <w:spacing w:before="160" w:after="160"/>
+      </w:pPr>
+      <w:r>
+        <w:t xml:space="preserve"/>
+      </w:r>
+    </w:p>
+    <w:p>
+      <w:pPr>
+        <w:pStyle w:val="Heading1"/>
+        <w:spacing w:before="360" w:after="120"/>
+      </w:pPr>
+      <w:r>
+        <w:rPr>
+          <w:rFonts w:ascii="Arial" w:cs="Arial" w:eastAsia="Arial" w:hAnsi="Arial"/>
+          <w:b/>
+          <w:bCs/>
+          <w:color w:val="10513C"/>
+          <w:sz w:val="32"/>
+          <w:szCs w:val="32"/>
+        </w:rPr>
+        <w:t xml:space="preserve">9. Insights Tab — Visual Design &amp; Graph Specifications</w:t>
+      </w:r>
+    </w:p>
+    <w:p>
+      <w:pPr>
+        <w:spacing w:before="60" w:after="80"/>
+      </w:pPr>
+      <w:r>
+        <w:rPr>
+          <w:rFonts w:ascii="Arial" w:cs="Arial" w:eastAsia="Arial" w:hAnsi="Arial"/>
+          <w:color w:val="222222"/>
+          <w:sz w:val="22"/>
+          <w:szCs w:val="22"/>
+        </w:rPr>
+        <w:t xml:space="preserve">Each insight is presented as a card. The card shows a headline number, a one-line summary, a small preview chart, and a coloured status tag (on track / needs attention / pattern found). Clicking any card expands a drilldown panel directly below it with a full-size chart and a plain-language interpretation. No separate page navigation is needed — the panel opens inline.</w:t>
+      </w:r>
+    </w:p>
+    <w:p>
+      <w:pPr>
+        <w:spacing w:before="0" w:after="0"/>
+      </w:pPr>
+      <w:r>
+        <w:rPr>
+          <w:sz w:val="22"/>
+          <w:szCs w:val="22"/>
+        </w:rPr>
+        <w:t xml:space="preserve"/>
+      </w:r>
+    </w:p>
+    <w:tbl>
+      <w:tblPr>
+        <w:tblW w:type="dxa" w:w="9360"/>
+        <w:tblBorders>
+          <w:top w:val="single" w:color="auto" w:sz="4"/>
+          <w:left w:val="single" w:color="auto" w:sz="4"/>
+          <w:bottom w:val="single" w:color="auto" w:sz="4"/>
+          <w:right w:val="single" w:color="auto" w:sz="4"/>
+          <w:insideH w:val="single" w:color="auto" w:sz="4"/>
+          <w:insideV w:val="single" w:color="auto" w:sz="4"/>
+        </w:tblBorders>
+      </w:tblPr>
+      <w:tblGrid>
+        <w:gridCol w:w="9360"/>
+      </w:tblGrid>
+      <w:tr>
+        <w:tc>
+          <w:tcPr>
+            <w:tcBorders>
+              <w:top w:val="nil"/>
+              <w:left w:val="nil"/>
+              <w:bottom w:val="nil"/>
+              <w:right w:val="nil"/>
+            </w:tcBorders>
+            <w:shd w:fill="E1F5EE" w:val="clear"/>
+            <w:tcMar>
+              <w:top w:type="dxa" w:w="160"/>
+              <w:left w:type="dxa" w:w="240"/>
+              <w:bottom w:type="dxa" w:w="160"/>
+              <w:right w:type="dxa" w:w="240"/>
+            </w:tcMar>
+          </w:tcPr>
+          <w:p>
+            <w:r>
+              <w:rPr>
+                <w:rFonts w:ascii="Arial" w:cs="Arial" w:eastAsia="Arial" w:hAnsi="Arial"/>
+                <w:b w:val="false"/>
+                <w:bCs w:val="false"/>
+                <w:color w:val="10513C"/>
+                <w:sz w:val="22"/>
+                <w:szCs w:val="22"/>
+              </w:rPr>
+              <w:t xml:space="preserve">Design principle: the card is the hook, the drilldown is the answer. The card tells you whether something needs your attention. The drilldown tells you exactly what to do about it.</w:t>
+            </w:r>
+          </w:p>
+        </w:tc>
+      </w:tr>
+    </w:tbl>
+    <w:p>
+      <w:pPr>
+        <w:spacing w:before="0" w:after="0"/>
+      </w:pPr>
+      <w:r>
+        <w:rPr>
+          <w:sz w:val="22"/>
+          <w:szCs w:val="22"/>
+        </w:rPr>
+        <w:t xml:space="preserve"/>
+      </w:r>
+    </w:p>
+    <w:p>
+      <w:pPr>
+        <w:pStyle w:val="Heading2"/>
+        <w:spacing w:before="280" w:after="100"/>
+      </w:pPr>
+      <w:r>
+        <w:rPr>
+          <w:rFonts w:ascii="Arial" w:cs="Arial" w:eastAsia="Arial" w:hAnsi="Arial"/>
+          <w:b/>
+          <w:bCs/>
+          <w:color w:val="111111"/>
+          <w:sz w:val="26"/>
+          <w:szCs w:val="26"/>
+        </w:rPr>
+        <w:t xml:space="preserve">9.1  Card layout structure</w:t>
+      </w:r>
+    </w:p>
+    <w:p>
+      <w:pPr>
+        <w:spacing w:before="60" w:after="80"/>
+      </w:pPr>
+      <w:r>
+        <w:rPr>
+          <w:rFonts w:ascii="Arial" w:cs="Arial" w:eastAsia="Arial" w:hAnsi="Arial"/>
+          <w:color w:val="222222"/>
+          <w:sz w:val="22"/>
+          <w:szCs w:val="22"/>
+        </w:rPr>
+        <w:t xml:space="preserve">Every insight card follows the same structure:</w:t>
+      </w:r>
+    </w:p>
+    <w:p>
+      <w:pPr>
+        <w:pStyle w:val="ListParagraph"/>
+        <w:numPr>
+          <w:ilvl w:val="0"/>
+          <w:numId w:val="2"/>
+        </w:numPr>
+        <w:spacing w:before="40" w:after="40"/>
+      </w:pPr>
+      <w:r>
+        <w:rPr>
+          <w:rFonts w:ascii="Arial" w:cs="Arial" w:eastAsia="Arial" w:hAnsi="Arial"/>
+          <w:color w:val="222222"/>
+          <w:sz w:val="22"/>
+          <w:szCs w:val="22"/>
+        </w:rPr>
+        <w:t xml:space="preserve">Header row: insight name (small caps) + arrow indicator</w:t>
+      </w:r>
+    </w:p>
+    <w:p>
+      <w:pPr>
+        <w:pStyle w:val="ListParagraph"/>
+        <w:numPr>
+          <w:ilvl w:val="0"/>
+          <w:numId w:val="2"/>
+        </w:numPr>
+        <w:spacing w:before="40" w:after="40"/>
+      </w:pPr>
+      <w:r>
+        <w:rPr>
+          <w:rFonts w:ascii="Arial" w:cs="Arial" w:eastAsia="Arial" w:hAnsi="Arial"/>
+          <w:color w:val="222222"/>
+          <w:sz w:val="22"/>
+          <w:szCs w:val="22"/>
+        </w:rPr>
+        <w:t xml:space="preserve">Headline value: the single most important number or label for this insight</w:t>
+      </w:r>
+    </w:p>
+    <w:p>
+      <w:pPr>
+        <w:pStyle w:val="ListParagraph"/>
+        <w:numPr>
+          <w:ilvl w:val="0"/>
+          <w:numId w:val="2"/>
+        </w:numPr>
+        <w:spacing w:before="40" w:after="40"/>
+      </w:pPr>
+      <w:r>
+        <w:rPr>
+          <w:rFonts w:ascii="Arial" w:cs="Arial" w:eastAsia="Arial" w:hAnsi="Arial"/>
+          <w:color w:val="222222"/>
+          <w:sz w:val="22"/>
+          <w:szCs w:val="22"/>
+        </w:rPr>
+        <w:t xml:space="preserve">Subtitle: one sentence of context (e.g. 'vs last week', 'top area by weighted hours')</w:t>
+      </w:r>
+    </w:p>
+    <w:p>
+      <w:pPr>
+        <w:pStyle w:val="ListParagraph"/>
+        <w:numPr>
+          <w:ilvl w:val="0"/>
+          <w:numId w:val="2"/>
+        </w:numPr>
+        <w:spacing w:before="40" w:after="40"/>
+      </w:pPr>
+      <w:r>
+        <w:rPr>
+          <w:rFonts w:ascii="Arial" w:cs="Arial" w:eastAsia="Arial" w:hAnsi="Arial"/>
+          <w:color w:val="222222"/>
+          <w:sz w:val="22"/>
+          <w:szCs w:val="22"/>
+        </w:rPr>
+        <w:t xml:space="preserve">Preview chart: small inline chart, 80px tall, no axes, no labels — purely visual signal</w:t>
+      </w:r>
+    </w:p>
+    <w:p>
+      <w:pPr>
+        <w:pStyle w:val="ListParagraph"/>
+        <w:numPr>
+          <w:ilvl w:val="0"/>
+          <w:numId w:val="2"/>
+        </w:numPr>
+        <w:spacing w:before="40" w:after="40"/>
+      </w:pPr>
+      <w:r>
+        <w:rPr>
+          <w:rFonts w:ascii="Arial" w:cs="Arial" w:eastAsia="Arial" w:hAnsi="Arial"/>
+          <w:color w:val="222222"/>
+          <w:sz w:val="22"/>
+          <w:szCs w:val="22"/>
+        </w:rPr>
+        <w:t xml:space="preserve">Status tag: one of three states — green 'On track', amber 'Needs attention', teal 'Pattern found'</w:t>
+      </w:r>
+    </w:p>
+    <w:p>
+      <w:pPr>
+        <w:spacing w:before="0" w:after="0"/>
+      </w:pPr>
+      <w:r>
+        <w:rPr>
+          <w:sz w:val="22"/>
+          <w:szCs w:val="22"/>
+        </w:rPr>
+        <w:t xml:space="preserve"/>
+      </w:r>
+    </w:p>
+    <w:p>
+      <w:pPr>
+        <w:spacing w:before="60" w:after="80"/>
+      </w:pPr>
+      <w:r>
+        <w:rPr>
+          <w:rFonts w:ascii="Arial" w:cs="Arial" w:eastAsia="Arial" w:hAnsi="Arial"/>
+          <w:color w:val="222222"/>
+          <w:sz w:val="22"/>
+          <w:szCs w:val="22"/>
+        </w:rPr>
+        <w:t xml:space="preserve">Cards are arranged in a two-column grid on desktop (the existing ins-grid layout in styles.css). The three smaller cards in row 3 use a three-column grid.</w:t>
+      </w:r>
+    </w:p>
+    <w:p>
+      <w:pPr>
+        <w:spacing w:before="0" w:after="0"/>
+      </w:pPr>
+      <w:r>
+        <w:rPr>
+          <w:sz w:val="22"/>
+          <w:szCs w:val="22"/>
+        </w:rPr>
+        <w:t xml:space="preserve"/>
+      </w:r>
+    </w:p>
+    <w:p>
+      <w:pPr>
+        <w:pStyle w:val="Heading2"/>
+        <w:spacing w:before="280" w:after="100"/>
+      </w:pPr>
+      <w:r>
+        <w:rPr>
+          <w:rFonts w:ascii="Arial" w:cs="Arial" w:eastAsia="Arial" w:hAnsi="Arial"/>
+          <w:b/>
+          <w:bCs/>
+          <w:color w:val="111111"/>
+          <w:sz w:val="26"/>
+          <w:szCs w:val="26"/>
+        </w:rPr>
+        <w:t xml:space="preserve">9.2  The six insight cards</w:t>
+      </w:r>
+    </w:p>
+    <w:p>
+      <w:pPr>
+        <w:spacing w:before="0" w:after="0"/>
+      </w:pPr>
+      <w:r>
+        <w:rPr>
+          <w:sz w:val="22"/>
+          <w:szCs w:val="22"/>
+        </w:rPr>
+        <w:t xml:space="preserve"/>
+      </w:r>
+    </w:p>
+    <w:p>
+      <w:pPr>
+        <w:spacing w:before="200" w:after="80"/>
+      </w:pPr>
+      <w:r>
+        <w:rPr>
+          <w:rFonts w:ascii="Arial" w:cs="Arial" w:eastAsia="Arial" w:hAnsi="Arial"/>
+          <w:b/>
+          <w:bCs/>
+          <w:color w:val="5F5E5A"/>
+          <w:sz w:val="22"/>
+          <w:szCs w:val="22"/>
+        </w:rPr>
+        <w:t xml:space="preserve">1. Weekly momentum</w:t>
+      </w:r>
+    </w:p>
+    <w:tbl>
+      <w:tblPr>
+        <w:tblW w:type="dxa" w:w="9360"/>
+        <w:tblBorders>
+          <w:top w:val="single" w:color="auto" w:sz="4"/>
+          <w:left w:val="single" w:color="auto" w:sz="4"/>
+          <w:bottom w:val="single" w:color="auto" w:sz="4"/>
+          <w:right w:val="single" w:color="auto" w:sz="4"/>
+          <w:insideH w:val="single" w:color="auto" w:sz="4"/>
+          <w:insideV w:val="single" w:color="auto" w:sz="4"/>
+        </w:tblBorders>
+      </w:tblPr>
+      <w:tblGrid>
+        <w:gridCol w:w="2800"/>
+        <w:gridCol w:w="6560"/>
+      </w:tblGrid>
+      <w:tr>
+        <w:tc>
+          <w:tcPr>
+            <w:tcBorders>
+              <w:top w:val="single" w:color="10513C" w:sz="4"/>
+              <w:left w:val="nil"/>
+              <w:bottom w:val="single" w:color="10513C" w:sz="4"/>
+              <w:right w:val="nil"/>
+            </w:tcBorders>
+            <w:shd w:fill="10513C" w:val="clear"/>
+            <w:tcMar>
+              <w:top w:type="dxa" w:w="100"/>
+              <w:left w:type="dxa" w:w="160"/>
+              <w:bottom w:type="dxa" w:w="100"/>
+              <w:right w:type="dxa" w:w="160"/>
+            </w:tcMar>
+          </w:tcPr>
+          <w:p>
+            <w:r>
+              <w:rPr>
+                <w:rFonts w:ascii="Arial" w:cs="Arial" w:eastAsia="Arial" w:hAnsi="Arial"/>
+                <w:b/>
+                <w:bCs/>
+                <w:color w:val="FFFFFF"/>
+                <w:sz w:val="20"/>
+                <w:szCs w:val="20"/>
+              </w:rPr>
+              <w:t xml:space="preserve">Property</w:t>
+            </w:r>
+          </w:p>
+        </w:tc>
+        <w:tc>
+          <w:tcPr>
+            <w:tcBorders>
+              <w:top w:val="single" w:color="10513C" w:sz="4"/>
+              <w:left w:val="nil"/>
+              <w:bottom w:val="single" w:color="10513C" w:sz="4"/>
+              <w:right w:val="nil"/>
+            </w:tcBorders>
+            <w:shd w:fill="10513C" w:val="clear"/>
+            <w:tcMar>
+              <w:top w:type="dxa" w:w="100"/>
+              <w:left w:type="dxa" w:w="160"/>
+              <w:bottom w:type="dxa" w:w="100"/>
+              <w:right w:type="dxa" w:w="160"/>
+            </w:tcMar>
+          </w:tcPr>
+          <w:p>
+            <w:r>
+              <w:rPr>
+                <w:rFonts w:ascii="Arial" w:cs="Arial" w:eastAsia="Arial" w:hAnsi="Arial"/>
+                <w:b/>
+                <w:bCs/>
+                <w:color w:val="FFFFFF"/>
+                <w:sz w:val="20"/>
+                <w:szCs w:val="20"/>
+              </w:rPr>
+              <w:t xml:space="preserve">Specification</w:t>
+            </w:r>
+          </w:p>
+        </w:tc>
+      </w:tr>
+      <w:tr>
+        <w:tc>
+          <w:tcPr>
+            <w:tcBorders>
+              <w:top w:val="single" w:color="CCCCCC" w:sz="1"/>
+              <w:left w:val="nil"/>
+              <w:bottom w:val="single" w:color="CCCCCC" w:sz="1"/>
+              <w:right w:val="nil"/>
+            </w:tcBorders>
+            <w:shd w:fill="FFFFFF" w:val="clear"/>
+            <w:tcMar>
+              <w:top w:type="dxa" w:w="100"/>
+              <w:left w:type="dxa" w:w="160"/>
+              <w:bottom w:type="dxa" w:w="100"/>
+              <w:right w:type="dxa" w:w="160"/>
+            </w:tcMar>
+          </w:tcPr>
+          <w:p>
+            <w:r>
+              <w:rPr>
+                <w:rFonts w:ascii="Arial" w:cs="Arial" w:eastAsia="Arial" w:hAnsi="Arial"/>
+                <w:b w:val="false"/>
+                <w:bCs w:val="false"/>
+                <w:color w:val="222222"/>
+                <w:sz w:val="20"/>
+                <w:szCs w:val="20"/>
+              </w:rPr>
+              <w:t xml:space="preserve">Headline value</w:t>
+            </w:r>
+          </w:p>
+        </w:tc>
+        <w:tc>
+          <w:tcPr>
+            <w:tcBorders>
+              <w:top w:val="single" w:color="CCCCCC" w:sz="1"/>
+              <w:left w:val="nil"/>
+              <w:bottom w:val="single" w:color="CCCCCC" w:sz="1"/>
+              <w:right w:val="nil"/>
+            </w:tcBorders>
+            <w:shd w:fill="FFFFFF" w:val="clear"/>
+            <w:tcMar>
+              <w:top w:type="dxa" w:w="100"/>
+              <w:left w:type="dxa" w:w="160"/>
+              <w:bottom w:type="dxa" w:w="100"/>
+              <w:right w:type="dxa" w:w="160"/>
+            </w:tcMar>
+          </w:tcPr>
+          <w:p>
+            <w:r>
+              <w:rPr>
+                <w:rFonts w:ascii="Arial" w:cs="Arial" w:eastAsia="Arial" w:hAnsi="Arial"/>
+                <w:b w:val="false"/>
+                <w:bCs w:val="false"/>
+                <w:color w:val="222222"/>
+                <w:sz w:val="20"/>
+                <w:szCs w:val="20"/>
+              </w:rPr>
+              <w:t xml:space="preserve">Weighted hours this week (e.g. '14.2h')</w:t>
+            </w:r>
+          </w:p>
+        </w:tc>
+      </w:tr>
+      <w:tr>
+        <w:tc>
+          <w:tcPr>
+            <w:tcBorders>
+              <w:top w:val="single" w:color="CCCCCC" w:sz="1"/>
+              <w:left w:val="nil"/>
+              <w:bottom w:val="single" w:color="CCCCCC" w:sz="1"/>
+              <w:right w:val="nil"/>
+            </w:tcBorders>
+            <w:shd w:fill="F8F8F8" w:val="clear"/>
+            <w:tcMar>
+              <w:top w:type="dxa" w:w="100"/>
+              <w:left w:type="dxa" w:w="160"/>
+              <w:bottom w:type="dxa" w:w="100"/>
+              <w:right w:type="dxa" w:w="160"/>
+            </w:tcMar>
+          </w:tcPr>
+          <w:p>
+            <w:r>
+              <w:rPr>
+                <w:rFonts w:ascii="Arial" w:cs="Arial" w:eastAsia="Arial" w:hAnsi="Arial"/>
+                <w:b w:val="false"/>
+                <w:bCs w:val="false"/>
+                <w:color w:val="222222"/>
+                <w:sz w:val="20"/>
+                <w:szCs w:val="20"/>
+              </w:rPr>
+              <w:t xml:space="preserve">Subtitle</w:t>
+            </w:r>
+          </w:p>
+        </w:tc>
+        <w:tc>
+          <w:tcPr>
+            <w:tcBorders>
+              <w:top w:val="single" w:color="CCCCCC" w:sz="1"/>
+              <w:left w:val="nil"/>
+              <w:bottom w:val="single" w:color="CCCCCC" w:sz="1"/>
+              <w:right w:val="nil"/>
+            </w:tcBorders>
+            <w:shd w:fill="F8F8F8" w:val="clear"/>
+            <w:tcMar>
+              <w:top w:type="dxa" w:w="100"/>
+              <w:left w:type="dxa" w:w="160"/>
+              <w:bottom w:type="dxa" w:w="100"/>
+              <w:right w:type="dxa" w:w="160"/>
+            </w:tcMar>
+          </w:tcPr>
+          <w:p>
+            <w:r>
+              <w:rPr>
+                <w:rFonts w:ascii="Arial" w:cs="Arial" w:eastAsia="Arial" w:hAnsi="Arial"/>
+                <w:b w:val="false"/>
+                <w:bCs w:val="false"/>
+                <w:color w:val="222222"/>
+                <w:sz w:val="20"/>
+                <w:szCs w:val="20"/>
+              </w:rPr>
+              <w:t xml:space="preserve">Weighted output this week · delta vs last week</w:t>
+            </w:r>
+          </w:p>
+        </w:tc>
+      </w:tr>
+      <w:tr>
+        <w:tc>
+          <w:tcPr>
+            <w:tcBorders>
+              <w:top w:val="single" w:color="CCCCCC" w:sz="1"/>
+              <w:left w:val="nil"/>
+              <w:bottom w:val="single" w:color="CCCCCC" w:sz="1"/>
+              <w:right w:val="nil"/>
+            </w:tcBorders>
+            <w:shd w:fill="FFFFFF" w:val="clear"/>
+            <w:tcMar>
+              <w:top w:type="dxa" w:w="100"/>
+              <w:left w:type="dxa" w:w="160"/>
+              <w:bottom w:type="dxa" w:w="100"/>
+              <w:right w:type="dxa" w:w="160"/>
+            </w:tcMar>
+          </w:tcPr>
+          <w:p>
+            <w:r>
+              <w:rPr>
+                <w:rFonts w:ascii="Arial" w:cs="Arial" w:eastAsia="Arial" w:hAnsi="Arial"/>
+                <w:b w:val="false"/>
+                <w:bCs w:val="false"/>
+                <w:color w:val="222222"/>
+                <w:sz w:val="20"/>
+                <w:szCs w:val="20"/>
+              </w:rPr>
+              <w:t xml:space="preserve">Preview chart type</w:t>
+            </w:r>
+          </w:p>
+        </w:tc>
+        <w:tc>
+          <w:tcPr>
+            <w:tcBorders>
+              <w:top w:val="single" w:color="CCCCCC" w:sz="1"/>
+              <w:left w:val="nil"/>
+              <w:bottom w:val="single" w:color="CCCCCC" w:sz="1"/>
+              <w:right w:val="nil"/>
+            </w:tcBorders>
+            <w:shd w:fill="FFFFFF" w:val="clear"/>
+            <w:tcMar>
+              <w:top w:type="dxa" w:w="100"/>
+              <w:left w:type="dxa" w:w="160"/>
+              <w:bottom w:type="dxa" w:w="100"/>
+              <w:right w:type="dxa" w:w="160"/>
+            </w:tcMar>
+          </w:tcPr>
+          <w:p>
+            <w:r>
+              <w:rPr>
+                <w:rFonts w:ascii="Arial" w:cs="Arial" w:eastAsia="Arial" w:hAnsi="Arial"/>
+                <w:b w:val="false"/>
+                <w:bCs w:val="false"/>
+                <w:color w:val="222222"/>
+                <w:sz w:val="20"/>
+                <w:szCs w:val="20"/>
+              </w:rPr>
+              <w:t xml:space="preserve">Mini bar chart — one bar per week, last 7 weeks</w:t>
+            </w:r>
+          </w:p>
+        </w:tc>
+      </w:tr>
+      <w:tr>
+        <w:tc>
+          <w:tcPr>
+            <w:tcBorders>
+              <w:top w:val="single" w:color="CCCCCC" w:sz="1"/>
+              <w:left w:val="nil"/>
+              <w:bottom w:val="single" w:color="CCCCCC" w:sz="1"/>
+              <w:right w:val="nil"/>
+            </w:tcBorders>
+            <w:shd w:fill="F8F8F8" w:val="clear"/>
+            <w:tcMar>
+              <w:top w:type="dxa" w:w="100"/>
+              <w:left w:type="dxa" w:w="160"/>
+              <w:bottom w:type="dxa" w:w="100"/>
+              <w:right w:type="dxa" w:w="160"/>
+            </w:tcMar>
+          </w:tcPr>
+          <w:p>
+            <w:r>
+              <w:rPr>
+                <w:rFonts w:ascii="Arial" w:cs="Arial" w:eastAsia="Arial" w:hAnsi="Arial"/>
+                <w:b w:val="false"/>
+                <w:bCs w:val="false"/>
+                <w:color w:val="222222"/>
+                <w:sz w:val="20"/>
+                <w:szCs w:val="20"/>
+              </w:rPr>
+              <w:t xml:space="preserve">Bar data</w:t>
+            </w:r>
+          </w:p>
+        </w:tc>
+        <w:tc>
+          <w:tcPr>
+            <w:tcBorders>
+              <w:top w:val="single" w:color="CCCCCC" w:sz="1"/>
+              <w:left w:val="nil"/>
+              <w:bottom w:val="single" w:color="CCCCCC" w:sz="1"/>
+              <w:right w:val="nil"/>
+            </w:tcBorders>
+            <w:shd w:fill="F8F8F8" w:val="clear"/>
+            <w:tcMar>
+              <w:top w:type="dxa" w:w="100"/>
+              <w:left w:type="dxa" w:w="160"/>
+              <w:bottom w:type="dxa" w:w="100"/>
+              <w:right w:type="dxa" w:w="160"/>
+            </w:tcMar>
+          </w:tcPr>
+          <w:p>
+            <w:r>
+              <w:rPr>
+                <w:rFonts w:ascii="Arial" w:cs="Arial" w:eastAsia="Arial" w:hAnsi="Arial"/>
+                <w:b w:val="false"/>
+                <w:bCs w:val="false"/>
+                <w:color w:val="222222"/>
+                <w:sz w:val="20"/>
+                <w:szCs w:val="20"/>
+              </w:rPr>
+              <w:t xml:space="preserve">Each bar = weighted hours (parseDuration × focusMultiplier)</w:t>
+            </w:r>
+          </w:p>
+        </w:tc>
+      </w:tr>
+      <w:tr>
+        <w:tc>
+          <w:tcPr>
+            <w:tcBorders>
+              <w:top w:val="single" w:color="CCCCCC" w:sz="1"/>
+              <w:left w:val="nil"/>
+              <w:bottom w:val="single" w:color="CCCCCC" w:sz="1"/>
+              <w:right w:val="nil"/>
+            </w:tcBorders>
+            <w:shd w:fill="FFFFFF" w:val="clear"/>
+            <w:tcMar>
+              <w:top w:type="dxa" w:w="100"/>
+              <w:left w:type="dxa" w:w="160"/>
+              <w:bottom w:type="dxa" w:w="100"/>
+              <w:right w:type="dxa" w:w="160"/>
+            </w:tcMar>
+          </w:tcPr>
+          <w:p>
+            <w:r>
+              <w:rPr>
+                <w:rFonts w:ascii="Arial" w:cs="Arial" w:eastAsia="Arial" w:hAnsi="Arial"/>
+                <w:b w:val="false"/>
+                <w:bCs w:val="false"/>
+                <w:color w:val="222222"/>
+                <w:sz w:val="20"/>
+                <w:szCs w:val="20"/>
+              </w:rPr>
+              <w:t xml:space="preserve">Bar colours</w:t>
+            </w:r>
+          </w:p>
+        </w:tc>
+        <w:tc>
+          <w:tcPr>
+            <w:tcBorders>
+              <w:top w:val="single" w:color="CCCCCC" w:sz="1"/>
+              <w:left w:val="nil"/>
+              <w:bottom w:val="single" w:color="CCCCCC" w:sz="1"/>
+              <w:right w:val="nil"/>
+            </w:tcBorders>
+            <w:shd w:fill="FFFFFF" w:val="clear"/>
+            <w:tcMar>
+              <w:top w:type="dxa" w:w="100"/>
+              <w:left w:type="dxa" w:w="160"/>
+              <w:bottom w:type="dxa" w:w="100"/>
+              <w:right w:type="dxa" w:w="160"/>
+            </w:tcMar>
+          </w:tcPr>
+          <w:p>
+            <w:r>
+              <w:rPr>
+                <w:rFonts w:ascii="Arial" w:cs="Arial" w:eastAsia="Arial" w:hAnsi="Arial"/>
+                <w:b w:val="false"/>
+                <w:bCs w:val="false"/>
+                <w:color w:val="222222"/>
+                <w:sz w:val="20"/>
+                <w:szCs w:val="20"/>
+              </w:rPr>
+              <w:t xml:space="preserve">Teal = above weekly average, amber = at average, gray = below</w:t>
+            </w:r>
+          </w:p>
+        </w:tc>
+      </w:tr>
+      <w:tr>
+        <w:tc>
+          <w:tcPr>
+            <w:tcBorders>
+              <w:top w:val="single" w:color="CCCCCC" w:sz="1"/>
+              <w:left w:val="nil"/>
+              <w:bottom w:val="single" w:color="CCCCCC" w:sz="1"/>
+              <w:right w:val="nil"/>
+            </w:tcBorders>
+            <w:shd w:fill="F8F8F8" w:val="clear"/>
+            <w:tcMar>
+              <w:top w:type="dxa" w:w="100"/>
+              <w:left w:type="dxa" w:w="160"/>
+              <w:bottom w:type="dxa" w:w="100"/>
+              <w:right w:type="dxa" w:w="160"/>
+            </w:tcMar>
+          </w:tcPr>
+          <w:p>
+            <w:r>
+              <w:rPr>
+                <w:rFonts w:ascii="Arial" w:cs="Arial" w:eastAsia="Arial" w:hAnsi="Arial"/>
+                <w:b w:val="false"/>
+                <w:bCs w:val="false"/>
+                <w:color w:val="222222"/>
+                <w:sz w:val="20"/>
+                <w:szCs w:val="20"/>
+              </w:rPr>
+              <w:t xml:space="preserve">Status tag logic</w:t>
+            </w:r>
+          </w:p>
+        </w:tc>
+        <w:tc>
+          <w:tcPr>
+            <w:tcBorders>
+              <w:top w:val="single" w:color="CCCCCC" w:sz="1"/>
+              <w:left w:val="nil"/>
+              <w:bottom w:val="single" w:color="CCCCCC" w:sz="1"/>
+              <w:right w:val="nil"/>
+            </w:tcBorders>
+            <w:shd w:fill="F8F8F8" w:val="clear"/>
+            <w:tcMar>
+              <w:top w:type="dxa" w:w="100"/>
+              <w:left w:type="dxa" w:w="160"/>
+              <w:bottom w:type="dxa" w:w="100"/>
+              <w:right w:type="dxa" w:w="160"/>
+            </w:tcMar>
+          </w:tcPr>
+          <w:p>
+            <w:r>
+              <w:rPr>
+                <w:rFonts w:ascii="Arial" w:cs="Arial" w:eastAsia="Arial" w:hAnsi="Arial"/>
+                <w:b w:val="false"/>
+                <w:bCs w:val="false"/>
+                <w:color w:val="222222"/>
+                <w:sz w:val="20"/>
+                <w:szCs w:val="20"/>
+              </w:rPr>
+              <w:t xml:space="preserve">Green if trending up over last 3 weeks, amber if flat, red if declining</w:t>
+            </w:r>
+          </w:p>
+        </w:tc>
+      </w:tr>
+    </w:tbl>
+    <w:p>
+      <w:pPr>
+        <w:spacing w:before="0" w:after="0"/>
+      </w:pPr>
+      <w:r>
+        <w:rPr>
+          <w:sz w:val="22"/>
+          <w:szCs w:val="22"/>
+        </w:rPr>
+        <w:t xml:space="preserve"/>
+      </w:r>
+    </w:p>
+    <w:p>
+      <w:pPr>
+        <w:spacing w:before="60" w:after="80"/>
+      </w:pPr>
+      <w:r>
+        <w:rPr>
+          <w:rFonts w:ascii="Arial" w:cs="Arial" w:eastAsia="Arial" w:hAnsi="Arial"/>
+          <w:color w:val="222222"/>
+          <w:sz w:val="22"/>
+          <w:szCs w:val="22"/>
+        </w:rPr>
+        <w:t xml:space="preserve">Drilldown chart: stacked bar chart. X-axis = weeks. Y-axis = hours. Three stacked layers per bar: teal (high focus blocks), amber (medium focus), gray (low focus). This shows not just how much you worked but the quality composition of each week.</w:t>
+      </w:r>
+    </w:p>
+    <w:p>
+      <w:pPr>
+        <w:spacing w:before="60" w:after="80"/>
+      </w:pPr>
+      <w:r>
+        <w:rPr>
+          <w:rFonts w:ascii="Arial" w:cs="Arial" w:eastAsia="Arial" w:hAnsi="Arial"/>
+          <w:color w:val="222222"/>
+          <w:sz w:val="22"/>
+          <w:szCs w:val="22"/>
+        </w:rPr>
+        <w:t xml:space="preserve">Drilldown stats row: raw hours / weighted hours / focus ratio % / delta vs last week.</w:t>
+      </w:r>
+    </w:p>
+    <w:p>
+      <w:pPr>
+        <w:spacing w:before="60" w:after="80"/>
+      </w:pPr>
+      <w:r>
+        <w:rPr>
+          <w:rFonts w:ascii="Arial" w:cs="Arial" w:eastAsia="Arial" w:hAnsi="Arial"/>
+          <w:color w:val="222222"/>
+          <w:sz w:val="22"/>
+          <w:szCs w:val="22"/>
+        </w:rPr>
+        <w:t xml:space="preserve">Drilldown insight: the gap between raw and weighted hours is labelled as the 'quality tax' — the time you logged but weren't fully present for.</w:t>
+      </w:r>
+    </w:p>
+    <w:p>
+      <w:pPr>
+        <w:spacing w:before="0" w:after="0"/>
+      </w:pPr>
+      <w:r>
+        <w:rPr>
+          <w:sz w:val="22"/>
+          <w:szCs w:val="22"/>
+        </w:rPr>
+        <w:t xml:space="preserve"/>
+      </w:r>
+    </w:p>
+    <w:p>
+      <w:pPr>
+        <w:spacing w:before="200" w:after="80"/>
+      </w:pPr>
+      <w:r>
+        <w:rPr>
+          <w:rFonts w:ascii="Arial" w:cs="Arial" w:eastAsia="Arial" w:hAnsi="Arial"/>
+          <w:b/>
+          <w:bCs/>
+          <w:color w:val="5F5E5A"/>
+          <w:sz w:val="22"/>
+          <w:szCs w:val="22"/>
+        </w:rPr>
+        <w:t xml:space="preserve">2. Completion rate</w:t>
+      </w:r>
+    </w:p>
+    <w:tbl>
+      <w:tblPr>
+        <w:tblW w:type="dxa" w:w="9360"/>
+        <w:tblBorders>
+          <w:top w:val="single" w:color="auto" w:sz="4"/>
+          <w:left w:val="single" w:color="auto" w:sz="4"/>
+          <w:bottom w:val="single" w:color="auto" w:sz="4"/>
+          <w:right w:val="single" w:color="auto" w:sz="4"/>
+          <w:insideH w:val="single" w:color="auto" w:sz="4"/>
+          <w:insideV w:val="single" w:color="auto" w:sz="4"/>
+        </w:tblBorders>
+      </w:tblPr>
+      <w:tblGrid>
+        <w:gridCol w:w="2800"/>
+        <w:gridCol w:w="6560"/>
+      </w:tblGrid>
+      <w:tr>
+        <w:tc>
+          <w:tcPr>
+            <w:tcBorders>
+              <w:top w:val="single" w:color="10513C" w:sz="4"/>
+              <w:left w:val="nil"/>
+              <w:bottom w:val="single" w:color="10513C" w:sz="4"/>
+              <w:right w:val="nil"/>
+            </w:tcBorders>
+            <w:shd w:fill="10513C" w:val="clear"/>
+            <w:tcMar>
+              <w:top w:type="dxa" w:w="100"/>
+              <w:left w:type="dxa" w:w="160"/>
+              <w:bottom w:type="dxa" w:w="100"/>
+              <w:right w:type="dxa" w:w="160"/>
+            </w:tcMar>
+          </w:tcPr>
+          <w:p>
+            <w:r>
+              <w:rPr>
+                <w:rFonts w:ascii="Arial" w:cs="Arial" w:eastAsia="Arial" w:hAnsi="Arial"/>
+                <w:b/>
+                <w:bCs/>
+                <w:color w:val="FFFFFF"/>
+                <w:sz w:val="20"/>
+                <w:szCs w:val="20"/>
+              </w:rPr>
+              <w:t xml:space="preserve">Property</w:t>
+            </w:r>
+          </w:p>
+        </w:tc>
+        <w:tc>
+          <w:tcPr>
+            <w:tcBorders>
+              <w:top w:val="single" w:color="10513C" w:sz="4"/>
+              <w:left w:val="nil"/>
+              <w:bottom w:val="single" w:color="10513C" w:sz="4"/>
+              <w:right w:val="nil"/>
+            </w:tcBorders>
+            <w:shd w:fill="10513C" w:val="clear"/>
+            <w:tcMar>
+              <w:top w:type="dxa" w:w="100"/>
+              <w:left w:type="dxa" w:w="160"/>
+              <w:bottom w:type="dxa" w:w="100"/>
+              <w:right w:type="dxa" w:w="160"/>
+            </w:tcMar>
+          </w:tcPr>
+          <w:p>
+            <w:r>
+              <w:rPr>
+                <w:rFonts w:ascii="Arial" w:cs="Arial" w:eastAsia="Arial" w:hAnsi="Arial"/>
+                <w:b/>
+                <w:bCs/>
+                <w:color w:val="FFFFFF"/>
+                <w:sz w:val="20"/>
+                <w:szCs w:val="20"/>
+              </w:rPr>
+              <w:t xml:space="preserve">Specification</w:t>
+            </w:r>
+          </w:p>
+        </w:tc>
+      </w:tr>
+      <w:tr>
+        <w:tc>
+          <w:tcPr>
+            <w:tcBorders>
+              <w:top w:val="single" w:color="CCCCCC" w:sz="1"/>
+              <w:left w:val="nil"/>
+              <w:bottom w:val="single" w:color="CCCCCC" w:sz="1"/>
+              <w:right w:val="nil"/>
+            </w:tcBorders>
+            <w:shd w:fill="FFFFFF" w:val="clear"/>
+            <w:tcMar>
+              <w:top w:type="dxa" w:w="100"/>
+              <w:left w:type="dxa" w:w="160"/>
+              <w:bottom w:type="dxa" w:w="100"/>
+              <w:right w:type="dxa" w:w="160"/>
+            </w:tcMar>
+          </w:tcPr>
+          <w:p>
+            <w:r>
+              <w:rPr>
+                <w:rFonts w:ascii="Arial" w:cs="Arial" w:eastAsia="Arial" w:hAnsi="Arial"/>
+                <w:b w:val="false"/>
+                <w:bCs w:val="false"/>
+                <w:color w:val="222222"/>
+                <w:sz w:val="20"/>
+                <w:szCs w:val="20"/>
+              </w:rPr>
+              <w:t xml:space="preserve">Headline value</w:t>
+            </w:r>
+          </w:p>
+        </w:tc>
+        <w:tc>
+          <w:tcPr>
+            <w:tcBorders>
+              <w:top w:val="single" w:color="CCCCCC" w:sz="1"/>
+              <w:left w:val="nil"/>
+              <w:bottom w:val="single" w:color="CCCCCC" w:sz="1"/>
+              <w:right w:val="nil"/>
+            </w:tcBorders>
+            <w:shd w:fill="FFFFFF" w:val="clear"/>
+            <w:tcMar>
+              <w:top w:type="dxa" w:w="100"/>
+              <w:left w:type="dxa" w:w="160"/>
+              <w:bottom w:type="dxa" w:w="100"/>
+              <w:right w:type="dxa" w:w="160"/>
+            </w:tcMar>
+          </w:tcPr>
+          <w:p>
+            <w:r>
+              <w:rPr>
+                <w:rFonts w:ascii="Arial" w:cs="Arial" w:eastAsia="Arial" w:hAnsi="Arial"/>
+                <w:b w:val="false"/>
+                <w:bCs w:val="false"/>
+                <w:color w:val="222222"/>
+                <w:sz w:val="20"/>
+                <w:szCs w:val="20"/>
+              </w:rPr>
+              <w:t xml:space="preserve">Overall completion % this period (e.g. '68%')</w:t>
+            </w:r>
+          </w:p>
+        </w:tc>
+      </w:tr>
+      <w:tr>
+        <w:tc>
+          <w:tcPr>
+            <w:tcBorders>
+              <w:top w:val="single" w:color="CCCCCC" w:sz="1"/>
+              <w:left w:val="nil"/>
+              <w:bottom w:val="single" w:color="CCCCCC" w:sz="1"/>
+              <w:right w:val="nil"/>
+            </w:tcBorders>
+            <w:shd w:fill="F8F8F8" w:val="clear"/>
+            <w:tcMar>
+              <w:top w:type="dxa" w:w="100"/>
+              <w:left w:type="dxa" w:w="160"/>
+              <w:bottom w:type="dxa" w:w="100"/>
+              <w:right w:type="dxa" w:w="160"/>
+            </w:tcMar>
+          </w:tcPr>
+          <w:p>
+            <w:r>
+              <w:rPr>
+                <w:rFonts w:ascii="Arial" w:cs="Arial" w:eastAsia="Arial" w:hAnsi="Arial"/>
+                <w:b w:val="false"/>
+                <w:bCs w:val="false"/>
+                <w:color w:val="222222"/>
+                <w:sz w:val="20"/>
+                <w:szCs w:val="20"/>
+              </w:rPr>
+              <w:t xml:space="preserve">Subtitle</w:t>
+            </w:r>
+          </w:p>
+        </w:tc>
+        <w:tc>
+          <w:tcPr>
+            <w:tcBorders>
+              <w:top w:val="single" w:color="CCCCCC" w:sz="1"/>
+              <w:left w:val="nil"/>
+              <w:bottom w:val="single" w:color="CCCCCC" w:sz="1"/>
+              <w:right w:val="nil"/>
+            </w:tcBorders>
+            <w:shd w:fill="F8F8F8" w:val="clear"/>
+            <w:tcMar>
+              <w:top w:type="dxa" w:w="100"/>
+              <w:left w:type="dxa" w:w="160"/>
+              <w:bottom w:type="dxa" w:w="100"/>
+              <w:right w:type="dxa" w:w="160"/>
+            </w:tcMar>
+          </w:tcPr>
+          <w:p>
+            <w:r>
+              <w:rPr>
+                <w:rFonts w:ascii="Arial" w:cs="Arial" w:eastAsia="Arial" w:hAnsi="Arial"/>
+                <w:b w:val="false"/>
+                <w:bCs w:val="false"/>
+                <w:color w:val="222222"/>
+                <w:sz w:val="20"/>
+                <w:szCs w:val="20"/>
+              </w:rPr>
+              <w:t xml:space="preserve">done + partial blocks / total blocks</w:t>
+            </w:r>
+          </w:p>
+        </w:tc>
+      </w:tr>
+      <w:tr>
+        <w:tc>
+          <w:tcPr>
+            <w:tcBorders>
+              <w:top w:val="single" w:color="CCCCCC" w:sz="1"/>
+              <w:left w:val="nil"/>
+              <w:bottom w:val="single" w:color="CCCCCC" w:sz="1"/>
+              <w:right w:val="nil"/>
+            </w:tcBorders>
+            <w:shd w:fill="FFFFFF" w:val="clear"/>
+            <w:tcMar>
+              <w:top w:type="dxa" w:w="100"/>
+              <w:left w:type="dxa" w:w="160"/>
+              <w:bottom w:type="dxa" w:w="100"/>
+              <w:right w:type="dxa" w:w="160"/>
+            </w:tcMar>
+          </w:tcPr>
+          <w:p>
+            <w:r>
+              <w:rPr>
+                <w:rFonts w:ascii="Arial" w:cs="Arial" w:eastAsia="Arial" w:hAnsi="Arial"/>
+                <w:b w:val="false"/>
+                <w:bCs w:val="false"/>
+                <w:color w:val="222222"/>
+                <w:sz w:val="20"/>
+                <w:szCs w:val="20"/>
+              </w:rPr>
+              <w:t xml:space="preserve">Preview chart type</w:t>
+            </w:r>
+          </w:p>
+        </w:tc>
+        <w:tc>
+          <w:tcPr>
+            <w:tcBorders>
+              <w:top w:val="single" w:color="CCCCCC" w:sz="1"/>
+              <w:left w:val="nil"/>
+              <w:bottom w:val="single" w:color="CCCCCC" w:sz="1"/>
+              <w:right w:val="nil"/>
+            </w:tcBorders>
+            <w:shd w:fill="FFFFFF" w:val="clear"/>
+            <w:tcMar>
+              <w:top w:type="dxa" w:w="100"/>
+              <w:left w:type="dxa" w:w="160"/>
+              <w:bottom w:type="dxa" w:w="100"/>
+              <w:right w:type="dxa" w:w="160"/>
+            </w:tcMar>
+          </w:tcPr>
+          <w:p>
+            <w:r>
+              <w:rPr>
+                <w:rFonts w:ascii="Arial" w:cs="Arial" w:eastAsia="Arial" w:hAnsi="Arial"/>
+                <w:b w:val="false"/>
+                <w:bCs w:val="false"/>
+                <w:color w:val="222222"/>
+                <w:sz w:val="20"/>
+                <w:szCs w:val="20"/>
+              </w:rPr>
+              <w:t xml:space="preserve">Mini bar chart — one bar per week, coloured by rate</w:t>
+            </w:r>
+          </w:p>
+        </w:tc>
+      </w:tr>
+      <w:tr>
+        <w:tc>
+          <w:tcPr>
+            <w:tcBorders>
+              <w:top w:val="single" w:color="CCCCCC" w:sz="1"/>
+              <w:left w:val="nil"/>
+              <w:bottom w:val="single" w:color="CCCCCC" w:sz="1"/>
+              <w:right w:val="nil"/>
+            </w:tcBorders>
+            <w:shd w:fill="F8F8F8" w:val="clear"/>
+            <w:tcMar>
+              <w:top w:type="dxa" w:w="100"/>
+              <w:left w:type="dxa" w:w="160"/>
+              <w:bottom w:type="dxa" w:w="100"/>
+              <w:right w:type="dxa" w:w="160"/>
+            </w:tcMar>
+          </w:tcPr>
+          <w:p>
+            <w:r>
+              <w:rPr>
+                <w:rFonts w:ascii="Arial" w:cs="Arial" w:eastAsia="Arial" w:hAnsi="Arial"/>
+                <w:b w:val="false"/>
+                <w:bCs w:val="false"/>
+                <w:color w:val="222222"/>
+                <w:sz w:val="20"/>
+                <w:szCs w:val="20"/>
+              </w:rPr>
+              <w:t xml:space="preserve">Bar data</w:t>
+            </w:r>
+          </w:p>
+        </w:tc>
+        <w:tc>
+          <w:tcPr>
+            <w:tcBorders>
+              <w:top w:val="single" w:color="CCCCCC" w:sz="1"/>
+              <w:left w:val="nil"/>
+              <w:bottom w:val="single" w:color="CCCCCC" w:sz="1"/>
+              <w:right w:val="nil"/>
+            </w:tcBorders>
+            <w:shd w:fill="F8F8F8" w:val="clear"/>
+            <w:tcMar>
+              <w:top w:type="dxa" w:w="100"/>
+              <w:left w:type="dxa" w:w="160"/>
+              <w:bottom w:type="dxa" w:w="100"/>
+              <w:right w:type="dxa" w:w="160"/>
+            </w:tcMar>
+          </w:tcPr>
+          <w:p>
+            <w:r>
+              <w:rPr>
+                <w:rFonts w:ascii="Arial" w:cs="Arial" w:eastAsia="Arial" w:hAnsi="Arial"/>
+                <w:b w:val="false"/>
+                <w:bCs w:val="false"/>
+                <w:color w:val="222222"/>
+                <w:sz w:val="20"/>
+                <w:szCs w:val="20"/>
+              </w:rPr>
+              <w:t xml:space="preserve">Each bar = completion rate for that week</w:t>
+            </w:r>
+          </w:p>
+        </w:tc>
+      </w:tr>
+      <w:tr>
+        <w:tc>
+          <w:tcPr>
+            <w:tcBorders>
+              <w:top w:val="single" w:color="CCCCCC" w:sz="1"/>
+              <w:left w:val="nil"/>
+              <w:bottom w:val="single" w:color="CCCCCC" w:sz="1"/>
+              <w:right w:val="nil"/>
+            </w:tcBorders>
+            <w:shd w:fill="FFFFFF" w:val="clear"/>
+            <w:tcMar>
+              <w:top w:type="dxa" w:w="100"/>
+              <w:left w:type="dxa" w:w="160"/>
+              <w:bottom w:type="dxa" w:w="100"/>
+              <w:right w:type="dxa" w:w="160"/>
+            </w:tcMar>
+          </w:tcPr>
+          <w:p>
+            <w:r>
+              <w:rPr>
+                <w:rFonts w:ascii="Arial" w:cs="Arial" w:eastAsia="Arial" w:hAnsi="Arial"/>
+                <w:b w:val="false"/>
+                <w:bCs w:val="false"/>
+                <w:color w:val="222222"/>
+                <w:sz w:val="20"/>
+                <w:szCs w:val="20"/>
+              </w:rPr>
+              <w:t xml:space="preserve">Bar colours</w:t>
+            </w:r>
+          </w:p>
+        </w:tc>
+        <w:tc>
+          <w:tcPr>
+            <w:tcBorders>
+              <w:top w:val="single" w:color="CCCCCC" w:sz="1"/>
+              <w:left w:val="nil"/>
+              <w:bottom w:val="single" w:color="CCCCCC" w:sz="1"/>
+              <w:right w:val="nil"/>
+            </w:tcBorders>
+            <w:shd w:fill="FFFFFF" w:val="clear"/>
+            <w:tcMar>
+              <w:top w:type="dxa" w:w="100"/>
+              <w:left w:type="dxa" w:w="160"/>
+              <w:bottom w:type="dxa" w:w="100"/>
+              <w:right w:type="dxa" w:w="160"/>
+            </w:tcMar>
+          </w:tcPr>
+          <w:p>
+            <w:r>
+              <w:rPr>
+                <w:rFonts w:ascii="Arial" w:cs="Arial" w:eastAsia="Arial" w:hAnsi="Arial"/>
+                <w:b w:val="false"/>
+                <w:bCs w:val="false"/>
+                <w:color w:val="222222"/>
+                <w:sz w:val="20"/>
+                <w:szCs w:val="20"/>
+              </w:rPr>
+              <w:t xml:space="preserve">Teal ≥ 75%, amber 50–74%, red &lt; 50%</w:t>
+            </w:r>
+          </w:p>
+        </w:tc>
+      </w:tr>
+      <w:tr>
+        <w:tc>
+          <w:tcPr>
+            <w:tcBorders>
+              <w:top w:val="single" w:color="CCCCCC" w:sz="1"/>
+              <w:left w:val="nil"/>
+              <w:bottom w:val="single" w:color="CCCCCC" w:sz="1"/>
+              <w:right w:val="nil"/>
+            </w:tcBorders>
+            <w:shd w:fill="F8F8F8" w:val="clear"/>
+            <w:tcMar>
+              <w:top w:type="dxa" w:w="100"/>
+              <w:left w:type="dxa" w:w="160"/>
+              <w:bottom w:type="dxa" w:w="100"/>
+              <w:right w:type="dxa" w:w="160"/>
+            </w:tcMar>
+          </w:tcPr>
+          <w:p>
+            <w:r>
+              <w:rPr>
+                <w:rFonts w:ascii="Arial" w:cs="Arial" w:eastAsia="Arial" w:hAnsi="Arial"/>
+                <w:b w:val="false"/>
+                <w:bCs w:val="false"/>
+                <w:color w:val="222222"/>
+                <w:sz w:val="20"/>
+                <w:szCs w:val="20"/>
+              </w:rPr>
+              <w:t xml:space="preserve">Status tag logic</w:t>
+            </w:r>
+          </w:p>
+        </w:tc>
+        <w:tc>
+          <w:tcPr>
+            <w:tcBorders>
+              <w:top w:val="single" w:color="CCCCCC" w:sz="1"/>
+              <w:left w:val="nil"/>
+              <w:bottom w:val="single" w:color="CCCCCC" w:sz="1"/>
+              <w:right w:val="nil"/>
+            </w:tcBorders>
+            <w:shd w:fill="F8F8F8" w:val="clear"/>
+            <w:tcMar>
+              <w:top w:type="dxa" w:w="100"/>
+              <w:left w:type="dxa" w:w="160"/>
+              <w:bottom w:type="dxa" w:w="100"/>
+              <w:right w:type="dxa" w:w="160"/>
+            </w:tcMar>
+          </w:tcPr>
+          <w:p>
+            <w:r>
+              <w:rPr>
+                <w:rFonts w:ascii="Arial" w:cs="Arial" w:eastAsia="Arial" w:hAnsi="Arial"/>
+                <w:b w:val="false"/>
+                <w:bCs w:val="false"/>
+                <w:color w:val="222222"/>
+                <w:sz w:val="20"/>
+                <w:szCs w:val="20"/>
+              </w:rPr>
+              <w:t xml:space="preserve">Green ≥ 75%, amber 50–74%, red &lt; 50%</w:t>
+            </w:r>
+          </w:p>
+        </w:tc>
+      </w:tr>
+    </w:tbl>
+    <w:p>
+      <w:pPr>
+        <w:spacing w:before="0" w:after="0"/>
+      </w:pPr>
+      <w:r>
+        <w:rPr>
+          <w:sz w:val="22"/>
+          <w:szCs w:val="22"/>
+        </w:rPr>
+        <w:t xml:space="preserve"/>
+      </w:r>
+    </w:p>
+    <w:p>
+      <w:pPr>
+        <w:spacing w:before="60" w:after="80"/>
+      </w:pPr>
+      <w:r>
+        <w:rPr>
+          <w:rFonts w:ascii="Arial" w:cs="Arial" w:eastAsia="Arial" w:hAnsi="Arial"/>
+          <w:color w:val="222222"/>
+          <w:sz w:val="22"/>
+          <w:szCs w:val="22"/>
+        </w:rPr>
+        <w:t xml:space="preserve">Drilldown chart: horizontal stacked bar chart. One row per category. Each bar split into three segments: done (teal), partial (amber), abandoned (red). This makes it immediately visible which categories have calibration problems.</w:t>
+      </w:r>
+    </w:p>
+    <w:p>
+      <w:pPr>
+        <w:spacing w:before="60" w:after="80"/>
+      </w:pPr>
+      <w:r>
+        <w:rPr>
+          <w:rFonts w:ascii="Arial" w:cs="Arial" w:eastAsia="Arial" w:hAnsi="Arial"/>
+          <w:color w:val="222222"/>
+          <w:sz w:val="22"/>
+          <w:szCs w:val="22"/>
+        </w:rPr>
+        <w:t xml:space="preserve">Drilldown insight: the category with the lowest completion rate gets a specific note: 'Your intents for [category] are likely over-scoped. Try declaring smaller units of work.'</w:t>
+      </w:r>
+    </w:p>
+    <w:p>
+      <w:pPr>
+        <w:spacing w:before="0" w:after="0"/>
+      </w:pPr>
+      <w:r>
+        <w:rPr>
+          <w:sz w:val="22"/>
+          <w:szCs w:val="22"/>
+        </w:rPr>
+        <w:t xml:space="preserve"/>
+      </w:r>
+    </w:p>
+    <w:p>
+      <w:pPr>
+        <w:spacing w:before="200" w:after="80"/>
+      </w:pPr>
+      <w:r>
+        <w:rPr>
+          <w:rFonts w:ascii="Arial" w:cs="Arial" w:eastAsia="Arial" w:hAnsi="Arial"/>
+          <w:b/>
+          <w:bCs/>
+          <w:color w:val="5F5E5A"/>
+          <w:sz w:val="22"/>
+          <w:szCs w:val="22"/>
+        </w:rPr>
+        <w:t xml:space="preserve">3. Habit consistency</w:t>
+      </w:r>
+    </w:p>
+    <w:tbl>
+      <w:tblPr>
+        <w:tblW w:type="dxa" w:w="9360"/>
+        <w:tblBorders>
+          <w:top w:val="single" w:color="auto" w:sz="4"/>
+          <w:left w:val="single" w:color="auto" w:sz="4"/>
+          <w:bottom w:val="single" w:color="auto" w:sz="4"/>
+          <w:right w:val="single" w:color="auto" w:sz="4"/>
+          <w:insideH w:val="single" w:color="auto" w:sz="4"/>
+          <w:insideV w:val="single" w:color="auto" w:sz="4"/>
+        </w:tblBorders>
+      </w:tblPr>
+      <w:tblGrid>
+        <w:gridCol w:w="2800"/>
+        <w:gridCol w:w="6560"/>
+      </w:tblGrid>
+      <w:tr>
+        <w:tc>
+          <w:tcPr>
+            <w:tcBorders>
+              <w:top w:val="single" w:color="10513C" w:sz="4"/>
+              <w:left w:val="nil"/>
+              <w:bottom w:val="single" w:color="10513C" w:sz="4"/>
+              <w:right w:val="nil"/>
+            </w:tcBorders>
+            <w:shd w:fill="10513C" w:val="clear"/>
+            <w:tcMar>
+              <w:top w:type="dxa" w:w="100"/>
+              <w:left w:type="dxa" w:w="160"/>
+              <w:bottom w:type="dxa" w:w="100"/>
+              <w:right w:type="dxa" w:w="160"/>
+            </w:tcMar>
+          </w:tcPr>
+          <w:p>
+            <w:r>
+              <w:rPr>
+                <w:rFonts w:ascii="Arial" w:cs="Arial" w:eastAsia="Arial" w:hAnsi="Arial"/>
+                <w:b/>
+                <w:bCs/>
+                <w:color w:val="FFFFFF"/>
+                <w:sz w:val="20"/>
+                <w:szCs w:val="20"/>
+              </w:rPr>
+              <w:t xml:space="preserve">Property</w:t>
+            </w:r>
+          </w:p>
+        </w:tc>
+        <w:tc>
+          <w:tcPr>
+            <w:tcBorders>
+              <w:top w:val="single" w:color="10513C" w:sz="4"/>
+              <w:left w:val="nil"/>
+              <w:bottom w:val="single" w:color="10513C" w:sz="4"/>
+              <w:right w:val="nil"/>
+            </w:tcBorders>
+            <w:shd w:fill="10513C" w:val="clear"/>
+            <w:tcMar>
+              <w:top w:type="dxa" w:w="100"/>
+              <w:left w:type="dxa" w:w="160"/>
+              <w:bottom w:type="dxa" w:w="100"/>
+              <w:right w:type="dxa" w:w="160"/>
+            </w:tcMar>
+          </w:tcPr>
+          <w:p>
+            <w:r>
+              <w:rPr>
+                <w:rFonts w:ascii="Arial" w:cs="Arial" w:eastAsia="Arial" w:hAnsi="Arial"/>
+                <w:b/>
+                <w:bCs/>
+                <w:color w:val="FFFFFF"/>
+                <w:sz w:val="20"/>
+                <w:szCs w:val="20"/>
+              </w:rPr>
+              <w:t xml:space="preserve">Specification</w:t>
+            </w:r>
+          </w:p>
+        </w:tc>
+      </w:tr>
+      <w:tr>
+        <w:tc>
+          <w:tcPr>
+            <w:tcBorders>
+              <w:top w:val="single" w:color="CCCCCC" w:sz="1"/>
+              <w:left w:val="nil"/>
+              <w:bottom w:val="single" w:color="CCCCCC" w:sz="1"/>
+              <w:right w:val="nil"/>
+            </w:tcBorders>
+            <w:shd w:fill="FFFFFF" w:val="clear"/>
+            <w:tcMar>
+              <w:top w:type="dxa" w:w="100"/>
+              <w:left w:type="dxa" w:w="160"/>
+              <w:bottom w:type="dxa" w:w="100"/>
+              <w:right w:type="dxa" w:w="160"/>
+            </w:tcMar>
+          </w:tcPr>
+          <w:p>
+            <w:r>
+              <w:rPr>
+                <w:rFonts w:ascii="Arial" w:cs="Arial" w:eastAsia="Arial" w:hAnsi="Arial"/>
+                <w:b w:val="false"/>
+                <w:bCs w:val="false"/>
+                <w:color w:val="222222"/>
+                <w:sz w:val="20"/>
+                <w:szCs w:val="20"/>
+              </w:rPr>
+              <w:t xml:space="preserve">Headline value</w:t>
+            </w:r>
+          </w:p>
+        </w:tc>
+        <w:tc>
+          <w:tcPr>
+            <w:tcBorders>
+              <w:top w:val="single" w:color="CCCCCC" w:sz="1"/>
+              <w:left w:val="nil"/>
+              <w:bottom w:val="single" w:color="CCCCCC" w:sz="1"/>
+              <w:right w:val="nil"/>
+            </w:tcBorders>
+            <w:shd w:fill="FFFFFF" w:val="clear"/>
+            <w:tcMar>
+              <w:top w:type="dxa" w:w="100"/>
+              <w:left w:type="dxa" w:w="160"/>
+              <w:bottom w:type="dxa" w:w="100"/>
+              <w:right w:type="dxa" w:w="160"/>
+            </w:tcMar>
+          </w:tcPr>
+          <w:p>
+            <w:r>
+              <w:rPr>
+                <w:rFonts w:ascii="Arial" w:cs="Arial" w:eastAsia="Arial" w:hAnsi="Arial"/>
+                <w:b w:val="false"/>
+                <w:bCs w:val="false"/>
+                <w:color w:val="222222"/>
+                <w:sz w:val="20"/>
+                <w:szCs w:val="20"/>
+              </w:rPr>
+              <w:t xml:space="preserve">Average consistency % across all habits</w:t>
+            </w:r>
+          </w:p>
+        </w:tc>
+      </w:tr>
+      <w:tr>
+        <w:tc>
+          <w:tcPr>
+            <w:tcBorders>
+              <w:top w:val="single" w:color="CCCCCC" w:sz="1"/>
+              <w:left w:val="nil"/>
+              <w:bottom w:val="single" w:color="CCCCCC" w:sz="1"/>
+              <w:right w:val="nil"/>
+            </w:tcBorders>
+            <w:shd w:fill="F8F8F8" w:val="clear"/>
+            <w:tcMar>
+              <w:top w:type="dxa" w:w="100"/>
+              <w:left w:type="dxa" w:w="160"/>
+              <w:bottom w:type="dxa" w:w="100"/>
+              <w:right w:type="dxa" w:w="160"/>
+            </w:tcMar>
+          </w:tcPr>
+          <w:p>
+            <w:r>
+              <w:rPr>
+                <w:rFonts w:ascii="Arial" w:cs="Arial" w:eastAsia="Arial" w:hAnsi="Arial"/>
+                <w:b w:val="false"/>
+                <w:bCs w:val="false"/>
+                <w:color w:val="222222"/>
+                <w:sz w:val="20"/>
+                <w:szCs w:val="20"/>
+              </w:rPr>
+              <w:t xml:space="preserve">Subtitle</w:t>
+            </w:r>
+          </w:p>
+        </w:tc>
+        <w:tc>
+          <w:tcPr>
+            <w:tcBorders>
+              <w:top w:val="single" w:color="CCCCCC" w:sz="1"/>
+              <w:left w:val="nil"/>
+              <w:bottom w:val="single" w:color="CCCCCC" w:sz="1"/>
+              <w:right w:val="nil"/>
+            </w:tcBorders>
+            <w:shd w:fill="F8F8F8" w:val="clear"/>
+            <w:tcMar>
+              <w:top w:type="dxa" w:w="100"/>
+              <w:left w:type="dxa" w:w="160"/>
+              <w:bottom w:type="dxa" w:w="100"/>
+              <w:right w:type="dxa" w:w="160"/>
+            </w:tcMar>
+          </w:tcPr>
+          <w:p>
+            <w:r>
+              <w:rPr>
+                <w:rFonts w:ascii="Arial" w:cs="Arial" w:eastAsia="Arial" w:hAnsi="Arial"/>
+                <w:b w:val="false"/>
+                <w:bCs w:val="false"/>
+                <w:color w:val="222222"/>
+                <w:sz w:val="20"/>
+                <w:szCs w:val="20"/>
+              </w:rPr>
+              <w:t xml:space="preserve">Avg across all habits · last N weeks</w:t>
+            </w:r>
+          </w:p>
+        </w:tc>
+      </w:tr>
+      <w:tr>
+        <w:tc>
+          <w:tcPr>
+            <w:tcBorders>
+              <w:top w:val="single" w:color="CCCCCC" w:sz="1"/>
+              <w:left w:val="nil"/>
+              <w:bottom w:val="single" w:color="CCCCCC" w:sz="1"/>
+              <w:right w:val="nil"/>
+            </w:tcBorders>
+            <w:shd w:fill="FFFFFF" w:val="clear"/>
+            <w:tcMar>
+              <w:top w:type="dxa" w:w="100"/>
+              <w:left w:type="dxa" w:w="160"/>
+              <w:bottom w:type="dxa" w:w="100"/>
+              <w:right w:type="dxa" w:w="160"/>
+            </w:tcMar>
+          </w:tcPr>
+          <w:p>
+            <w:r>
+              <w:rPr>
+                <w:rFonts w:ascii="Arial" w:cs="Arial" w:eastAsia="Arial" w:hAnsi="Arial"/>
+                <w:b w:val="false"/>
+                <w:bCs w:val="false"/>
+                <w:color w:val="222222"/>
+                <w:sz w:val="20"/>
+                <w:szCs w:val="20"/>
+              </w:rPr>
+              <w:t xml:space="preserve">Preview chart type</w:t>
+            </w:r>
+          </w:p>
+        </w:tc>
+        <w:tc>
+          <w:tcPr>
+            <w:tcBorders>
+              <w:top w:val="single" w:color="CCCCCC" w:sz="1"/>
+              <w:left w:val="nil"/>
+              <w:bottom w:val="single" w:color="CCCCCC" w:sz="1"/>
+              <w:right w:val="nil"/>
+            </w:tcBorders>
+            <w:shd w:fill="FFFFFF" w:val="clear"/>
+            <w:tcMar>
+              <w:top w:type="dxa" w:w="100"/>
+              <w:left w:type="dxa" w:w="160"/>
+              <w:bottom w:type="dxa" w:w="100"/>
+              <w:right w:type="dxa" w:w="160"/>
+            </w:tcMar>
+          </w:tcPr>
+          <w:p>
+            <w:r>
+              <w:rPr>
+                <w:rFonts w:ascii="Arial" w:cs="Arial" w:eastAsia="Arial" w:hAnsi="Arial"/>
+                <w:b w:val="false"/>
+                <w:bCs w:val="false"/>
+                <w:color w:val="222222"/>
+                <w:sz w:val="20"/>
+                <w:szCs w:val="20"/>
+              </w:rPr>
+              <w:t xml:space="preserve">Dot heatmap — 28 dots (4 weeks × 7 days), no labels</w:t>
+            </w:r>
+          </w:p>
+        </w:tc>
+      </w:tr>
+      <w:tr>
+        <w:tc>
+          <w:tcPr>
+            <w:tcBorders>
+              <w:top w:val="single" w:color="CCCCCC" w:sz="1"/>
+              <w:left w:val="nil"/>
+              <w:bottom w:val="single" w:color="CCCCCC" w:sz="1"/>
+              <w:right w:val="nil"/>
+            </w:tcBorders>
+            <w:shd w:fill="F8F8F8" w:val="clear"/>
+            <w:tcMar>
+              <w:top w:type="dxa" w:w="100"/>
+              <w:left w:type="dxa" w:w="160"/>
+              <w:bottom w:type="dxa" w:w="100"/>
+              <w:right w:type="dxa" w:w="160"/>
+            </w:tcMar>
+          </w:tcPr>
+          <w:p>
+            <w:r>
+              <w:rPr>
+                <w:rFonts w:ascii="Arial" w:cs="Arial" w:eastAsia="Arial" w:hAnsi="Arial"/>
+                <w:b w:val="false"/>
+                <w:bCs w:val="false"/>
+                <w:color w:val="222222"/>
+                <w:sz w:val="20"/>
+                <w:szCs w:val="20"/>
+              </w:rPr>
+              <w:t xml:space="preserve">Dot colours</w:t>
+            </w:r>
+          </w:p>
+        </w:tc>
+        <w:tc>
+          <w:tcPr>
+            <w:tcBorders>
+              <w:top w:val="single" w:color="CCCCCC" w:sz="1"/>
+              <w:left w:val="nil"/>
+              <w:bottom w:val="single" w:color="CCCCCC" w:sz="1"/>
+              <w:right w:val="nil"/>
+            </w:tcBorders>
+            <w:shd w:fill="F8F8F8" w:val="clear"/>
+            <w:tcMar>
+              <w:top w:type="dxa" w:w="100"/>
+              <w:left w:type="dxa" w:w="160"/>
+              <w:bottom w:type="dxa" w:w="100"/>
+              <w:right w:type="dxa" w:w="160"/>
+            </w:tcMar>
+          </w:tcPr>
+          <w:p>
+            <w:r>
+              <w:rPr>
+                <w:rFonts w:ascii="Arial" w:cs="Arial" w:eastAsia="Arial" w:hAnsi="Arial"/>
+                <w:b w:val="false"/>
+                <w:bCs w:val="false"/>
+                <w:color w:val="222222"/>
+                <w:sz w:val="20"/>
+                <w:szCs w:val="20"/>
+              </w:rPr>
+              <w:t xml:space="preserve">Teal = done, amber = full rest day, gray = missed</w:t>
+            </w:r>
+          </w:p>
+        </w:tc>
+      </w:tr>
+      <w:tr>
+        <w:tc>
+          <w:tcPr>
+            <w:tcBorders>
+              <w:top w:val="single" w:color="CCCCCC" w:sz="1"/>
+              <w:left w:val="nil"/>
+              <w:bottom w:val="single" w:color="CCCCCC" w:sz="1"/>
+              <w:right w:val="nil"/>
+            </w:tcBorders>
+            <w:shd w:fill="FFFFFF" w:val="clear"/>
+            <w:tcMar>
+              <w:top w:type="dxa" w:w="100"/>
+              <w:left w:type="dxa" w:w="160"/>
+              <w:bottom w:type="dxa" w:w="100"/>
+              <w:right w:type="dxa" w:w="160"/>
+            </w:tcMar>
+          </w:tcPr>
+          <w:p>
+            <w:r>
+              <w:rPr>
+                <w:rFonts w:ascii="Arial" w:cs="Arial" w:eastAsia="Arial" w:hAnsi="Arial"/>
+                <w:b w:val="false"/>
+                <w:bCs w:val="false"/>
+                <w:color w:val="222222"/>
+                <w:sz w:val="20"/>
+                <w:szCs w:val="20"/>
+              </w:rPr>
+              <w:t xml:space="preserve">Status tag logic</w:t>
+            </w:r>
+          </w:p>
+        </w:tc>
+        <w:tc>
+          <w:tcPr>
+            <w:tcBorders>
+              <w:top w:val="single" w:color="CCCCCC" w:sz="1"/>
+              <w:left w:val="nil"/>
+              <w:bottom w:val="single" w:color="CCCCCC" w:sz="1"/>
+              <w:right w:val="nil"/>
+            </w:tcBorders>
+            <w:shd w:fill="FFFFFF" w:val="clear"/>
+            <w:tcMar>
+              <w:top w:type="dxa" w:w="100"/>
+              <w:left w:type="dxa" w:w="160"/>
+              <w:bottom w:type="dxa" w:w="100"/>
+              <w:right w:type="dxa" w:w="160"/>
+            </w:tcMar>
+          </w:tcPr>
+          <w:p>
+            <w:r>
+              <w:rPr>
+                <w:rFonts w:ascii="Arial" w:cs="Arial" w:eastAsia="Arial" w:hAnsi="Arial"/>
+                <w:b w:val="false"/>
+                <w:bCs w:val="false"/>
+                <w:color w:val="222222"/>
+                <w:sz w:val="20"/>
+                <w:szCs w:val="20"/>
+              </w:rPr>
+              <w:t xml:space="preserve">Green if all habits ≥ target, amber if 1–2 below, red if 3+ below</w:t>
+            </w:r>
+          </w:p>
+        </w:tc>
+      </w:tr>
+    </w:tbl>
+    <w:p>
+      <w:pPr>
+        <w:spacing w:before="0" w:after="0"/>
+      </w:pPr>
+      <w:r>
+        <w:rPr>
+          <w:sz w:val="22"/>
+          <w:szCs w:val="22"/>
+        </w:rPr>
+        <w:t xml:space="preserve"/>
+      </w:r>
+    </w:p>
+    <w:p>
+      <w:pPr>
+        <w:spacing w:before="60" w:after="80"/>
+      </w:pPr>
+      <w:r>
+        <w:rPr>
+          <w:rFonts w:ascii="Arial" w:cs="Arial" w:eastAsia="Arial" w:hAnsi="Arial"/>
+          <w:color w:val="222222"/>
+          <w:sz w:val="22"/>
+          <w:szCs w:val="22"/>
+        </w:rPr>
+        <w:t xml:space="preserve">Drilldown: one dot heatmap per habit, each labelled with the habit name, consistency %, and weekly target. Below the heatmaps: plain-language observation about which day of the week sees the most misses (computed from the data).</w:t>
+      </w:r>
+    </w:p>
+    <w:p>
+      <w:pPr>
+        <w:spacing w:before="0" w:after="0"/>
+      </w:pPr>
+      <w:r>
+        <w:rPr>
+          <w:sz w:val="22"/>
+          <w:szCs w:val="22"/>
+        </w:rPr>
+        <w:t xml:space="preserve"/>
+      </w:r>
+    </w:p>
+    <w:p>
+      <w:pPr>
+        <w:spacing w:before="200" w:after="80"/>
+      </w:pPr>
+      <w:r>
+        <w:rPr>
+          <w:rFonts w:ascii="Arial" w:cs="Arial" w:eastAsia="Arial" w:hAnsi="Arial"/>
+          <w:b/>
+          <w:bCs/>
+          <w:color w:val="5F5E5A"/>
+          <w:sz w:val="22"/>
+          <w:szCs w:val="22"/>
+        </w:rPr>
+        <w:t xml:space="preserve">4. Tool effectiveness  (new)</w:t>
+      </w:r>
+    </w:p>
+    <w:tbl>
+      <w:tblPr>
+        <w:tblW w:type="dxa" w:w="9360"/>
+        <w:tblBorders>
+          <w:top w:val="single" w:color="auto" w:sz="4"/>
+          <w:left w:val="single" w:color="auto" w:sz="4"/>
+          <w:bottom w:val="single" w:color="auto" w:sz="4"/>
+          <w:right w:val="single" w:color="auto" w:sz="4"/>
+          <w:insideH w:val="single" w:color="auto" w:sz="4"/>
+          <w:insideV w:val="single" w:color="auto" w:sz="4"/>
+        </w:tblBorders>
+      </w:tblPr>
+      <w:tblGrid>
+        <w:gridCol w:w="2800"/>
+        <w:gridCol w:w="6560"/>
+      </w:tblGrid>
+      <w:tr>
+        <w:tc>
+          <w:tcPr>
+            <w:tcBorders>
+              <w:top w:val="single" w:color="10513C" w:sz="4"/>
+              <w:left w:val="nil"/>
+              <w:bottom w:val="single" w:color="10513C" w:sz="4"/>
+              <w:right w:val="nil"/>
+            </w:tcBorders>
+            <w:shd w:fill="10513C" w:val="clear"/>
+            <w:tcMar>
+              <w:top w:type="dxa" w:w="100"/>
+              <w:left w:type="dxa" w:w="160"/>
+              <w:bottom w:type="dxa" w:w="100"/>
+              <w:right w:type="dxa" w:w="160"/>
+            </w:tcMar>
+          </w:tcPr>
+          <w:p>
+            <w:r>
+              <w:rPr>
+                <w:rFonts w:ascii="Arial" w:cs="Arial" w:eastAsia="Arial" w:hAnsi="Arial"/>
+                <w:b/>
+                <w:bCs/>
+                <w:color w:val="FFFFFF"/>
+                <w:sz w:val="20"/>
+                <w:szCs w:val="20"/>
+              </w:rPr>
+              <w:t xml:space="preserve">Property</w:t>
+            </w:r>
+          </w:p>
+        </w:tc>
+        <w:tc>
+          <w:tcPr>
+            <w:tcBorders>
+              <w:top w:val="single" w:color="10513C" w:sz="4"/>
+              <w:left w:val="nil"/>
+              <w:bottom w:val="single" w:color="10513C" w:sz="4"/>
+              <w:right w:val="nil"/>
+            </w:tcBorders>
+            <w:shd w:fill="10513C" w:val="clear"/>
+            <w:tcMar>
+              <w:top w:type="dxa" w:w="100"/>
+              <w:left w:type="dxa" w:w="160"/>
+              <w:bottom w:type="dxa" w:w="100"/>
+              <w:right w:type="dxa" w:w="160"/>
+            </w:tcMar>
+          </w:tcPr>
+          <w:p>
+            <w:r>
+              <w:rPr>
+                <w:rFonts w:ascii="Arial" w:cs="Arial" w:eastAsia="Arial" w:hAnsi="Arial"/>
+                <w:b/>
+                <w:bCs/>
+                <w:color w:val="FFFFFF"/>
+                <w:sz w:val="20"/>
+                <w:szCs w:val="20"/>
+              </w:rPr>
+              <w:t xml:space="preserve">Specification</w:t>
+            </w:r>
+          </w:p>
+        </w:tc>
+      </w:tr>
+      <w:tr>
+        <w:tc>
+          <w:tcPr>
+            <w:tcBorders>
+              <w:top w:val="single" w:color="CCCCCC" w:sz="1"/>
+              <w:left w:val="nil"/>
+              <w:bottom w:val="single" w:color="CCCCCC" w:sz="1"/>
+              <w:right w:val="nil"/>
+            </w:tcBorders>
+            <w:shd w:fill="FFFFFF" w:val="clear"/>
+            <w:tcMar>
+              <w:top w:type="dxa" w:w="100"/>
+              <w:left w:type="dxa" w:w="160"/>
+              <w:bottom w:type="dxa" w:w="100"/>
+              <w:right w:type="dxa" w:w="160"/>
+            </w:tcMar>
+          </w:tcPr>
+          <w:p>
+            <w:r>
+              <w:rPr>
+                <w:rFonts w:ascii="Arial" w:cs="Arial" w:eastAsia="Arial" w:hAnsi="Arial"/>
+                <w:b w:val="false"/>
+                <w:bCs w:val="false"/>
+                <w:color w:val="222222"/>
+                <w:sz w:val="20"/>
+                <w:szCs w:val="20"/>
+              </w:rPr>
+              <w:t xml:space="preserve">Headline value</w:t>
+            </w:r>
+          </w:p>
+        </w:tc>
+        <w:tc>
+          <w:tcPr>
+            <w:tcBorders>
+              <w:top w:val="single" w:color="CCCCCC" w:sz="1"/>
+              <w:left w:val="nil"/>
+              <w:bottom w:val="single" w:color="CCCCCC" w:sz="1"/>
+              <w:right w:val="nil"/>
+            </w:tcBorders>
+            <w:shd w:fill="FFFFFF" w:val="clear"/>
+            <w:tcMar>
+              <w:top w:type="dxa" w:w="100"/>
+              <w:left w:type="dxa" w:w="160"/>
+              <w:bottom w:type="dxa" w:w="100"/>
+              <w:right w:type="dxa" w:w="160"/>
+            </w:tcMar>
+          </w:tcPr>
+          <w:p>
+            <w:r>
+              <w:rPr>
+                <w:rFonts w:ascii="Arial" w:cs="Arial" w:eastAsia="Arial" w:hAnsi="Arial"/>
+                <w:b w:val="false"/>
+                <w:bCs w:val="false"/>
+                <w:color w:val="222222"/>
+                <w:sz w:val="20"/>
+                <w:szCs w:val="20"/>
+              </w:rPr>
+              <w:t xml:space="preserve">Your highest-output time slot (e.g. 'Morning')</w:t>
+            </w:r>
+          </w:p>
+        </w:tc>
+      </w:tr>
+      <w:tr>
+        <w:tc>
+          <w:tcPr>
+            <w:tcBorders>
+              <w:top w:val="single" w:color="CCCCCC" w:sz="1"/>
+              <w:left w:val="nil"/>
+              <w:bottom w:val="single" w:color="CCCCCC" w:sz="1"/>
+              <w:right w:val="nil"/>
+            </w:tcBorders>
+            <w:shd w:fill="F8F8F8" w:val="clear"/>
+            <w:tcMar>
+              <w:top w:type="dxa" w:w="100"/>
+              <w:left w:type="dxa" w:w="160"/>
+              <w:bottom w:type="dxa" w:w="100"/>
+              <w:right w:type="dxa" w:w="160"/>
+            </w:tcMar>
+          </w:tcPr>
+          <w:p>
+            <w:r>
+              <w:rPr>
+                <w:rFonts w:ascii="Arial" w:cs="Arial" w:eastAsia="Arial" w:hAnsi="Arial"/>
+                <w:b w:val="false"/>
+                <w:bCs w:val="false"/>
+                <w:color w:val="222222"/>
+                <w:sz w:val="20"/>
+                <w:szCs w:val="20"/>
+              </w:rPr>
+              <w:t xml:space="preserve">Subtitle</w:t>
+            </w:r>
+          </w:p>
+        </w:tc>
+        <w:tc>
+          <w:tcPr>
+            <w:tcBorders>
+              <w:top w:val="single" w:color="CCCCCC" w:sz="1"/>
+              <w:left w:val="nil"/>
+              <w:bottom w:val="single" w:color="CCCCCC" w:sz="1"/>
+              <w:right w:val="nil"/>
+            </w:tcBorders>
+            <w:shd w:fill="F8F8F8" w:val="clear"/>
+            <w:tcMar>
+              <w:top w:type="dxa" w:w="100"/>
+              <w:left w:type="dxa" w:w="160"/>
+              <w:bottom w:type="dxa" w:w="100"/>
+              <w:right w:type="dxa" w:w="160"/>
+            </w:tcMar>
+          </w:tcPr>
+          <w:p>
+            <w:r>
+              <w:rPr>
+                <w:rFonts w:ascii="Arial" w:cs="Arial" w:eastAsia="Arial" w:hAnsi="Arial"/>
+                <w:b w:val="false"/>
+                <w:bCs w:val="false"/>
+                <w:color w:val="222222"/>
+                <w:sz w:val="20"/>
+                <w:szCs w:val="20"/>
+              </w:rPr>
+              <w:t xml:space="preserve">Multiplier vs your average completion rate</w:t>
+            </w:r>
+          </w:p>
+        </w:tc>
+      </w:tr>
+      <w:tr>
+        <w:tc>
+          <w:tcPr>
+            <w:tcBorders>
+              <w:top w:val="single" w:color="CCCCCC" w:sz="1"/>
+              <w:left w:val="nil"/>
+              <w:bottom w:val="single" w:color="CCCCCC" w:sz="1"/>
+              <w:right w:val="nil"/>
+            </w:tcBorders>
+            <w:shd w:fill="FFFFFF" w:val="clear"/>
+            <w:tcMar>
+              <w:top w:type="dxa" w:w="100"/>
+              <w:left w:type="dxa" w:w="160"/>
+              <w:bottom w:type="dxa" w:w="100"/>
+              <w:right w:type="dxa" w:w="160"/>
+            </w:tcMar>
+          </w:tcPr>
+          <w:p>
+            <w:r>
+              <w:rPr>
+                <w:rFonts w:ascii="Arial" w:cs="Arial" w:eastAsia="Arial" w:hAnsi="Arial"/>
+                <w:b w:val="false"/>
+                <w:bCs w:val="false"/>
+                <w:color w:val="222222"/>
+                <w:sz w:val="20"/>
+                <w:szCs w:val="20"/>
+              </w:rPr>
+              <w:t xml:space="preserve">Preview chart type</w:t>
+            </w:r>
+          </w:p>
+        </w:tc>
+        <w:tc>
+          <w:tcPr>
+            <w:tcBorders>
+              <w:top w:val="single" w:color="CCCCCC" w:sz="1"/>
+              <w:left w:val="nil"/>
+              <w:bottom w:val="single" w:color="CCCCCC" w:sz="1"/>
+              <w:right w:val="nil"/>
+            </w:tcBorders>
+            <w:shd w:fill="FFFFFF" w:val="clear"/>
+            <w:tcMar>
+              <w:top w:type="dxa" w:w="100"/>
+              <w:left w:type="dxa" w:w="160"/>
+              <w:bottom w:type="dxa" w:w="100"/>
+              <w:right w:type="dxa" w:w="160"/>
+            </w:tcMar>
+          </w:tcPr>
+          <w:p>
+            <w:r>
+              <w:rPr>
+                <w:rFonts w:ascii="Arial" w:cs="Arial" w:eastAsia="Arial" w:hAnsi="Arial"/>
+                <w:b w:val="false"/>
+                <w:bCs w:val="false"/>
+                <w:color w:val="222222"/>
+                <w:sz w:val="20"/>
+                <w:szCs w:val="20"/>
+              </w:rPr>
+              <w:t xml:space="preserve">Mini line chart — completion rate across slots left to right</w:t>
+            </w:r>
+          </w:p>
+        </w:tc>
+      </w:tr>
+      <w:tr>
+        <w:tc>
+          <w:tcPr>
+            <w:tcBorders>
+              <w:top w:val="single" w:color="CCCCCC" w:sz="1"/>
+              <w:left w:val="nil"/>
+              <w:bottom w:val="single" w:color="CCCCCC" w:sz="1"/>
+              <w:right w:val="nil"/>
+            </w:tcBorders>
+            <w:shd w:fill="F8F8F8" w:val="clear"/>
+            <w:tcMar>
+              <w:top w:type="dxa" w:w="100"/>
+              <w:left w:type="dxa" w:w="160"/>
+              <w:bottom w:type="dxa" w:w="100"/>
+              <w:right w:type="dxa" w:w="160"/>
+            </w:tcMar>
+          </w:tcPr>
+          <w:p>
+            <w:r>
+              <w:rPr>
+                <w:rFonts w:ascii="Arial" w:cs="Arial" w:eastAsia="Arial" w:hAnsi="Arial"/>
+                <w:b w:val="false"/>
+                <w:bCs w:val="false"/>
+                <w:color w:val="222222"/>
+                <w:sz w:val="20"/>
+                <w:szCs w:val="20"/>
+              </w:rPr>
+              <w:t xml:space="preserve">Line data</w:t>
+            </w:r>
+          </w:p>
+        </w:tc>
+        <w:tc>
+          <w:tcPr>
+            <w:tcBorders>
+              <w:top w:val="single" w:color="CCCCCC" w:sz="1"/>
+              <w:left w:val="nil"/>
+              <w:bottom w:val="single" w:color="CCCCCC" w:sz="1"/>
+              <w:right w:val="nil"/>
+            </w:tcBorders>
+            <w:shd w:fill="F8F8F8" w:val="clear"/>
+            <w:tcMar>
+              <w:top w:type="dxa" w:w="100"/>
+              <w:left w:type="dxa" w:w="160"/>
+              <w:bottom w:type="dxa" w:w="100"/>
+              <w:right w:type="dxa" w:w="160"/>
+            </w:tcMar>
+          </w:tcPr>
+          <w:p>
+            <w:r>
+              <w:rPr>
+                <w:rFonts w:ascii="Arial" w:cs="Arial" w:eastAsia="Arial" w:hAnsi="Arial"/>
+                <w:b w:val="false"/>
+                <w:bCs w:val="false"/>
+                <w:color w:val="222222"/>
+                <w:sz w:val="20"/>
+                <w:szCs w:val="20"/>
+              </w:rPr>
+              <w:t xml:space="preserve">X = slot order (early morning → late night), Y = avg completion rate</w:t>
+            </w:r>
+          </w:p>
+        </w:tc>
+      </w:tr>
+      <w:tr>
+        <w:tc>
+          <w:tcPr>
+            <w:tcBorders>
+              <w:top w:val="single" w:color="CCCCCC" w:sz="1"/>
+              <w:left w:val="nil"/>
+              <w:bottom w:val="single" w:color="CCCCCC" w:sz="1"/>
+              <w:right w:val="nil"/>
+            </w:tcBorders>
+            <w:shd w:fill="FFFFFF" w:val="clear"/>
+            <w:tcMar>
+              <w:top w:type="dxa" w:w="100"/>
+              <w:left w:type="dxa" w:w="160"/>
+              <w:bottom w:type="dxa" w:w="100"/>
+              <w:right w:type="dxa" w:w="160"/>
+            </w:tcMar>
+          </w:tcPr>
+          <w:p>
+            <w:r>
+              <w:rPr>
+                <w:rFonts w:ascii="Arial" w:cs="Arial" w:eastAsia="Arial" w:hAnsi="Arial"/>
+                <w:b w:val="false"/>
+                <w:bCs w:val="false"/>
+                <w:color w:val="222222"/>
+                <w:sz w:val="20"/>
+                <w:szCs w:val="20"/>
+              </w:rPr>
+              <w:t xml:space="preserve">Status tag logic</w:t>
+            </w:r>
+          </w:p>
+        </w:tc>
+        <w:tc>
+          <w:tcPr>
+            <w:tcBorders>
+              <w:top w:val="single" w:color="CCCCCC" w:sz="1"/>
+              <w:left w:val="nil"/>
+              <w:bottom w:val="single" w:color="CCCCCC" w:sz="1"/>
+              <w:right w:val="nil"/>
+            </w:tcBorders>
+            <w:shd w:fill="FFFFFF" w:val="clear"/>
+            <w:tcMar>
+              <w:top w:type="dxa" w:w="100"/>
+              <w:left w:type="dxa" w:w="160"/>
+              <w:bottom w:type="dxa" w:w="100"/>
+              <w:right w:type="dxa" w:w="160"/>
+            </w:tcMar>
+          </w:tcPr>
+          <w:p>
+            <w:r>
+              <w:rPr>
+                <w:rFonts w:ascii="Arial" w:cs="Arial" w:eastAsia="Arial" w:hAnsi="Arial"/>
+                <w:b w:val="false"/>
+                <w:bCs w:val="false"/>
+                <w:color w:val="222222"/>
+                <w:sz w:val="20"/>
+                <w:szCs w:val="20"/>
+              </w:rPr>
+              <w:t xml:space="preserve">Always 'Pattern found' if ≥ 10 blocks have slot data, else 'Not enough data'</w:t>
+            </w:r>
+          </w:p>
+        </w:tc>
+      </w:tr>
+    </w:tbl>
+    <w:p>
+      <w:pPr>
+        <w:spacing w:before="0" w:after="0"/>
+      </w:pPr>
+      <w:r>
+        <w:rPr>
+          <w:sz w:val="22"/>
+          <w:szCs w:val="22"/>
+        </w:rPr>
+        <w:t xml:space="preserve"/>
+      </w:r>
+    </w:p>
+    <w:p>
+      <w:pPr>
+        <w:spacing w:before="60" w:after="80"/>
+      </w:pPr>
+      <w:r>
+        <w:rPr>
+          <w:rFonts w:ascii="Arial" w:cs="Arial" w:eastAsia="Arial" w:hAnsi="Arial"/>
+          <w:color w:val="222222"/>
+          <w:sz w:val="22"/>
+          <w:szCs w:val="22"/>
+        </w:rPr>
+        <w:t xml:space="preserve">Tool effectiveness answers the question: under what conditions do you actually finish what you start? It crosses three dimensions of your block data to find patterns:</w:t>
+      </w:r>
+    </w:p>
+    <w:p>
+      <w:pPr>
+        <w:pStyle w:val="ListParagraph"/>
+        <w:numPr>
+          <w:ilvl w:val="0"/>
+          <w:numId w:val="2"/>
+        </w:numPr>
+        <w:spacing w:before="40" w:after="40"/>
+      </w:pPr>
+      <w:r>
+        <w:rPr>
+          <w:rFonts w:ascii="Arial" w:cs="Arial" w:eastAsia="Arial" w:hAnsi="Arial"/>
+          <w:color w:val="222222"/>
+          <w:sz w:val="22"/>
+          <w:szCs w:val="22"/>
+        </w:rPr>
+        <w:t xml:space="preserve">Time slot — which slots produce your highest completion rates</w:t>
+      </w:r>
+    </w:p>
+    <w:p>
+      <w:pPr>
+        <w:pStyle w:val="ListParagraph"/>
+        <w:numPr>
+          <w:ilvl w:val="0"/>
+          <w:numId w:val="2"/>
+        </w:numPr>
+        <w:spacing w:before="40" w:after="40"/>
+      </w:pPr>
+      <w:r>
+        <w:rPr>
+          <w:rFonts w:ascii="Arial" w:cs="Arial" w:eastAsia="Arial" w:hAnsi="Arial"/>
+          <w:color w:val="222222"/>
+          <w:sz w:val="22"/>
+          <w:szCs w:val="22"/>
+        </w:rPr>
+        <w:t xml:space="preserve">Category — which categories perform best in which slots</w:t>
+      </w:r>
+    </w:p>
+    <w:p>
+      <w:pPr>
+        <w:pStyle w:val="ListParagraph"/>
+        <w:numPr>
+          <w:ilvl w:val="0"/>
+          <w:numId w:val="2"/>
+        </w:numPr>
+        <w:spacing w:before="40" w:after="40"/>
+      </w:pPr>
+      <w:r>
+        <w:rPr>
+          <w:rFonts w:ascii="Arial" w:cs="Arial" w:eastAsia="Arial" w:hAnsi="Arial"/>
+          <w:color w:val="222222"/>
+          <w:sz w:val="22"/>
+          <w:szCs w:val="22"/>
+        </w:rPr>
+        <w:t xml:space="preserve">Focus quality — whether high-focus blocks are concentrated in certain slots</w:t>
+      </w:r>
+    </w:p>
+    <w:p>
+      <w:pPr>
+        <w:spacing w:before="0" w:after="0"/>
+      </w:pPr>
+      <w:r>
+        <w:rPr>
+          <w:sz w:val="22"/>
+          <w:szCs w:val="22"/>
+        </w:rPr>
+        <w:t xml:space="preserve"/>
+      </w:r>
+    </w:p>
+    <w:p>
+      <w:pPr>
+        <w:spacing w:before="60" w:after="80"/>
+      </w:pPr>
+      <w:r>
+        <w:rPr>
+          <w:rFonts w:ascii="Arial" w:cs="Arial" w:eastAsia="Arial" w:hAnsi="Arial"/>
+          <w:color w:val="222222"/>
+          <w:sz w:val="22"/>
+          <w:szCs w:val="22"/>
+        </w:rPr>
+        <w:t xml:space="preserve">Drilldown chart: bubble chart. X-axis = time slot (6 positions: early morning, morning, afternoon, evening, night, late night). Y-axis = average completion rate for blocks in that slot. Bubble size = number of blocks logged in that slot (bigger = more data, more reliable). Bubble colour = dominant focus quality for that slot (teal = mostly high focus, amber = mostly medium).</w:t>
+      </w:r>
+    </w:p>
+    <w:p>
+      <w:pPr>
+        <w:spacing w:before="60" w:after="80"/>
+      </w:pPr>
+      <w:r>
+        <w:rPr>
+          <w:rFonts w:ascii="Arial" w:cs="Arial" w:eastAsia="Arial" w:hAnsi="Arial"/>
+          <w:color w:val="222222"/>
+          <w:sz w:val="22"/>
+          <w:szCs w:val="22"/>
+        </w:rPr>
+        <w:t xml:space="preserve">Below the bubble chart: a ranked table of the best-performing slot + category combinations. Format: '[Slot] · [Category] — [completion rate]%'. This is the most actionable output in the whole Insights tab — it tells you when to schedule which type of work.</w:t>
+      </w:r>
+    </w:p>
+    <w:p>
+      <w:pPr>
+        <w:spacing w:before="60" w:after="80"/>
+      </w:pPr>
+      <w:r>
+        <w:rPr>
+          <w:rFonts w:ascii="Arial" w:cs="Arial" w:eastAsia="Arial" w:hAnsi="Arial"/>
+          <w:color w:val="222222"/>
+          <w:sz w:val="22"/>
+          <w:szCs w:val="22"/>
+        </w:rPr>
+        <w:t xml:space="preserve">Worst-performing combinations are also shown with a specific recommendation: 'Night sessions on Project have a 38% completion rate — consider not scheduling deep work there.'</w:t>
+      </w:r>
+    </w:p>
+    <w:tbl>
+      <w:tblPr>
+        <w:tblW w:type="dxa" w:w="9360"/>
+        <w:tblBorders>
+          <w:top w:val="single" w:color="auto" w:sz="4"/>
+          <w:left w:val="single" w:color="auto" w:sz="4"/>
+          <w:bottom w:val="single" w:color="auto" w:sz="4"/>
+          <w:right w:val="single" w:color="auto" w:sz="4"/>
+          <w:insideH w:val="single" w:color="auto" w:sz="4"/>
+          <w:insideV w:val="single" w:color="auto" w:sz="4"/>
+        </w:tblBorders>
+      </w:tblPr>
+      <w:tblGrid>
+        <w:gridCol w:w="9360"/>
+      </w:tblGrid>
+      <w:tr>
+        <w:tc>
+          <w:tcPr>
+            <w:tcBorders>
+              <w:top w:val="nil"/>
+              <w:left w:val="nil"/>
+              <w:bottom w:val="nil"/>
+              <w:right w:val="nil"/>
+            </w:tcBorders>
+            <w:shd w:fill="F4F4F2" w:val="clear"/>
+            <w:tcMar>
+              <w:top w:type="dxa" w:w="160"/>
+              <w:left w:type="dxa" w:w="240"/>
+              <w:bottom w:type="dxa" w:w="160"/>
+              <w:right w:type="dxa" w:w="240"/>
+            </w:tcMar>
+          </w:tcPr>
+          <w:p>
+            <w:r>
+              <w:rPr>
+                <w:rFonts w:ascii="Arial" w:cs="Arial" w:eastAsia="Arial" w:hAnsi="Arial"/>
+                <w:b w:val="false"/>
+                <w:bCs w:val="false"/>
+                <w:color w:val="5F5E5A"/>
+                <w:sz w:val="22"/>
+                <w:szCs w:val="22"/>
+              </w:rPr>
+              <w:t xml:space="preserve">Tool effectiveness is computed from block data only — no new data entry is required. It becomes meaningful once you have ~20+ blocks with both slot and completion state filled in. Before that, it shows a 'Not enough data yet' message.</w:t>
+            </w:r>
+          </w:p>
+        </w:tc>
+      </w:tr>
+    </w:tbl>
+    <w:p>
+      <w:pPr>
+        <w:spacing w:before="0" w:after="0"/>
+      </w:pPr>
+      <w:r>
+        <w:rPr>
+          <w:sz w:val="22"/>
+          <w:szCs w:val="22"/>
+        </w:rPr>
+        <w:t xml:space="preserve"/>
+      </w:r>
+    </w:p>
+    <w:p>
+      <w:pPr>
+        <w:spacing w:before="200" w:after="80"/>
+      </w:pPr>
+      <w:r>
+        <w:rPr>
+          <w:rFonts w:ascii="Arial" w:cs="Arial" w:eastAsia="Arial" w:hAnsi="Arial"/>
+          <w:b/>
+          <w:bCs/>
+          <w:color w:val="5F5E5A"/>
+          <w:sz w:val="22"/>
+          <w:szCs w:val="22"/>
+        </w:rPr>
+        <w:t xml:space="preserve">5. Focus quality distribution</w:t>
+      </w:r>
+    </w:p>
+    <w:tbl>
+      <w:tblPr>
+        <w:tblW w:type="dxa" w:w="9360"/>
+        <w:tblBorders>
+          <w:top w:val="single" w:color="auto" w:sz="4"/>
+          <w:left w:val="single" w:color="auto" w:sz="4"/>
+          <w:bottom w:val="single" w:color="auto" w:sz="4"/>
+          <w:right w:val="single" w:color="auto" w:sz="4"/>
+          <w:insideH w:val="single" w:color="auto" w:sz="4"/>
+          <w:insideV w:val="single" w:color="auto" w:sz="4"/>
+        </w:tblBorders>
+      </w:tblPr>
+      <w:tblGrid>
+        <w:gridCol w:w="2800"/>
+        <w:gridCol w:w="6560"/>
+      </w:tblGrid>
+      <w:tr>
+        <w:tc>
+          <w:tcPr>
+            <w:tcBorders>
+              <w:top w:val="single" w:color="10513C" w:sz="4"/>
+              <w:left w:val="nil"/>
+              <w:bottom w:val="single" w:color="10513C" w:sz="4"/>
+              <w:right w:val="nil"/>
+            </w:tcBorders>
+            <w:shd w:fill="10513C" w:val="clear"/>
+            <w:tcMar>
+              <w:top w:type="dxa" w:w="100"/>
+              <w:left w:type="dxa" w:w="160"/>
+              <w:bottom w:type="dxa" w:w="100"/>
+              <w:right w:type="dxa" w:w="160"/>
+            </w:tcMar>
+          </w:tcPr>
+          <w:p>
+            <w:r>
+              <w:rPr>
+                <w:rFonts w:ascii="Arial" w:cs="Arial" w:eastAsia="Arial" w:hAnsi="Arial"/>
+                <w:b/>
+                <w:bCs/>
+                <w:color w:val="FFFFFF"/>
+                <w:sz w:val="20"/>
+                <w:szCs w:val="20"/>
+              </w:rPr>
+              <w:t xml:space="preserve">Property</w:t>
+            </w:r>
+          </w:p>
+        </w:tc>
+        <w:tc>
+          <w:tcPr>
+            <w:tcBorders>
+              <w:top w:val="single" w:color="10513C" w:sz="4"/>
+              <w:left w:val="nil"/>
+              <w:bottom w:val="single" w:color="10513C" w:sz="4"/>
+              <w:right w:val="nil"/>
+            </w:tcBorders>
+            <w:shd w:fill="10513C" w:val="clear"/>
+            <w:tcMar>
+              <w:top w:type="dxa" w:w="100"/>
+              <w:left w:type="dxa" w:w="160"/>
+              <w:bottom w:type="dxa" w:w="100"/>
+              <w:right w:type="dxa" w:w="160"/>
+            </w:tcMar>
+          </w:tcPr>
+          <w:p>
+            <w:r>
+              <w:rPr>
+                <w:rFonts w:ascii="Arial" w:cs="Arial" w:eastAsia="Arial" w:hAnsi="Arial"/>
+                <w:b/>
+                <w:bCs/>
+                <w:color w:val="FFFFFF"/>
+                <w:sz w:val="20"/>
+                <w:szCs w:val="20"/>
+              </w:rPr>
+              <w:t xml:space="preserve">Specification</w:t>
+            </w:r>
+          </w:p>
+        </w:tc>
+      </w:tr>
+      <w:tr>
+        <w:tc>
+          <w:tcPr>
+            <w:tcBorders>
+              <w:top w:val="single" w:color="CCCCCC" w:sz="1"/>
+              <w:left w:val="nil"/>
+              <w:bottom w:val="single" w:color="CCCCCC" w:sz="1"/>
+              <w:right w:val="nil"/>
+            </w:tcBorders>
+            <w:shd w:fill="FFFFFF" w:val="clear"/>
+            <w:tcMar>
+              <w:top w:type="dxa" w:w="100"/>
+              <w:left w:type="dxa" w:w="160"/>
+              <w:bottom w:type="dxa" w:w="100"/>
+              <w:right w:type="dxa" w:w="160"/>
+            </w:tcMar>
+          </w:tcPr>
+          <w:p>
+            <w:r>
+              <w:rPr>
+                <w:rFonts w:ascii="Arial" w:cs="Arial" w:eastAsia="Arial" w:hAnsi="Arial"/>
+                <w:b w:val="false"/>
+                <w:bCs w:val="false"/>
+                <w:color w:val="222222"/>
+                <w:sz w:val="20"/>
+                <w:szCs w:val="20"/>
+              </w:rPr>
+              <w:t xml:space="preserve">Headline value</w:t>
+            </w:r>
+          </w:p>
+        </w:tc>
+        <w:tc>
+          <w:tcPr>
+            <w:tcBorders>
+              <w:top w:val="single" w:color="CCCCCC" w:sz="1"/>
+              <w:left w:val="nil"/>
+              <w:bottom w:val="single" w:color="CCCCCC" w:sz="1"/>
+              <w:right w:val="nil"/>
+            </w:tcBorders>
+            <w:shd w:fill="FFFFFF" w:val="clear"/>
+            <w:tcMar>
+              <w:top w:type="dxa" w:w="100"/>
+              <w:left w:type="dxa" w:w="160"/>
+              <w:bottom w:type="dxa" w:w="100"/>
+              <w:right w:type="dxa" w:w="160"/>
+            </w:tcMar>
+          </w:tcPr>
+          <w:p>
+            <w:r>
+              <w:rPr>
+                <w:rFonts w:ascii="Arial" w:cs="Arial" w:eastAsia="Arial" w:hAnsi="Arial"/>
+                <w:b w:val="false"/>
+                <w:bCs w:val="false"/>
+                <w:color w:val="222222"/>
+                <w:sz w:val="20"/>
+                <w:szCs w:val="20"/>
+              </w:rPr>
+              <w:t xml:space="preserve">% of blocks at high focus (e.g. '44%')</w:t>
+            </w:r>
+          </w:p>
+        </w:tc>
+      </w:tr>
+      <w:tr>
+        <w:tc>
+          <w:tcPr>
+            <w:tcBorders>
+              <w:top w:val="single" w:color="CCCCCC" w:sz="1"/>
+              <w:left w:val="nil"/>
+              <w:bottom w:val="single" w:color="CCCCCC" w:sz="1"/>
+              <w:right w:val="nil"/>
+            </w:tcBorders>
+            <w:shd w:fill="F8F8F8" w:val="clear"/>
+            <w:tcMar>
+              <w:top w:type="dxa" w:w="100"/>
+              <w:left w:type="dxa" w:w="160"/>
+              <w:bottom w:type="dxa" w:w="100"/>
+              <w:right w:type="dxa" w:w="160"/>
+            </w:tcMar>
+          </w:tcPr>
+          <w:p>
+            <w:r>
+              <w:rPr>
+                <w:rFonts w:ascii="Arial" w:cs="Arial" w:eastAsia="Arial" w:hAnsi="Arial"/>
+                <w:b w:val="false"/>
+                <w:bCs w:val="false"/>
+                <w:color w:val="222222"/>
+                <w:sz w:val="20"/>
+                <w:szCs w:val="20"/>
+              </w:rPr>
+              <w:t xml:space="preserve">Subtitle</w:t>
+            </w:r>
+          </w:p>
+        </w:tc>
+        <w:tc>
+          <w:tcPr>
+            <w:tcBorders>
+              <w:top w:val="single" w:color="CCCCCC" w:sz="1"/>
+              <w:left w:val="nil"/>
+              <w:bottom w:val="single" w:color="CCCCCC" w:sz="1"/>
+              <w:right w:val="nil"/>
+            </w:tcBorders>
+            <w:shd w:fill="F8F8F8" w:val="clear"/>
+            <w:tcMar>
+              <w:top w:type="dxa" w:w="100"/>
+              <w:left w:type="dxa" w:w="160"/>
+              <w:bottom w:type="dxa" w:w="100"/>
+              <w:right w:type="dxa" w:w="160"/>
+            </w:tcMar>
+          </w:tcPr>
+          <w:p>
+            <w:r>
+              <w:rPr>
+                <w:rFonts w:ascii="Arial" w:cs="Arial" w:eastAsia="Arial" w:hAnsi="Arial"/>
+                <w:b w:val="false"/>
+                <w:bCs w:val="false"/>
+                <w:color w:val="222222"/>
+                <w:sz w:val="20"/>
+                <w:szCs w:val="20"/>
+              </w:rPr>
+              <w:t xml:space="preserve">High-focus blocks this period</w:t>
+            </w:r>
+          </w:p>
+        </w:tc>
+      </w:tr>
+      <w:tr>
+        <w:tc>
+          <w:tcPr>
+            <w:tcBorders>
+              <w:top w:val="single" w:color="CCCCCC" w:sz="1"/>
+              <w:left w:val="nil"/>
+              <w:bottom w:val="single" w:color="CCCCCC" w:sz="1"/>
+              <w:right w:val="nil"/>
+            </w:tcBorders>
+            <w:shd w:fill="FFFFFF" w:val="clear"/>
+            <w:tcMar>
+              <w:top w:type="dxa" w:w="100"/>
+              <w:left w:type="dxa" w:w="160"/>
+              <w:bottom w:type="dxa" w:w="100"/>
+              <w:right w:type="dxa" w:w="160"/>
+            </w:tcMar>
+          </w:tcPr>
+          <w:p>
+            <w:r>
+              <w:rPr>
+                <w:rFonts w:ascii="Arial" w:cs="Arial" w:eastAsia="Arial" w:hAnsi="Arial"/>
+                <w:b w:val="false"/>
+                <w:bCs w:val="false"/>
+                <w:color w:val="222222"/>
+                <w:sz w:val="20"/>
+                <w:szCs w:val="20"/>
+              </w:rPr>
+              <w:t xml:space="preserve">Preview chart type</w:t>
+            </w:r>
+          </w:p>
+        </w:tc>
+        <w:tc>
+          <w:tcPr>
+            <w:tcBorders>
+              <w:top w:val="single" w:color="CCCCCC" w:sz="1"/>
+              <w:left w:val="nil"/>
+              <w:bottom w:val="single" w:color="CCCCCC" w:sz="1"/>
+              <w:right w:val="nil"/>
+            </w:tcBorders>
+            <w:shd w:fill="FFFFFF" w:val="clear"/>
+            <w:tcMar>
+              <w:top w:type="dxa" w:w="100"/>
+              <w:left w:type="dxa" w:w="160"/>
+              <w:bottom w:type="dxa" w:w="100"/>
+              <w:right w:type="dxa" w:w="160"/>
+            </w:tcMar>
+          </w:tcPr>
+          <w:p>
+            <w:r>
+              <w:rPr>
+                <w:rFonts w:ascii="Arial" w:cs="Arial" w:eastAsia="Arial" w:hAnsi="Arial"/>
+                <w:b w:val="false"/>
+                <w:bCs w:val="false"/>
+                <w:color w:val="222222"/>
+                <w:sz w:val="20"/>
+                <w:szCs w:val="20"/>
+              </w:rPr>
+              <w:t xml:space="preserve">Doughnut chart — three segments: high / medium / low</w:t>
+            </w:r>
+          </w:p>
+        </w:tc>
+      </w:tr>
+      <w:tr>
+        <w:tc>
+          <w:tcPr>
+            <w:tcBorders>
+              <w:top w:val="single" w:color="CCCCCC" w:sz="1"/>
+              <w:left w:val="nil"/>
+              <w:bottom w:val="single" w:color="CCCCCC" w:sz="1"/>
+              <w:right w:val="nil"/>
+            </w:tcBorders>
+            <w:shd w:fill="F8F8F8" w:val="clear"/>
+            <w:tcMar>
+              <w:top w:type="dxa" w:w="100"/>
+              <w:left w:type="dxa" w:w="160"/>
+              <w:bottom w:type="dxa" w:w="100"/>
+              <w:right w:type="dxa" w:w="160"/>
+            </w:tcMar>
+          </w:tcPr>
+          <w:p>
+            <w:r>
+              <w:rPr>
+                <w:rFonts w:ascii="Arial" w:cs="Arial" w:eastAsia="Arial" w:hAnsi="Arial"/>
+                <w:b w:val="false"/>
+                <w:bCs w:val="false"/>
+                <w:color w:val="222222"/>
+                <w:sz w:val="20"/>
+                <w:szCs w:val="20"/>
+              </w:rPr>
+              <w:t xml:space="preserve">Segment colours</w:t>
+            </w:r>
+          </w:p>
+        </w:tc>
+        <w:tc>
+          <w:tcPr>
+            <w:tcBorders>
+              <w:top w:val="single" w:color="CCCCCC" w:sz="1"/>
+              <w:left w:val="nil"/>
+              <w:bottom w:val="single" w:color="CCCCCC" w:sz="1"/>
+              <w:right w:val="nil"/>
+            </w:tcBorders>
+            <w:shd w:fill="F8F8F8" w:val="clear"/>
+            <w:tcMar>
+              <w:top w:type="dxa" w:w="100"/>
+              <w:left w:type="dxa" w:w="160"/>
+              <w:bottom w:type="dxa" w:w="100"/>
+              <w:right w:type="dxa" w:w="160"/>
+            </w:tcMar>
+          </w:tcPr>
+          <w:p>
+            <w:r>
+              <w:rPr>
+                <w:rFonts w:ascii="Arial" w:cs="Arial" w:eastAsia="Arial" w:hAnsi="Arial"/>
+                <w:b w:val="false"/>
+                <w:bCs w:val="false"/>
+                <w:color w:val="222222"/>
+                <w:sz w:val="20"/>
+                <w:szCs w:val="20"/>
+              </w:rPr>
+              <w:t xml:space="preserve">Teal = high, amber = medium, gray = low</w:t>
+            </w:r>
+          </w:p>
+        </w:tc>
+      </w:tr>
+      <w:tr>
+        <w:tc>
+          <w:tcPr>
+            <w:tcBorders>
+              <w:top w:val="single" w:color="CCCCCC" w:sz="1"/>
+              <w:left w:val="nil"/>
+              <w:bottom w:val="single" w:color="CCCCCC" w:sz="1"/>
+              <w:right w:val="nil"/>
+            </w:tcBorders>
+            <w:shd w:fill="FFFFFF" w:val="clear"/>
+            <w:tcMar>
+              <w:top w:type="dxa" w:w="100"/>
+              <w:left w:type="dxa" w:w="160"/>
+              <w:bottom w:type="dxa" w:w="100"/>
+              <w:right w:type="dxa" w:w="160"/>
+            </w:tcMar>
+          </w:tcPr>
+          <w:p>
+            <w:r>
+              <w:rPr>
+                <w:rFonts w:ascii="Arial" w:cs="Arial" w:eastAsia="Arial" w:hAnsi="Arial"/>
+                <w:b w:val="false"/>
+                <w:bCs w:val="false"/>
+                <w:color w:val="222222"/>
+                <w:sz w:val="20"/>
+                <w:szCs w:val="20"/>
+              </w:rPr>
+              <w:t xml:space="preserve">Status tag logic</w:t>
+            </w:r>
+          </w:p>
+        </w:tc>
+        <w:tc>
+          <w:tcPr>
+            <w:tcBorders>
+              <w:top w:val="single" w:color="CCCCCC" w:sz="1"/>
+              <w:left w:val="nil"/>
+              <w:bottom w:val="single" w:color="CCCCCC" w:sz="1"/>
+              <w:right w:val="nil"/>
+            </w:tcBorders>
+            <w:shd w:fill="FFFFFF" w:val="clear"/>
+            <w:tcMar>
+              <w:top w:type="dxa" w:w="100"/>
+              <w:left w:type="dxa" w:w="160"/>
+              <w:bottom w:type="dxa" w:w="100"/>
+              <w:right w:type="dxa" w:w="160"/>
+            </w:tcMar>
+          </w:tcPr>
+          <w:p>
+            <w:r>
+              <w:rPr>
+                <w:rFonts w:ascii="Arial" w:cs="Arial" w:eastAsia="Arial" w:hAnsi="Arial"/>
+                <w:b w:val="false"/>
+                <w:bCs w:val="false"/>
+                <w:color w:val="222222"/>
+                <w:sz w:val="20"/>
+                <w:szCs w:val="20"/>
+              </w:rPr>
+              <w:t xml:space="preserve">None — purely informational</w:t>
+            </w:r>
+          </w:p>
+        </w:tc>
+      </w:tr>
+    </w:tbl>
+    <w:p>
+      <w:pPr>
+        <w:spacing w:before="0" w:after="0"/>
+      </w:pPr>
+      <w:r>
+        <w:rPr>
+          <w:sz w:val="22"/>
+          <w:szCs w:val="22"/>
+        </w:rPr>
+        <w:t xml:space="preserve"/>
+      </w:r>
+    </w:p>
+    <w:p>
+      <w:pPr>
+        <w:spacing w:before="60" w:after="80"/>
+      </w:pPr>
+      <w:r>
+        <w:rPr>
+          <w:rFonts w:ascii="Arial" w:cs="Arial" w:eastAsia="Arial" w:hAnsi="Arial"/>
+          <w:color w:val="222222"/>
+          <w:sz w:val="22"/>
+          <w:szCs w:val="22"/>
+        </w:rPr>
+        <w:t xml:space="preserve">Drilldown chart: stacked area chart. X-axis = weeks. Y-axis = block count. Three stacked layers (high/medium/low). This shows whether your focus profile is improving over time — ideally the teal layer grows as a proportion.</w:t>
+      </w:r>
+    </w:p>
+    <w:p>
+      <w:pPr>
+        <w:spacing w:before="0" w:after="0"/>
+      </w:pPr>
+      <w:r>
+        <w:rPr>
+          <w:sz w:val="22"/>
+          <w:szCs w:val="22"/>
+        </w:rPr>
+        <w:t xml:space="preserve"/>
+      </w:r>
+    </w:p>
+    <w:p>
+      <w:pPr>
+        <w:spacing w:before="200" w:after="80"/>
+      </w:pPr>
+      <w:r>
+        <w:rPr>
+          <w:rFonts w:ascii="Arial" w:cs="Arial" w:eastAsia="Arial" w:hAnsi="Arial"/>
+          <w:b/>
+          <w:bCs/>
+          <w:color w:val="5F5E5A"/>
+          <w:sz w:val="22"/>
+          <w:szCs w:val="22"/>
+        </w:rPr>
+        <w:t xml:space="preserve">6. Area distribution</w:t>
+      </w:r>
+    </w:p>
+    <w:tbl>
+      <w:tblPr>
+        <w:tblW w:type="dxa" w:w="9360"/>
+        <w:tblBorders>
+          <w:top w:val="single" w:color="auto" w:sz="4"/>
+          <w:left w:val="single" w:color="auto" w:sz="4"/>
+          <w:bottom w:val="single" w:color="auto" w:sz="4"/>
+          <w:right w:val="single" w:color="auto" w:sz="4"/>
+          <w:insideH w:val="single" w:color="auto" w:sz="4"/>
+          <w:insideV w:val="single" w:color="auto" w:sz="4"/>
+        </w:tblBorders>
+      </w:tblPr>
+      <w:tblGrid>
+        <w:gridCol w:w="2800"/>
+        <w:gridCol w:w="6560"/>
+      </w:tblGrid>
+      <w:tr>
+        <w:tc>
+          <w:tcPr>
+            <w:tcBorders>
+              <w:top w:val="single" w:color="10513C" w:sz="4"/>
+              <w:left w:val="nil"/>
+              <w:bottom w:val="single" w:color="10513C" w:sz="4"/>
+              <w:right w:val="nil"/>
+            </w:tcBorders>
+            <w:shd w:fill="10513C" w:val="clear"/>
+            <w:tcMar>
+              <w:top w:type="dxa" w:w="100"/>
+              <w:left w:type="dxa" w:w="160"/>
+              <w:bottom w:type="dxa" w:w="100"/>
+              <w:right w:type="dxa" w:w="160"/>
+            </w:tcMar>
+          </w:tcPr>
+          <w:p>
+            <w:r>
+              <w:rPr>
+                <w:rFonts w:ascii="Arial" w:cs="Arial" w:eastAsia="Arial" w:hAnsi="Arial"/>
+                <w:b/>
+                <w:bCs/>
+                <w:color w:val="FFFFFF"/>
+                <w:sz w:val="20"/>
+                <w:szCs w:val="20"/>
+              </w:rPr>
+              <w:t xml:space="preserve">Property</w:t>
+            </w:r>
+          </w:p>
+        </w:tc>
+        <w:tc>
+          <w:tcPr>
+            <w:tcBorders>
+              <w:top w:val="single" w:color="10513C" w:sz="4"/>
+              <w:left w:val="nil"/>
+              <w:bottom w:val="single" w:color="10513C" w:sz="4"/>
+              <w:right w:val="nil"/>
+            </w:tcBorders>
+            <w:shd w:fill="10513C" w:val="clear"/>
+            <w:tcMar>
+              <w:top w:type="dxa" w:w="100"/>
+              <w:left w:type="dxa" w:w="160"/>
+              <w:bottom w:type="dxa" w:w="100"/>
+              <w:right w:type="dxa" w:w="160"/>
+            </w:tcMar>
+          </w:tcPr>
+          <w:p>
+            <w:r>
+              <w:rPr>
+                <w:rFonts w:ascii="Arial" w:cs="Arial" w:eastAsia="Arial" w:hAnsi="Arial"/>
+                <w:b/>
+                <w:bCs/>
+                <w:color w:val="FFFFFF"/>
+                <w:sz w:val="20"/>
+                <w:szCs w:val="20"/>
+              </w:rPr>
+              <w:t xml:space="preserve">Specification</w:t>
+            </w:r>
+          </w:p>
+        </w:tc>
+      </w:tr>
+      <w:tr>
+        <w:tc>
+          <w:tcPr>
+            <w:tcBorders>
+              <w:top w:val="single" w:color="CCCCCC" w:sz="1"/>
+              <w:left w:val="nil"/>
+              <w:bottom w:val="single" w:color="CCCCCC" w:sz="1"/>
+              <w:right w:val="nil"/>
+            </w:tcBorders>
+            <w:shd w:fill="FFFFFF" w:val="clear"/>
+            <w:tcMar>
+              <w:top w:type="dxa" w:w="100"/>
+              <w:left w:type="dxa" w:w="160"/>
+              <w:bottom w:type="dxa" w:w="100"/>
+              <w:right w:type="dxa" w:w="160"/>
+            </w:tcMar>
+          </w:tcPr>
+          <w:p>
+            <w:r>
+              <w:rPr>
+                <w:rFonts w:ascii="Arial" w:cs="Arial" w:eastAsia="Arial" w:hAnsi="Arial"/>
+                <w:b w:val="false"/>
+                <w:bCs w:val="false"/>
+                <w:color w:val="222222"/>
+                <w:sz w:val="20"/>
+                <w:szCs w:val="20"/>
+              </w:rPr>
+              <w:t xml:space="preserve">Headline value</w:t>
+            </w:r>
+          </w:p>
+        </w:tc>
+        <w:tc>
+          <w:tcPr>
+            <w:tcBorders>
+              <w:top w:val="single" w:color="CCCCCC" w:sz="1"/>
+              <w:left w:val="nil"/>
+              <w:bottom w:val="single" w:color="CCCCCC" w:sz="1"/>
+              <w:right w:val="nil"/>
+            </w:tcBorders>
+            <w:shd w:fill="FFFFFF" w:val="clear"/>
+            <w:tcMar>
+              <w:top w:type="dxa" w:w="100"/>
+              <w:left w:type="dxa" w:w="160"/>
+              <w:bottom w:type="dxa" w:w="100"/>
+              <w:right w:type="dxa" w:w="160"/>
+            </w:tcMar>
+          </w:tcPr>
+          <w:p>
+            <w:r>
+              <w:rPr>
+                <w:rFonts w:ascii="Arial" w:cs="Arial" w:eastAsia="Arial" w:hAnsi="Arial"/>
+                <w:b w:val="false"/>
+                <w:bCs w:val="false"/>
+                <w:color w:val="222222"/>
+                <w:sz w:val="20"/>
+                <w:szCs w:val="20"/>
+              </w:rPr>
+              <w:t xml:space="preserve">Top category by weighted hours (e.g. 'Project')</w:t>
+            </w:r>
+          </w:p>
+        </w:tc>
+      </w:tr>
+      <w:tr>
+        <w:tc>
+          <w:tcPr>
+            <w:tcBorders>
+              <w:top w:val="single" w:color="CCCCCC" w:sz="1"/>
+              <w:left w:val="nil"/>
+              <w:bottom w:val="single" w:color="CCCCCC" w:sz="1"/>
+              <w:right w:val="nil"/>
+            </w:tcBorders>
+            <w:shd w:fill="F8F8F8" w:val="clear"/>
+            <w:tcMar>
+              <w:top w:type="dxa" w:w="100"/>
+              <w:left w:type="dxa" w:w="160"/>
+              <w:bottom w:type="dxa" w:w="100"/>
+              <w:right w:type="dxa" w:w="160"/>
+            </w:tcMar>
+          </w:tcPr>
+          <w:p>
+            <w:r>
+              <w:rPr>
+                <w:rFonts w:ascii="Arial" w:cs="Arial" w:eastAsia="Arial" w:hAnsi="Arial"/>
+                <w:b w:val="false"/>
+                <w:bCs w:val="false"/>
+                <w:color w:val="222222"/>
+                <w:sz w:val="20"/>
+                <w:szCs w:val="20"/>
+              </w:rPr>
+              <w:t xml:space="preserve">Subtitle</w:t>
+            </w:r>
+          </w:p>
+        </w:tc>
+        <w:tc>
+          <w:tcPr>
+            <w:tcBorders>
+              <w:top w:val="single" w:color="CCCCCC" w:sz="1"/>
+              <w:left w:val="nil"/>
+              <w:bottom w:val="single" w:color="CCCCCC" w:sz="1"/>
+              <w:right w:val="nil"/>
+            </w:tcBorders>
+            <w:shd w:fill="F8F8F8" w:val="clear"/>
+            <w:tcMar>
+              <w:top w:type="dxa" w:w="100"/>
+              <w:left w:type="dxa" w:w="160"/>
+              <w:bottom w:type="dxa" w:w="100"/>
+              <w:right w:type="dxa" w:w="160"/>
+            </w:tcMar>
+          </w:tcPr>
+          <w:p>
+            <w:r>
+              <w:rPr>
+                <w:rFonts w:ascii="Arial" w:cs="Arial" w:eastAsia="Arial" w:hAnsi="Arial"/>
+                <w:b w:val="false"/>
+                <w:bCs w:val="false"/>
+                <w:color w:val="222222"/>
+                <w:sz w:val="20"/>
+                <w:szCs w:val="20"/>
+              </w:rPr>
+              <w:t xml:space="preserve">Top area · % of total weighted hours</w:t>
+            </w:r>
+          </w:p>
+        </w:tc>
+      </w:tr>
+      <w:tr>
+        <w:tc>
+          <w:tcPr>
+            <w:tcBorders>
+              <w:top w:val="single" w:color="CCCCCC" w:sz="1"/>
+              <w:left w:val="nil"/>
+              <w:bottom w:val="single" w:color="CCCCCC" w:sz="1"/>
+              <w:right w:val="nil"/>
+            </w:tcBorders>
+            <w:shd w:fill="FFFFFF" w:val="clear"/>
+            <w:tcMar>
+              <w:top w:type="dxa" w:w="100"/>
+              <w:left w:type="dxa" w:w="160"/>
+              <w:bottom w:type="dxa" w:w="100"/>
+              <w:right w:type="dxa" w:w="160"/>
+            </w:tcMar>
+          </w:tcPr>
+          <w:p>
+            <w:r>
+              <w:rPr>
+                <w:rFonts w:ascii="Arial" w:cs="Arial" w:eastAsia="Arial" w:hAnsi="Arial"/>
+                <w:b w:val="false"/>
+                <w:bCs w:val="false"/>
+                <w:color w:val="222222"/>
+                <w:sz w:val="20"/>
+                <w:szCs w:val="20"/>
+              </w:rPr>
+              <w:t xml:space="preserve">Preview chart type</w:t>
+            </w:r>
+          </w:p>
+        </w:tc>
+        <w:tc>
+          <w:tcPr>
+            <w:tcBorders>
+              <w:top w:val="single" w:color="CCCCCC" w:sz="1"/>
+              <w:left w:val="nil"/>
+              <w:bottom w:val="single" w:color="CCCCCC" w:sz="1"/>
+              <w:right w:val="nil"/>
+            </w:tcBorders>
+            <w:shd w:fill="FFFFFF" w:val="clear"/>
+            <w:tcMar>
+              <w:top w:type="dxa" w:w="100"/>
+              <w:left w:type="dxa" w:w="160"/>
+              <w:bottom w:type="dxa" w:w="100"/>
+              <w:right w:type="dxa" w:w="160"/>
+            </w:tcMar>
+          </w:tcPr>
+          <w:p>
+            <w:r>
+              <w:rPr>
+                <w:rFonts w:ascii="Arial" w:cs="Arial" w:eastAsia="Arial" w:hAnsi="Arial"/>
+                <w:b w:val="false"/>
+                <w:bCs w:val="false"/>
+                <w:color w:val="222222"/>
+                <w:sz w:val="20"/>
+                <w:szCs w:val="20"/>
+              </w:rPr>
+              <w:t xml:space="preserve">Doughnut chart — one segment per category (using category colours)</w:t>
+            </w:r>
+          </w:p>
+        </w:tc>
+      </w:tr>
+      <w:tr>
+        <w:tc>
+          <w:tcPr>
+            <w:tcBorders>
+              <w:top w:val="single" w:color="CCCCCC" w:sz="1"/>
+              <w:left w:val="nil"/>
+              <w:bottom w:val="single" w:color="CCCCCC" w:sz="1"/>
+              <w:right w:val="nil"/>
+            </w:tcBorders>
+            <w:shd w:fill="F8F8F8" w:val="clear"/>
+            <w:tcMar>
+              <w:top w:type="dxa" w:w="100"/>
+              <w:left w:type="dxa" w:w="160"/>
+              <w:bottom w:type="dxa" w:w="100"/>
+              <w:right w:type="dxa" w:w="160"/>
+            </w:tcMar>
+          </w:tcPr>
+          <w:p>
+            <w:r>
+              <w:rPr>
+                <w:rFonts w:ascii="Arial" w:cs="Arial" w:eastAsia="Arial" w:hAnsi="Arial"/>
+                <w:b w:val="false"/>
+                <w:bCs w:val="false"/>
+                <w:color w:val="222222"/>
+                <w:sz w:val="20"/>
+                <w:szCs w:val="20"/>
+              </w:rPr>
+              <w:t xml:space="preserve">Segment colours</w:t>
+            </w:r>
+          </w:p>
+        </w:tc>
+        <w:tc>
+          <w:tcPr>
+            <w:tcBorders>
+              <w:top w:val="single" w:color="CCCCCC" w:sz="1"/>
+              <w:left w:val="nil"/>
+              <w:bottom w:val="single" w:color="CCCCCC" w:sz="1"/>
+              <w:right w:val="nil"/>
+            </w:tcBorders>
+            <w:shd w:fill="F8F8F8" w:val="clear"/>
+            <w:tcMar>
+              <w:top w:type="dxa" w:w="100"/>
+              <w:left w:type="dxa" w:w="160"/>
+              <w:bottom w:type="dxa" w:w="100"/>
+              <w:right w:type="dxa" w:w="160"/>
+            </w:tcMar>
+          </w:tcPr>
+          <w:p>
+            <w:r>
+              <w:rPr>
+                <w:rFonts w:ascii="Arial" w:cs="Arial" w:eastAsia="Arial" w:hAnsi="Arial"/>
+                <w:b w:val="false"/>
+                <w:bCs w:val="false"/>
+                <w:color w:val="222222"/>
+                <w:sz w:val="20"/>
+                <w:szCs w:val="20"/>
+              </w:rPr>
+              <w:t xml:space="preserve">Each category's own colour from the categories config</w:t>
+            </w:r>
+          </w:p>
+        </w:tc>
+      </w:tr>
+      <w:tr>
+        <w:tc>
+          <w:tcPr>
+            <w:tcBorders>
+              <w:top w:val="single" w:color="CCCCCC" w:sz="1"/>
+              <w:left w:val="nil"/>
+              <w:bottom w:val="single" w:color="CCCCCC" w:sz="1"/>
+              <w:right w:val="nil"/>
+            </w:tcBorders>
+            <w:shd w:fill="FFFFFF" w:val="clear"/>
+            <w:tcMar>
+              <w:top w:type="dxa" w:w="100"/>
+              <w:left w:type="dxa" w:w="160"/>
+              <w:bottom w:type="dxa" w:w="100"/>
+              <w:right w:type="dxa" w:w="160"/>
+            </w:tcMar>
+          </w:tcPr>
+          <w:p>
+            <w:r>
+              <w:rPr>
+                <w:rFonts w:ascii="Arial" w:cs="Arial" w:eastAsia="Arial" w:hAnsi="Arial"/>
+                <w:b w:val="false"/>
+                <w:bCs w:val="false"/>
+                <w:color w:val="222222"/>
+                <w:sz w:val="20"/>
+                <w:szCs w:val="20"/>
+              </w:rPr>
+              <w:t xml:space="preserve">Status tag logic</w:t>
+            </w:r>
+          </w:p>
+        </w:tc>
+        <w:tc>
+          <w:tcPr>
+            <w:tcBorders>
+              <w:top w:val="single" w:color="CCCCCC" w:sz="1"/>
+              <w:left w:val="nil"/>
+              <w:bottom w:val="single" w:color="CCCCCC" w:sz="1"/>
+              <w:right w:val="nil"/>
+            </w:tcBorders>
+            <w:shd w:fill="FFFFFF" w:val="clear"/>
+            <w:tcMar>
+              <w:top w:type="dxa" w:w="100"/>
+              <w:left w:type="dxa" w:w="160"/>
+              <w:bottom w:type="dxa" w:w="100"/>
+              <w:right w:type="dxa" w:w="160"/>
+            </w:tcMar>
+          </w:tcPr>
+          <w:p>
+            <w:r>
+              <w:rPr>
+                <w:rFonts w:ascii="Arial" w:cs="Arial" w:eastAsia="Arial" w:hAnsi="Arial"/>
+                <w:b w:val="false"/>
+                <w:bCs w:val="false"/>
+                <w:color w:val="222222"/>
+                <w:sz w:val="20"/>
+                <w:szCs w:val="20"/>
+              </w:rPr>
+              <w:t xml:space="preserve">None — purely informational</w:t>
+            </w:r>
+          </w:p>
+        </w:tc>
+      </w:tr>
+    </w:tbl>
+    <w:p>
+      <w:pPr>
+        <w:spacing w:before="0" w:after="0"/>
+      </w:pPr>
+      <w:r>
+        <w:rPr>
+          <w:sz w:val="22"/>
+          <w:szCs w:val="22"/>
+        </w:rPr>
+        <w:t xml:space="preserve"/>
+      </w:r>
+    </w:p>
+    <w:p>
+      <w:pPr>
+        <w:spacing w:before="60" w:after="80"/>
+      </w:pPr>
+      <w:r>
+        <w:rPr>
+          <w:rFonts w:ascii="Arial" w:cs="Arial" w:eastAsia="Arial" w:hAnsi="Arial"/>
+          <w:color w:val="222222"/>
+          <w:sz w:val="22"/>
+          <w:szCs w:val="22"/>
+        </w:rPr>
+        <w:t xml:space="preserve">Drilldown chart: horizontal bar chart. One bar per category. Bar length = weighted hours. A small text overlay on each bar shows the completion rate for that category. This lets you see at a glance whether your high-hour categories also have high completion — if Project takes 38% of your hours but has a 55% completion rate, that's a planning signal.</w:t>
+      </w:r>
+    </w:p>
+    <w:p>
+      <w:pPr>
+        <w:spacing w:before="0" w:after="0"/>
+      </w:pPr>
+      <w:r>
+        <w:rPr>
+          <w:sz w:val="22"/>
+          <w:szCs w:val="22"/>
+        </w:rPr>
+        <w:t xml:space="preserve"/>
+      </w:r>
+    </w:p>
+    <w:p>
+      <w:pPr>
+        <w:spacing w:before="200" w:after="80"/>
+      </w:pPr>
+      <w:r>
+        <w:rPr>
+          <w:rFonts w:ascii="Arial" w:cs="Arial" w:eastAsia="Arial" w:hAnsi="Arial"/>
+          <w:b/>
+          <w:bCs/>
+          <w:color w:val="5F5E5A"/>
+          <w:sz w:val="22"/>
+          <w:szCs w:val="22"/>
+        </w:rPr>
+        <w:t xml:space="preserve">7. Intent accuracy</w:t>
+      </w:r>
+    </w:p>
+    <w:tbl>
+      <w:tblPr>
+        <w:tblW w:type="dxa" w:w="9360"/>
+        <w:tblBorders>
+          <w:top w:val="single" w:color="auto" w:sz="4"/>
+          <w:left w:val="single" w:color="auto" w:sz="4"/>
+          <w:bottom w:val="single" w:color="auto" w:sz="4"/>
+          <w:right w:val="single" w:color="auto" w:sz="4"/>
+          <w:insideH w:val="single" w:color="auto" w:sz="4"/>
+          <w:insideV w:val="single" w:color="auto" w:sz="4"/>
+        </w:tblBorders>
+      </w:tblPr>
+      <w:tblGrid>
+        <w:gridCol w:w="2800"/>
+        <w:gridCol w:w="6560"/>
+      </w:tblGrid>
+      <w:tr>
+        <w:tc>
+          <w:tcPr>
+            <w:tcBorders>
+              <w:top w:val="single" w:color="10513C" w:sz="4"/>
+              <w:left w:val="nil"/>
+              <w:bottom w:val="single" w:color="10513C" w:sz="4"/>
+              <w:right w:val="nil"/>
+            </w:tcBorders>
+            <w:shd w:fill="10513C" w:val="clear"/>
+            <w:tcMar>
+              <w:top w:type="dxa" w:w="100"/>
+              <w:left w:type="dxa" w:w="160"/>
+              <w:bottom w:type="dxa" w:w="100"/>
+              <w:right w:type="dxa" w:w="160"/>
+            </w:tcMar>
+          </w:tcPr>
+          <w:p>
+            <w:r>
+              <w:rPr>
+                <w:rFonts w:ascii="Arial" w:cs="Arial" w:eastAsia="Arial" w:hAnsi="Arial"/>
+                <w:b/>
+                <w:bCs/>
+                <w:color w:val="FFFFFF"/>
+                <w:sz w:val="20"/>
+                <w:szCs w:val="20"/>
+              </w:rPr>
+              <w:t xml:space="preserve">Property</w:t>
+            </w:r>
+          </w:p>
+        </w:tc>
+        <w:tc>
+          <w:tcPr>
+            <w:tcBorders>
+              <w:top w:val="single" w:color="10513C" w:sz="4"/>
+              <w:left w:val="nil"/>
+              <w:bottom w:val="single" w:color="10513C" w:sz="4"/>
+              <w:right w:val="nil"/>
+            </w:tcBorders>
+            <w:shd w:fill="10513C" w:val="clear"/>
+            <w:tcMar>
+              <w:top w:type="dxa" w:w="100"/>
+              <w:left w:type="dxa" w:w="160"/>
+              <w:bottom w:type="dxa" w:w="100"/>
+              <w:right w:type="dxa" w:w="160"/>
+            </w:tcMar>
+          </w:tcPr>
+          <w:p>
+            <w:r>
+              <w:rPr>
+                <w:rFonts w:ascii="Arial" w:cs="Arial" w:eastAsia="Arial" w:hAnsi="Arial"/>
+                <w:b/>
+                <w:bCs/>
+                <w:color w:val="FFFFFF"/>
+                <w:sz w:val="20"/>
+                <w:szCs w:val="20"/>
+              </w:rPr>
+              <w:t xml:space="preserve">Specification</w:t>
+            </w:r>
+          </w:p>
+        </w:tc>
+      </w:tr>
+      <w:tr>
+        <w:tc>
+          <w:tcPr>
+            <w:tcBorders>
+              <w:top w:val="single" w:color="CCCCCC" w:sz="1"/>
+              <w:left w:val="nil"/>
+              <w:bottom w:val="single" w:color="CCCCCC" w:sz="1"/>
+              <w:right w:val="nil"/>
+            </w:tcBorders>
+            <w:shd w:fill="FFFFFF" w:val="clear"/>
+            <w:tcMar>
+              <w:top w:type="dxa" w:w="100"/>
+              <w:left w:type="dxa" w:w="160"/>
+              <w:bottom w:type="dxa" w:w="100"/>
+              <w:right w:type="dxa" w:w="160"/>
+            </w:tcMar>
+          </w:tcPr>
+          <w:p>
+            <w:r>
+              <w:rPr>
+                <w:rFonts w:ascii="Arial" w:cs="Arial" w:eastAsia="Arial" w:hAnsi="Arial"/>
+                <w:b w:val="false"/>
+                <w:bCs w:val="false"/>
+                <w:color w:val="222222"/>
+                <w:sz w:val="20"/>
+                <w:szCs w:val="20"/>
+              </w:rPr>
+              <w:t xml:space="preserve">Headline value</w:t>
+            </w:r>
+          </w:p>
+        </w:tc>
+        <w:tc>
+          <w:tcPr>
+            <w:tcBorders>
+              <w:top w:val="single" w:color="CCCCCC" w:sz="1"/>
+              <w:left w:val="nil"/>
+              <w:bottom w:val="single" w:color="CCCCCC" w:sz="1"/>
+              <w:right w:val="nil"/>
+            </w:tcBorders>
+            <w:shd w:fill="FFFFFF" w:val="clear"/>
+            <w:tcMar>
+              <w:top w:type="dxa" w:w="100"/>
+              <w:left w:type="dxa" w:w="160"/>
+              <w:bottom w:type="dxa" w:w="100"/>
+              <w:right w:type="dxa" w:w="160"/>
+            </w:tcMar>
+          </w:tcPr>
+          <w:p>
+            <w:r>
+              <w:rPr>
+                <w:rFonts w:ascii="Arial" w:cs="Arial" w:eastAsia="Arial" w:hAnsi="Arial"/>
+                <w:b w:val="false"/>
+                <w:bCs w:val="false"/>
+                <w:color w:val="222222"/>
+                <w:sz w:val="20"/>
+                <w:szCs w:val="20"/>
+              </w:rPr>
+              <w:t xml:space="preserve">Strict done % (e.g. '52%')</w:t>
+            </w:r>
+          </w:p>
+        </w:tc>
+      </w:tr>
+      <w:tr>
+        <w:tc>
+          <w:tcPr>
+            <w:tcBorders>
+              <w:top w:val="single" w:color="CCCCCC" w:sz="1"/>
+              <w:left w:val="nil"/>
+              <w:bottom w:val="single" w:color="CCCCCC" w:sz="1"/>
+              <w:right w:val="nil"/>
+            </w:tcBorders>
+            <w:shd w:fill="F8F8F8" w:val="clear"/>
+            <w:tcMar>
+              <w:top w:type="dxa" w:w="100"/>
+              <w:left w:type="dxa" w:w="160"/>
+              <w:bottom w:type="dxa" w:w="100"/>
+              <w:right w:type="dxa" w:w="160"/>
+            </w:tcMar>
+          </w:tcPr>
+          <w:p>
+            <w:r>
+              <w:rPr>
+                <w:rFonts w:ascii="Arial" w:cs="Arial" w:eastAsia="Arial" w:hAnsi="Arial"/>
+                <w:b w:val="false"/>
+                <w:bCs w:val="false"/>
+                <w:color w:val="222222"/>
+                <w:sz w:val="20"/>
+                <w:szCs w:val="20"/>
+              </w:rPr>
+              <w:t xml:space="preserve">Subtitle</w:t>
+            </w:r>
+          </w:p>
+        </w:tc>
+        <w:tc>
+          <w:tcPr>
+            <w:tcBorders>
+              <w:top w:val="single" w:color="CCCCCC" w:sz="1"/>
+              <w:left w:val="nil"/>
+              <w:bottom w:val="single" w:color="CCCCCC" w:sz="1"/>
+              <w:right w:val="nil"/>
+            </w:tcBorders>
+            <w:shd w:fill="F8F8F8" w:val="clear"/>
+            <w:tcMar>
+              <w:top w:type="dxa" w:w="100"/>
+              <w:left w:type="dxa" w:w="160"/>
+              <w:bottom w:type="dxa" w:w="100"/>
+              <w:right w:type="dxa" w:w="160"/>
+            </w:tcMar>
+          </w:tcPr>
+          <w:p>
+            <w:r>
+              <w:rPr>
+                <w:rFonts w:ascii="Arial" w:cs="Arial" w:eastAsia="Arial" w:hAnsi="Arial"/>
+                <w:b w:val="false"/>
+                <w:bCs w:val="false"/>
+                <w:color w:val="222222"/>
+                <w:sz w:val="20"/>
+                <w:szCs w:val="20"/>
+              </w:rPr>
+              <w:t xml:space="preserve">Blocks marked done (strict, not partial) this period</w:t>
+            </w:r>
+          </w:p>
+        </w:tc>
+      </w:tr>
+      <w:tr>
+        <w:tc>
+          <w:tcPr>
+            <w:tcBorders>
+              <w:top w:val="single" w:color="CCCCCC" w:sz="1"/>
+              <w:left w:val="nil"/>
+              <w:bottom w:val="single" w:color="CCCCCC" w:sz="1"/>
+              <w:right w:val="nil"/>
+            </w:tcBorders>
+            <w:shd w:fill="FFFFFF" w:val="clear"/>
+            <w:tcMar>
+              <w:top w:type="dxa" w:w="100"/>
+              <w:left w:type="dxa" w:w="160"/>
+              <w:bottom w:type="dxa" w:w="100"/>
+              <w:right w:type="dxa" w:w="160"/>
+            </w:tcMar>
+          </w:tcPr>
+          <w:p>
+            <w:r>
+              <w:rPr>
+                <w:rFonts w:ascii="Arial" w:cs="Arial" w:eastAsia="Arial" w:hAnsi="Arial"/>
+                <w:b w:val="false"/>
+                <w:bCs w:val="false"/>
+                <w:color w:val="222222"/>
+                <w:sz w:val="20"/>
+                <w:szCs w:val="20"/>
+              </w:rPr>
+              <w:t xml:space="preserve">Preview chart type</w:t>
+            </w:r>
+          </w:p>
+        </w:tc>
+        <w:tc>
+          <w:tcPr>
+            <w:tcBorders>
+              <w:top w:val="single" w:color="CCCCCC" w:sz="1"/>
+              <w:left w:val="nil"/>
+              <w:bottom w:val="single" w:color="CCCCCC" w:sz="1"/>
+              <w:right w:val="nil"/>
+            </w:tcBorders>
+            <w:shd w:fill="FFFFFF" w:val="clear"/>
+            <w:tcMar>
+              <w:top w:type="dxa" w:w="100"/>
+              <w:left w:type="dxa" w:w="160"/>
+              <w:bottom w:type="dxa" w:w="100"/>
+              <w:right w:type="dxa" w:w="160"/>
+            </w:tcMar>
+          </w:tcPr>
+          <w:p>
+            <w:r>
+              <w:rPr>
+                <w:rFonts w:ascii="Arial" w:cs="Arial" w:eastAsia="Arial" w:hAnsi="Arial"/>
+                <w:b w:val="false"/>
+                <w:bCs w:val="false"/>
+                <w:color w:val="222222"/>
+                <w:sz w:val="20"/>
+                <w:szCs w:val="20"/>
+              </w:rPr>
+              <w:t xml:space="preserve">Mini line chart — done% per week, last 4 weeks</w:t>
+            </w:r>
+          </w:p>
+        </w:tc>
+      </w:tr>
+      <w:tr>
+        <w:tc>
+          <w:tcPr>
+            <w:tcBorders>
+              <w:top w:val="single" w:color="CCCCCC" w:sz="1"/>
+              <w:left w:val="nil"/>
+              <w:bottom w:val="single" w:color="CCCCCC" w:sz="1"/>
+              <w:right w:val="nil"/>
+            </w:tcBorders>
+            <w:shd w:fill="F8F8F8" w:val="clear"/>
+            <w:tcMar>
+              <w:top w:type="dxa" w:w="100"/>
+              <w:left w:type="dxa" w:w="160"/>
+              <w:bottom w:type="dxa" w:w="100"/>
+              <w:right w:type="dxa" w:w="160"/>
+            </w:tcMar>
+          </w:tcPr>
+          <w:p>
+            <w:r>
+              <w:rPr>
+                <w:rFonts w:ascii="Arial" w:cs="Arial" w:eastAsia="Arial" w:hAnsi="Arial"/>
+                <w:b w:val="false"/>
+                <w:bCs w:val="false"/>
+                <w:color w:val="222222"/>
+                <w:sz w:val="20"/>
+                <w:szCs w:val="20"/>
+              </w:rPr>
+              <w:t xml:space="preserve">Line colour</w:t>
+            </w:r>
+          </w:p>
+        </w:tc>
+        <w:tc>
+          <w:tcPr>
+            <w:tcBorders>
+              <w:top w:val="single" w:color="CCCCCC" w:sz="1"/>
+              <w:left w:val="nil"/>
+              <w:bottom w:val="single" w:color="CCCCCC" w:sz="1"/>
+              <w:right w:val="nil"/>
+            </w:tcBorders>
+            <w:shd w:fill="F8F8F8" w:val="clear"/>
+            <w:tcMar>
+              <w:top w:type="dxa" w:w="100"/>
+              <w:left w:type="dxa" w:w="160"/>
+              <w:bottom w:type="dxa" w:w="100"/>
+              <w:right w:type="dxa" w:w="160"/>
+            </w:tcMar>
+          </w:tcPr>
+          <w:p>
+            <w:r>
+              <w:rPr>
+                <w:rFonts w:ascii="Arial" w:cs="Arial" w:eastAsia="Arial" w:hAnsi="Arial"/>
+                <w:b w:val="false"/>
+                <w:bCs w:val="false"/>
+                <w:color w:val="222222"/>
+                <w:sz w:val="20"/>
+                <w:szCs w:val="20"/>
+              </w:rPr>
+              <w:t xml:space="preserve">Teal if trending up, amber if flat/down</w:t>
+            </w:r>
+          </w:p>
+        </w:tc>
+      </w:tr>
+      <w:tr>
+        <w:tc>
+          <w:tcPr>
+            <w:tcBorders>
+              <w:top w:val="single" w:color="CCCCCC" w:sz="1"/>
+              <w:left w:val="nil"/>
+              <w:bottom w:val="single" w:color="CCCCCC" w:sz="1"/>
+              <w:right w:val="nil"/>
+            </w:tcBorders>
+            <w:shd w:fill="FFFFFF" w:val="clear"/>
+            <w:tcMar>
+              <w:top w:type="dxa" w:w="100"/>
+              <w:left w:type="dxa" w:w="160"/>
+              <w:bottom w:type="dxa" w:w="100"/>
+              <w:right w:type="dxa" w:w="160"/>
+            </w:tcMar>
+          </w:tcPr>
+          <w:p>
+            <w:r>
+              <w:rPr>
+                <w:rFonts w:ascii="Arial" w:cs="Arial" w:eastAsia="Arial" w:hAnsi="Arial"/>
+                <w:b w:val="false"/>
+                <w:bCs w:val="false"/>
+                <w:color w:val="222222"/>
+                <w:sz w:val="20"/>
+                <w:szCs w:val="20"/>
+              </w:rPr>
+              <w:t xml:space="preserve">Status tag logic</w:t>
+            </w:r>
+          </w:p>
+        </w:tc>
+        <w:tc>
+          <w:tcPr>
+            <w:tcBorders>
+              <w:top w:val="single" w:color="CCCCCC" w:sz="1"/>
+              <w:left w:val="nil"/>
+              <w:bottom w:val="single" w:color="CCCCCC" w:sz="1"/>
+              <w:right w:val="nil"/>
+            </w:tcBorders>
+            <w:shd w:fill="FFFFFF" w:val="clear"/>
+            <w:tcMar>
+              <w:top w:type="dxa" w:w="100"/>
+              <w:left w:type="dxa" w:w="160"/>
+              <w:bottom w:type="dxa" w:w="100"/>
+              <w:right w:type="dxa" w:w="160"/>
+            </w:tcMar>
+          </w:tcPr>
+          <w:p>
+            <w:r>
+              <w:rPr>
+                <w:rFonts w:ascii="Arial" w:cs="Arial" w:eastAsia="Arial" w:hAnsi="Arial"/>
+                <w:b w:val="false"/>
+                <w:bCs w:val="false"/>
+                <w:color w:val="222222"/>
+                <w:sz w:val="20"/>
+                <w:szCs w:val="20"/>
+              </w:rPr>
+              <w:t xml:space="preserve">Green ≥ 70%, amber 50–69%, red &lt; 50%</w:t>
+            </w:r>
+          </w:p>
+        </w:tc>
+      </w:tr>
+    </w:tbl>
+    <w:p>
+      <w:pPr>
+        <w:spacing w:before="0" w:after="0"/>
+      </w:pPr>
+      <w:r>
+        <w:rPr>
+          <w:sz w:val="22"/>
+          <w:szCs w:val="22"/>
+        </w:rPr>
+        <w:t xml:space="preserve"/>
+      </w:r>
+    </w:p>
+    <w:p>
+      <w:pPr>
+        <w:spacing w:before="60" w:after="80"/>
+      </w:pPr>
+      <w:r>
+        <w:rPr>
+          <w:rFonts w:ascii="Arial" w:cs="Arial" w:eastAsia="Arial" w:hAnsi="Arial"/>
+          <w:color w:val="222222"/>
+          <w:sz w:val="22"/>
+          <w:szCs w:val="22"/>
+        </w:rPr>
+        <w:t xml:space="preserve">Intent accuracy is the strictest metric in the tracker. Unlike completion rate (which counts partial as a partial win), intent accuracy only counts blocks where you declared an intent and finished it fully. A rising intent accuracy line over several weeks means your scoping skill is improving — you are getting better at declaring what you can actually finish in a session.</w:t>
+      </w:r>
+    </w:p>
+    <w:p>
+      <w:pPr>
+        <w:spacing w:before="60" w:after="80"/>
+      </w:pPr>
+      <w:r>
+        <w:rPr>
+          <w:rFonts w:ascii="Arial" w:cs="Arial" w:eastAsia="Arial" w:hAnsi="Arial"/>
+          <w:color w:val="222222"/>
+          <w:sz w:val="22"/>
+          <w:szCs w:val="22"/>
+        </w:rPr>
+        <w:t xml:space="preserve">Drilldown chart: line chart. X-axis = weeks. Y-axis = done%. The chart includes a dashed horizontal reference line at 70% (the target threshold). When the line crosses above it, the chart tints the area teal.</w:t>
+      </w:r>
+    </w:p>
+    <w:p>
+      <w:pPr>
+        <w:spacing w:before="60" w:after="80"/>
+      </w:pPr>
+      <w:r>
+        <w:rPr>
+          <w:rFonts w:ascii="Arial" w:cs="Arial" w:eastAsia="Arial" w:hAnsi="Arial"/>
+          <w:color w:val="222222"/>
+          <w:sz w:val="22"/>
+          <w:szCs w:val="22"/>
+        </w:rPr>
+        <w:t xml:space="preserve">Drilldown insight: 'Your accuracy was highest in week [N] — that week you had shorter blocks with very specific intents. Try keeping intents under 80 characters.'</w:t>
+      </w:r>
+    </w:p>
+    <w:p>
+      <w:pPr>
+        <w:spacing w:before="0" w:after="0"/>
+      </w:pPr>
+      <w:r>
+        <w:rPr>
+          <w:sz w:val="22"/>
+          <w:szCs w:val="22"/>
+        </w:rPr>
+        <w:t xml:space="preserve"/>
+      </w:r>
+    </w:p>
+    <w:p>
+      <w:pPr>
+        <w:pStyle w:val="Heading2"/>
+        <w:spacing w:before="280" w:after="100"/>
+      </w:pPr>
+      <w:r>
+        <w:rPr>
+          <w:rFonts w:ascii="Arial" w:cs="Arial" w:eastAsia="Arial" w:hAnsi="Arial"/>
+          <w:b/>
+          <w:bCs/>
+          <w:color w:val="111111"/>
+          <w:sz w:val="26"/>
+          <w:szCs w:val="26"/>
+        </w:rPr>
+        <w:t xml:space="preserve">9.3  Drilldown interaction pattern</w:t>
+      </w:r>
+    </w:p>
+    <w:p>
+      <w:pPr>
+        <w:spacing w:before="60" w:after="80"/>
+      </w:pPr>
+      <w:r>
+        <w:rPr>
+          <w:rFonts w:ascii="Arial" w:cs="Arial" w:eastAsia="Arial" w:hAnsi="Arial"/>
+          <w:color w:val="222222"/>
+          <w:sz w:val="22"/>
+          <w:szCs w:val="22"/>
+        </w:rPr>
+        <w:t xml:space="preserve">The drilldown opens inline — it inserts a panel directly below the tapped card. No navigation away from the Insights tab, no modal overlay. The panel is closeable with a close button. Only one drilldown is open at a time (opening a second one closes the first).</w:t>
+      </w:r>
+    </w:p>
+    <w:p>
+      <w:pPr>
+        <w:spacing w:before="60" w:after="80"/>
+      </w:pPr>
+      <w:r>
+        <w:rPr>
+          <w:rFonts w:ascii="Arial" w:cs="Arial" w:eastAsia="Arial" w:hAnsi="Arial"/>
+          <w:color w:val="222222"/>
+          <w:sz w:val="22"/>
+          <w:szCs w:val="22"/>
+        </w:rPr>
+        <w:t xml:space="preserve">Each drilldown contains:</w:t>
+      </w:r>
+    </w:p>
+    <w:p>
+      <w:pPr>
+        <w:pStyle w:val="ListParagraph"/>
+        <w:numPr>
+          <w:ilvl w:val="0"/>
+          <w:numId w:val="2"/>
+        </w:numPr>
+        <w:spacing w:before="40" w:after="40"/>
+      </w:pPr>
+      <w:r>
+        <w:rPr>
+          <w:rFonts w:ascii="Arial" w:cs="Arial" w:eastAsia="Arial" w:hAnsi="Arial"/>
+          <w:color w:val="222222"/>
+          <w:sz w:val="22"/>
+          <w:szCs w:val="22"/>
+        </w:rPr>
+        <w:t xml:space="preserve">Chart type label and data description in small gray text — so you always know what you're looking at</w:t>
+      </w:r>
+    </w:p>
+    <w:p>
+      <w:pPr>
+        <w:pStyle w:val="ListParagraph"/>
+        <w:numPr>
+          <w:ilvl w:val="0"/>
+          <w:numId w:val="2"/>
+        </w:numPr>
+        <w:spacing w:before="40" w:after="40"/>
+      </w:pPr>
+      <w:r>
+        <w:rPr>
+          <w:rFonts w:ascii="Arial" w:cs="Arial" w:eastAsia="Arial" w:hAnsi="Arial"/>
+          <w:color w:val="222222"/>
+          <w:sz w:val="22"/>
+          <w:szCs w:val="22"/>
+        </w:rPr>
+        <w:t xml:space="preserve">A row of 3–4 stat mini-cards (small numbers with labels)</w:t>
+      </w:r>
+    </w:p>
+    <w:p>
+      <w:pPr>
+        <w:pStyle w:val="ListParagraph"/>
+        <w:numPr>
+          <w:ilvl w:val="0"/>
+          <w:numId w:val="2"/>
+        </w:numPr>
+        <w:spacing w:before="40" w:after="40"/>
+      </w:pPr>
+      <w:r>
+        <w:rPr>
+          <w:rFonts w:ascii="Arial" w:cs="Arial" w:eastAsia="Arial" w:hAnsi="Arial"/>
+          <w:color w:val="222222"/>
+          <w:sz w:val="22"/>
+          <w:szCs w:val="22"/>
+        </w:rPr>
+        <w:t xml:space="preserve">The full-size chart</w:t>
+      </w:r>
+    </w:p>
+    <w:p>
+      <w:pPr>
+        <w:pStyle w:val="ListParagraph"/>
+        <w:numPr>
+          <w:ilvl w:val="0"/>
+          <w:numId w:val="2"/>
+        </w:numPr>
+        <w:spacing w:before="40" w:after="40"/>
+      </w:pPr>
+      <w:r>
+        <w:rPr>
+          <w:rFonts w:ascii="Arial" w:cs="Arial" w:eastAsia="Arial" w:hAnsi="Arial"/>
+          <w:color w:val="222222"/>
+          <w:sz w:val="22"/>
+          <w:szCs w:val="22"/>
+        </w:rPr>
+        <w:t xml:space="preserve">A plain-language interpretation paragraph in gray text below the chart</w:t>
+      </w:r>
+    </w:p>
+    <w:p>
+      <w:pPr>
+        <w:spacing w:before="0" w:after="0"/>
+      </w:pPr>
+      <w:r>
+        <w:rPr>
+          <w:sz w:val="22"/>
+          <w:szCs w:val="22"/>
+        </w:rPr>
+        <w:t xml:space="preserve"/>
+      </w:r>
+    </w:p>
+    <w:p>
+      <w:pPr>
+        <w:pStyle w:val="Heading2"/>
+        <w:spacing w:before="280" w:after="100"/>
+      </w:pPr>
+      <w:r>
+        <w:rPr>
+          <w:rFonts w:ascii="Arial" w:cs="Arial" w:eastAsia="Arial" w:hAnsi="Arial"/>
+          <w:b/>
+          <w:bCs/>
+          <w:color w:val="111111"/>
+          <w:sz w:val="26"/>
+          <w:szCs w:val="26"/>
+        </w:rPr>
+        <w:t xml:space="preserve">9.4  Implementation notes</w:t>
+      </w:r>
+    </w:p>
+    <w:p>
+      <w:pPr>
+        <w:spacing w:before="60" w:after="80"/>
+      </w:pPr>
+      <w:r>
+        <w:rPr>
+          <w:rFonts w:ascii="Arial" w:cs="Arial" w:eastAsia="Arial" w:hAnsi="Arial"/>
+          <w:color w:val="222222"/>
+          <w:sz w:val="22"/>
+          <w:szCs w:val="22"/>
+        </w:rPr>
+        <w:t xml:space="preserve">All charts use Chart.js (already loaded in the app via CDN in index.html). No new dependencies.</w:t>
+      </w:r>
+    </w:p>
+    <w:tbl>
+      <w:tblPr>
+        <w:tblW w:type="dxa" w:w="9360"/>
+        <w:tblBorders>
+          <w:top w:val="single" w:color="auto" w:sz="4"/>
+          <w:left w:val="single" w:color="auto" w:sz="4"/>
+          <w:bottom w:val="single" w:color="auto" w:sz="4"/>
+          <w:right w:val="single" w:color="auto" w:sz="4"/>
+          <w:insideH w:val="single" w:color="auto" w:sz="4"/>
+          <w:insideV w:val="single" w:color="auto" w:sz="4"/>
+        </w:tblBorders>
+      </w:tblPr>
+      <w:tblGrid>
+        <w:gridCol w:w="2800"/>
+        <w:gridCol w:w="6560"/>
+      </w:tblGrid>
+      <w:tr>
+        <w:tc>
+          <w:tcPr>
+            <w:tcBorders>
+              <w:top w:val="single" w:color="10513C" w:sz="4"/>
+              <w:left w:val="nil"/>
+              <w:bottom w:val="single" w:color="10513C" w:sz="4"/>
+              <w:right w:val="nil"/>
+            </w:tcBorders>
+            <w:shd w:fill="10513C" w:val="clear"/>
+            <w:tcMar>
+              <w:top w:type="dxa" w:w="100"/>
+              <w:left w:type="dxa" w:w="160"/>
+              <w:bottom w:type="dxa" w:w="100"/>
+              <w:right w:type="dxa" w:w="160"/>
+            </w:tcMar>
+          </w:tcPr>
+          <w:p>
+            <w:r>
+              <w:rPr>
+                <w:rFonts w:ascii="Arial" w:cs="Arial" w:eastAsia="Arial" w:hAnsi="Arial"/>
+                <w:b/>
+                <w:bCs/>
+                <w:color w:val="FFFFFF"/>
+                <w:sz w:val="20"/>
+                <w:szCs w:val="20"/>
+              </w:rPr>
+              <w:t xml:space="preserve">Chart</w:t>
+            </w:r>
+          </w:p>
+        </w:tc>
+        <w:tc>
+          <w:tcPr>
+            <w:tcBorders>
+              <w:top w:val="single" w:color="10513C" w:sz="4"/>
+              <w:left w:val="nil"/>
+              <w:bottom w:val="single" w:color="10513C" w:sz="4"/>
+              <w:right w:val="nil"/>
+            </w:tcBorders>
+            <w:shd w:fill="10513C" w:val="clear"/>
+            <w:tcMar>
+              <w:top w:type="dxa" w:w="100"/>
+              <w:left w:type="dxa" w:w="160"/>
+              <w:bottom w:type="dxa" w:w="100"/>
+              <w:right w:type="dxa" w:w="160"/>
+            </w:tcMar>
+          </w:tcPr>
+          <w:p>
+            <w:r>
+              <w:rPr>
+                <w:rFonts w:ascii="Arial" w:cs="Arial" w:eastAsia="Arial" w:hAnsi="Arial"/>
+                <w:b/>
+                <w:bCs/>
+                <w:color w:val="FFFFFF"/>
+                <w:sz w:val="20"/>
+                <w:szCs w:val="20"/>
+              </w:rPr>
+              <w:t xml:space="preserve">Chart.js type</w:t>
+            </w:r>
+          </w:p>
+        </w:tc>
+      </w:tr>
+      <w:tr>
+        <w:tc>
+          <w:tcPr>
+            <w:tcBorders>
+              <w:top w:val="single" w:color="CCCCCC" w:sz="1"/>
+              <w:left w:val="nil"/>
+              <w:bottom w:val="single" w:color="CCCCCC" w:sz="1"/>
+              <w:right w:val="nil"/>
+            </w:tcBorders>
+            <w:shd w:fill="FFFFFF" w:val="clear"/>
+            <w:tcMar>
+              <w:top w:type="dxa" w:w="100"/>
+              <w:left w:type="dxa" w:w="160"/>
+              <w:bottom w:type="dxa" w:w="100"/>
+              <w:right w:type="dxa" w:w="160"/>
+            </w:tcMar>
+          </w:tcPr>
+          <w:p>
+            <w:r>
+              <w:rPr>
+                <w:rFonts w:ascii="Arial" w:cs="Arial" w:eastAsia="Arial" w:hAnsi="Arial"/>
+                <w:b w:val="false"/>
+                <w:bCs w:val="false"/>
+                <w:color w:val="222222"/>
+                <w:sz w:val="20"/>
+                <w:szCs w:val="20"/>
+              </w:rPr>
+              <w:t xml:space="preserve">Weekly momentum preview</w:t>
+            </w:r>
+          </w:p>
+        </w:tc>
+        <w:tc>
+          <w:tcPr>
+            <w:tcBorders>
+              <w:top w:val="single" w:color="CCCCCC" w:sz="1"/>
+              <w:left w:val="nil"/>
+              <w:bottom w:val="single" w:color="CCCCCC" w:sz="1"/>
+              <w:right w:val="nil"/>
+            </w:tcBorders>
+            <w:shd w:fill="FFFFFF" w:val="clear"/>
+            <w:tcMar>
+              <w:top w:type="dxa" w:w="100"/>
+              <w:left w:type="dxa" w:w="160"/>
+              <w:bottom w:type="dxa" w:w="100"/>
+              <w:right w:type="dxa" w:w="160"/>
+            </w:tcMar>
+          </w:tcPr>
+          <w:p>
+            <w:r>
+              <w:rPr>
+                <w:rFonts w:ascii="Arial" w:cs="Arial" w:eastAsia="Arial" w:hAnsi="Arial"/>
+                <w:b w:val="false"/>
+                <w:bCs w:val="false"/>
+                <w:color w:val="222222"/>
+                <w:sz w:val="20"/>
+                <w:szCs w:val="20"/>
+              </w:rPr>
+              <w:t xml:space="preserve">bar (type: 'bar')</w:t>
+            </w:r>
+          </w:p>
+        </w:tc>
+      </w:tr>
+      <w:tr>
+        <w:tc>
+          <w:tcPr>
+            <w:tcBorders>
+              <w:top w:val="single" w:color="CCCCCC" w:sz="1"/>
+              <w:left w:val="nil"/>
+              <w:bottom w:val="single" w:color="CCCCCC" w:sz="1"/>
+              <w:right w:val="nil"/>
+            </w:tcBorders>
+            <w:shd w:fill="F8F8F8" w:val="clear"/>
+            <w:tcMar>
+              <w:top w:type="dxa" w:w="100"/>
+              <w:left w:type="dxa" w:w="160"/>
+              <w:bottom w:type="dxa" w:w="100"/>
+              <w:right w:type="dxa" w:w="160"/>
+            </w:tcMar>
+          </w:tcPr>
+          <w:p>
+            <w:r>
+              <w:rPr>
+                <w:rFonts w:ascii="Arial" w:cs="Arial" w:eastAsia="Arial" w:hAnsi="Arial"/>
+                <w:b w:val="false"/>
+                <w:bCs w:val="false"/>
+                <w:color w:val="222222"/>
+                <w:sz w:val="20"/>
+                <w:szCs w:val="20"/>
+              </w:rPr>
+              <w:t xml:space="preserve">Weekly momentum drilldown</w:t>
+            </w:r>
+          </w:p>
+        </w:tc>
+        <w:tc>
+          <w:tcPr>
+            <w:tcBorders>
+              <w:top w:val="single" w:color="CCCCCC" w:sz="1"/>
+              <w:left w:val="nil"/>
+              <w:bottom w:val="single" w:color="CCCCCC" w:sz="1"/>
+              <w:right w:val="nil"/>
+            </w:tcBorders>
+            <w:shd w:fill="F8F8F8" w:val="clear"/>
+            <w:tcMar>
+              <w:top w:type="dxa" w:w="100"/>
+              <w:left w:type="dxa" w:w="160"/>
+              <w:bottom w:type="dxa" w:w="100"/>
+              <w:right w:type="dxa" w:w="160"/>
+            </w:tcMar>
+          </w:tcPr>
+          <w:p>
+            <w:r>
+              <w:rPr>
+                <w:rFonts w:ascii="Arial" w:cs="Arial" w:eastAsia="Arial" w:hAnsi="Arial"/>
+                <w:b w:val="false"/>
+                <w:bCs w:val="false"/>
+                <w:color w:val="222222"/>
+                <w:sz w:val="20"/>
+                <w:szCs w:val="20"/>
+              </w:rPr>
+              <w:t xml:space="preserve">bar (stacked: true, three datasets)</w:t>
+            </w:r>
+          </w:p>
+        </w:tc>
+      </w:tr>
+      <w:tr>
+        <w:tc>
+          <w:tcPr>
+            <w:tcBorders>
+              <w:top w:val="single" w:color="CCCCCC" w:sz="1"/>
+              <w:left w:val="nil"/>
+              <w:bottom w:val="single" w:color="CCCCCC" w:sz="1"/>
+              <w:right w:val="nil"/>
+            </w:tcBorders>
+            <w:shd w:fill="FFFFFF" w:val="clear"/>
+            <w:tcMar>
+              <w:top w:type="dxa" w:w="100"/>
+              <w:left w:type="dxa" w:w="160"/>
+              <w:bottom w:type="dxa" w:w="100"/>
+              <w:right w:type="dxa" w:w="160"/>
+            </w:tcMar>
+          </w:tcPr>
+          <w:p>
+            <w:r>
+              <w:rPr>
+                <w:rFonts w:ascii="Arial" w:cs="Arial" w:eastAsia="Arial" w:hAnsi="Arial"/>
+                <w:b w:val="false"/>
+                <w:bCs w:val="false"/>
+                <w:color w:val="222222"/>
+                <w:sz w:val="20"/>
+                <w:szCs w:val="20"/>
+              </w:rPr>
+              <w:t xml:space="preserve">Completion rate preview</w:t>
+            </w:r>
+          </w:p>
+        </w:tc>
+        <w:tc>
+          <w:tcPr>
+            <w:tcBorders>
+              <w:top w:val="single" w:color="CCCCCC" w:sz="1"/>
+              <w:left w:val="nil"/>
+              <w:bottom w:val="single" w:color="CCCCCC" w:sz="1"/>
+              <w:right w:val="nil"/>
+            </w:tcBorders>
+            <w:shd w:fill="FFFFFF" w:val="clear"/>
+            <w:tcMar>
+              <w:top w:type="dxa" w:w="100"/>
+              <w:left w:type="dxa" w:w="160"/>
+              <w:bottom w:type="dxa" w:w="100"/>
+              <w:right w:type="dxa" w:w="160"/>
+            </w:tcMar>
+          </w:tcPr>
+          <w:p>
+            <w:r>
+              <w:rPr>
+                <w:rFonts w:ascii="Arial" w:cs="Arial" w:eastAsia="Arial" w:hAnsi="Arial"/>
+                <w:b w:val="false"/>
+                <w:bCs w:val="false"/>
+                <w:color w:val="222222"/>
+                <w:sz w:val="20"/>
+                <w:szCs w:val="20"/>
+              </w:rPr>
+              <w:t xml:space="preserve">bar (coloured per value)</w:t>
+            </w:r>
+          </w:p>
+        </w:tc>
+      </w:tr>
+      <w:tr>
+        <w:tc>
+          <w:tcPr>
+            <w:tcBorders>
+              <w:top w:val="single" w:color="CCCCCC" w:sz="1"/>
+              <w:left w:val="nil"/>
+              <w:bottom w:val="single" w:color="CCCCCC" w:sz="1"/>
+              <w:right w:val="nil"/>
+            </w:tcBorders>
+            <w:shd w:fill="F8F8F8" w:val="clear"/>
+            <w:tcMar>
+              <w:top w:type="dxa" w:w="100"/>
+              <w:left w:type="dxa" w:w="160"/>
+              <w:bottom w:type="dxa" w:w="100"/>
+              <w:right w:type="dxa" w:w="160"/>
+            </w:tcMar>
+          </w:tcPr>
+          <w:p>
+            <w:r>
+              <w:rPr>
+                <w:rFonts w:ascii="Arial" w:cs="Arial" w:eastAsia="Arial" w:hAnsi="Arial"/>
+                <w:b w:val="false"/>
+                <w:bCs w:val="false"/>
+                <w:color w:val="222222"/>
+                <w:sz w:val="20"/>
+                <w:szCs w:val="20"/>
+              </w:rPr>
+              <w:t xml:space="preserve">Completion rate drilldown</w:t>
+            </w:r>
+          </w:p>
+        </w:tc>
+        <w:tc>
+          <w:tcPr>
+            <w:tcBorders>
+              <w:top w:val="single" w:color="CCCCCC" w:sz="1"/>
+              <w:left w:val="nil"/>
+              <w:bottom w:val="single" w:color="CCCCCC" w:sz="1"/>
+              <w:right w:val="nil"/>
+            </w:tcBorders>
+            <w:shd w:fill="F8F8F8" w:val="clear"/>
+            <w:tcMar>
+              <w:top w:type="dxa" w:w="100"/>
+              <w:left w:type="dxa" w:w="160"/>
+              <w:bottom w:type="dxa" w:w="100"/>
+              <w:right w:type="dxa" w:w="160"/>
+            </w:tcMar>
+          </w:tcPr>
+          <w:p>
+            <w:r>
+              <w:rPr>
+                <w:rFonts w:ascii="Arial" w:cs="Arial" w:eastAsia="Arial" w:hAnsi="Arial"/>
+                <w:b w:val="false"/>
+                <w:bCs w:val="false"/>
+                <w:color w:val="222222"/>
+                <w:sz w:val="20"/>
+                <w:szCs w:val="20"/>
+              </w:rPr>
+              <w:t xml:space="preserve">bar (indexAxis: 'y', stacked per category)</w:t>
+            </w:r>
+          </w:p>
+        </w:tc>
+      </w:tr>
+      <w:tr>
+        <w:tc>
+          <w:tcPr>
+            <w:tcBorders>
+              <w:top w:val="single" w:color="CCCCCC" w:sz="1"/>
+              <w:left w:val="nil"/>
+              <w:bottom w:val="single" w:color="CCCCCC" w:sz="1"/>
+              <w:right w:val="nil"/>
+            </w:tcBorders>
+            <w:shd w:fill="FFFFFF" w:val="clear"/>
+            <w:tcMar>
+              <w:top w:type="dxa" w:w="100"/>
+              <w:left w:type="dxa" w:w="160"/>
+              <w:bottom w:type="dxa" w:w="100"/>
+              <w:right w:type="dxa" w:w="160"/>
+            </w:tcMar>
+          </w:tcPr>
+          <w:p>
+            <w:r>
+              <w:rPr>
+                <w:rFonts w:ascii="Arial" w:cs="Arial" w:eastAsia="Arial" w:hAnsi="Arial"/>
+                <w:b w:val="false"/>
+                <w:bCs w:val="false"/>
+                <w:color w:val="222222"/>
+                <w:sz w:val="20"/>
+                <w:szCs w:val="20"/>
+              </w:rPr>
+              <w:t xml:space="preserve">Habit consistency preview</w:t>
+            </w:r>
+          </w:p>
+        </w:tc>
+        <w:tc>
+          <w:tcPr>
+            <w:tcBorders>
+              <w:top w:val="single" w:color="CCCCCC" w:sz="1"/>
+              <w:left w:val="nil"/>
+              <w:bottom w:val="single" w:color="CCCCCC" w:sz="1"/>
+              <w:right w:val="nil"/>
+            </w:tcBorders>
+            <w:shd w:fill="FFFFFF" w:val="clear"/>
+            <w:tcMar>
+              <w:top w:type="dxa" w:w="100"/>
+              <w:left w:type="dxa" w:w="160"/>
+              <w:bottom w:type="dxa" w:w="100"/>
+              <w:right w:type="dxa" w:w="160"/>
+            </w:tcMar>
+          </w:tcPr>
+          <w:p>
+            <w:r>
+              <w:rPr>
+                <w:rFonts w:ascii="Arial" w:cs="Arial" w:eastAsia="Arial" w:hAnsi="Arial"/>
+                <w:b w:val="false"/>
+                <w:bCs w:val="false"/>
+                <w:color w:val="222222"/>
+                <w:sz w:val="20"/>
+                <w:szCs w:val="20"/>
+              </w:rPr>
+              <w:t xml:space="preserve">HTML dot grid (no Chart.js needed)</w:t>
+            </w:r>
+          </w:p>
+        </w:tc>
+      </w:tr>
+      <w:tr>
+        <w:tc>
+          <w:tcPr>
+            <w:tcBorders>
+              <w:top w:val="single" w:color="CCCCCC" w:sz="1"/>
+              <w:left w:val="nil"/>
+              <w:bottom w:val="single" w:color="CCCCCC" w:sz="1"/>
+              <w:right w:val="nil"/>
+            </w:tcBorders>
+            <w:shd w:fill="F8F8F8" w:val="clear"/>
+            <w:tcMar>
+              <w:top w:type="dxa" w:w="100"/>
+              <w:left w:type="dxa" w:w="160"/>
+              <w:bottom w:type="dxa" w:w="100"/>
+              <w:right w:type="dxa" w:w="160"/>
+            </w:tcMar>
+          </w:tcPr>
+          <w:p>
+            <w:r>
+              <w:rPr>
+                <w:rFonts w:ascii="Arial" w:cs="Arial" w:eastAsia="Arial" w:hAnsi="Arial"/>
+                <w:b w:val="false"/>
+                <w:bCs w:val="false"/>
+                <w:color w:val="222222"/>
+                <w:sz w:val="20"/>
+                <w:szCs w:val="20"/>
+              </w:rPr>
+              <w:t xml:space="preserve">Habit consistency drilldown</w:t>
+            </w:r>
+          </w:p>
+        </w:tc>
+        <w:tc>
+          <w:tcPr>
+            <w:tcBorders>
+              <w:top w:val="single" w:color="CCCCCC" w:sz="1"/>
+              <w:left w:val="nil"/>
+              <w:bottom w:val="single" w:color="CCCCCC" w:sz="1"/>
+              <w:right w:val="nil"/>
+            </w:tcBorders>
+            <w:shd w:fill="F8F8F8" w:val="clear"/>
+            <w:tcMar>
+              <w:top w:type="dxa" w:w="100"/>
+              <w:left w:type="dxa" w:w="160"/>
+              <w:bottom w:type="dxa" w:w="100"/>
+              <w:right w:type="dxa" w:w="160"/>
+            </w:tcMar>
+          </w:tcPr>
+          <w:p>
+            <w:r>
+              <w:rPr>
+                <w:rFonts w:ascii="Arial" w:cs="Arial" w:eastAsia="Arial" w:hAnsi="Arial"/>
+                <w:b w:val="false"/>
+                <w:bCs w:val="false"/>
+                <w:color w:val="222222"/>
+                <w:sz w:val="20"/>
+                <w:szCs w:val="20"/>
+              </w:rPr>
+              <w:t xml:space="preserve">HTML dot grid per habit</w:t>
+            </w:r>
+          </w:p>
+        </w:tc>
+      </w:tr>
+      <w:tr>
+        <w:tc>
+          <w:tcPr>
+            <w:tcBorders>
+              <w:top w:val="single" w:color="CCCCCC" w:sz="1"/>
+              <w:left w:val="nil"/>
+              <w:bottom w:val="single" w:color="CCCCCC" w:sz="1"/>
+              <w:right w:val="nil"/>
+            </w:tcBorders>
+            <w:shd w:fill="FFFFFF" w:val="clear"/>
+            <w:tcMar>
+              <w:top w:type="dxa" w:w="100"/>
+              <w:left w:type="dxa" w:w="160"/>
+              <w:bottom w:type="dxa" w:w="100"/>
+              <w:right w:type="dxa" w:w="160"/>
+            </w:tcMar>
+          </w:tcPr>
+          <w:p>
+            <w:r>
+              <w:rPr>
+                <w:rFonts w:ascii="Arial" w:cs="Arial" w:eastAsia="Arial" w:hAnsi="Arial"/>
+                <w:b w:val="false"/>
+                <w:bCs w:val="false"/>
+                <w:color w:val="222222"/>
+                <w:sz w:val="20"/>
+                <w:szCs w:val="20"/>
+              </w:rPr>
+              <w:t xml:space="preserve">Tool effectiveness preview</w:t>
+            </w:r>
+          </w:p>
+        </w:tc>
+        <w:tc>
+          <w:tcPr>
+            <w:tcBorders>
+              <w:top w:val="single" w:color="CCCCCC" w:sz="1"/>
+              <w:left w:val="nil"/>
+              <w:bottom w:val="single" w:color="CCCCCC" w:sz="1"/>
+              <w:right w:val="nil"/>
+            </w:tcBorders>
+            <w:shd w:fill="FFFFFF" w:val="clear"/>
+            <w:tcMar>
+              <w:top w:type="dxa" w:w="100"/>
+              <w:left w:type="dxa" w:w="160"/>
+              <w:bottom w:type="dxa" w:w="100"/>
+              <w:right w:type="dxa" w:w="160"/>
+            </w:tcMar>
+          </w:tcPr>
+          <w:p>
+            <w:r>
+              <w:rPr>
+                <w:rFonts w:ascii="Arial" w:cs="Arial" w:eastAsia="Arial" w:hAnsi="Arial"/>
+                <w:b w:val="false"/>
+                <w:bCs w:val="false"/>
+                <w:color w:val="222222"/>
+                <w:sz w:val="20"/>
+                <w:szCs w:val="20"/>
+              </w:rPr>
+              <w:t xml:space="preserve">line (no axes)</w:t>
+            </w:r>
+          </w:p>
+        </w:tc>
+      </w:tr>
+      <w:tr>
+        <w:tc>
+          <w:tcPr>
+            <w:tcBorders>
+              <w:top w:val="single" w:color="CCCCCC" w:sz="1"/>
+              <w:left w:val="nil"/>
+              <w:bottom w:val="single" w:color="CCCCCC" w:sz="1"/>
+              <w:right w:val="nil"/>
+            </w:tcBorders>
+            <w:shd w:fill="F8F8F8" w:val="clear"/>
+            <w:tcMar>
+              <w:top w:type="dxa" w:w="100"/>
+              <w:left w:type="dxa" w:w="160"/>
+              <w:bottom w:type="dxa" w:w="100"/>
+              <w:right w:type="dxa" w:w="160"/>
+            </w:tcMar>
+          </w:tcPr>
+          <w:p>
+            <w:r>
+              <w:rPr>
+                <w:rFonts w:ascii="Arial" w:cs="Arial" w:eastAsia="Arial" w:hAnsi="Arial"/>
+                <w:b w:val="false"/>
+                <w:bCs w:val="false"/>
+                <w:color w:val="222222"/>
+                <w:sz w:val="20"/>
+                <w:szCs w:val="20"/>
+              </w:rPr>
+              <w:t xml:space="preserve">Tool effectiveness drilldown</w:t>
+            </w:r>
+          </w:p>
+        </w:tc>
+        <w:tc>
+          <w:tcPr>
+            <w:tcBorders>
+              <w:top w:val="single" w:color="CCCCCC" w:sz="1"/>
+              <w:left w:val="nil"/>
+              <w:bottom w:val="single" w:color="CCCCCC" w:sz="1"/>
+              <w:right w:val="nil"/>
+            </w:tcBorders>
+            <w:shd w:fill="F8F8F8" w:val="clear"/>
+            <w:tcMar>
+              <w:top w:type="dxa" w:w="100"/>
+              <w:left w:type="dxa" w:w="160"/>
+              <w:bottom w:type="dxa" w:w="100"/>
+              <w:right w:type="dxa" w:w="160"/>
+            </w:tcMar>
+          </w:tcPr>
+          <w:p>
+            <w:r>
+              <w:rPr>
+                <w:rFonts w:ascii="Arial" w:cs="Arial" w:eastAsia="Arial" w:hAnsi="Arial"/>
+                <w:b w:val="false"/>
+                <w:bCs w:val="false"/>
+                <w:color w:val="222222"/>
+                <w:sz w:val="20"/>
+                <w:szCs w:val="20"/>
+              </w:rPr>
+              <w:t xml:space="preserve">bubble (x=slot, y=completion, r=block count)</w:t>
+            </w:r>
+          </w:p>
+        </w:tc>
+      </w:tr>
+      <w:tr>
+        <w:tc>
+          <w:tcPr>
+            <w:tcBorders>
+              <w:top w:val="single" w:color="CCCCCC" w:sz="1"/>
+              <w:left w:val="nil"/>
+              <w:bottom w:val="single" w:color="CCCCCC" w:sz="1"/>
+              <w:right w:val="nil"/>
+            </w:tcBorders>
+            <w:shd w:fill="FFFFFF" w:val="clear"/>
+            <w:tcMar>
+              <w:top w:type="dxa" w:w="100"/>
+              <w:left w:type="dxa" w:w="160"/>
+              <w:bottom w:type="dxa" w:w="100"/>
+              <w:right w:type="dxa" w:w="160"/>
+            </w:tcMar>
+          </w:tcPr>
+          <w:p>
+            <w:r>
+              <w:rPr>
+                <w:rFonts w:ascii="Arial" w:cs="Arial" w:eastAsia="Arial" w:hAnsi="Arial"/>
+                <w:b w:val="false"/>
+                <w:bCs w:val="false"/>
+                <w:color w:val="222222"/>
+                <w:sz w:val="20"/>
+                <w:szCs w:val="20"/>
+              </w:rPr>
+              <w:t xml:space="preserve">Focus quality preview</w:t>
+            </w:r>
+          </w:p>
+        </w:tc>
+        <w:tc>
+          <w:tcPr>
+            <w:tcBorders>
+              <w:top w:val="single" w:color="CCCCCC" w:sz="1"/>
+              <w:left w:val="nil"/>
+              <w:bottom w:val="single" w:color="CCCCCC" w:sz="1"/>
+              <w:right w:val="nil"/>
+            </w:tcBorders>
+            <w:shd w:fill="FFFFFF" w:val="clear"/>
+            <w:tcMar>
+              <w:top w:type="dxa" w:w="100"/>
+              <w:left w:type="dxa" w:w="160"/>
+              <w:bottom w:type="dxa" w:w="100"/>
+              <w:right w:type="dxa" w:w="160"/>
+            </w:tcMar>
+          </w:tcPr>
+          <w:p>
+            <w:r>
+              <w:rPr>
+                <w:rFonts w:ascii="Arial" w:cs="Arial" w:eastAsia="Arial" w:hAnsi="Arial"/>
+                <w:b w:val="false"/>
+                <w:bCs w:val="false"/>
+                <w:color w:val="222222"/>
+                <w:sz w:val="20"/>
+                <w:szCs w:val="20"/>
+              </w:rPr>
+              <w:t xml:space="preserve">doughnut</w:t>
+            </w:r>
+          </w:p>
+        </w:tc>
+      </w:tr>
+      <w:tr>
+        <w:tc>
+          <w:tcPr>
+            <w:tcBorders>
+              <w:top w:val="single" w:color="CCCCCC" w:sz="1"/>
+              <w:left w:val="nil"/>
+              <w:bottom w:val="single" w:color="CCCCCC" w:sz="1"/>
+              <w:right w:val="nil"/>
+            </w:tcBorders>
+            <w:shd w:fill="F8F8F8" w:val="clear"/>
+            <w:tcMar>
+              <w:top w:type="dxa" w:w="100"/>
+              <w:left w:type="dxa" w:w="160"/>
+              <w:bottom w:type="dxa" w:w="100"/>
+              <w:right w:type="dxa" w:w="160"/>
+            </w:tcMar>
+          </w:tcPr>
+          <w:p>
+            <w:r>
+              <w:rPr>
+                <w:rFonts w:ascii="Arial" w:cs="Arial" w:eastAsia="Arial" w:hAnsi="Arial"/>
+                <w:b w:val="false"/>
+                <w:bCs w:val="false"/>
+                <w:color w:val="222222"/>
+                <w:sz w:val="20"/>
+                <w:szCs w:val="20"/>
+              </w:rPr>
+              <w:t xml:space="preserve">Focus quality drilldown</w:t>
+            </w:r>
+          </w:p>
+        </w:tc>
+        <w:tc>
+          <w:tcPr>
+            <w:tcBorders>
+              <w:top w:val="single" w:color="CCCCCC" w:sz="1"/>
+              <w:left w:val="nil"/>
+              <w:bottom w:val="single" w:color="CCCCCC" w:sz="1"/>
+              <w:right w:val="nil"/>
+            </w:tcBorders>
+            <w:shd w:fill="F8F8F8" w:val="clear"/>
+            <w:tcMar>
+              <w:top w:type="dxa" w:w="100"/>
+              <w:left w:type="dxa" w:w="160"/>
+              <w:bottom w:type="dxa" w:w="100"/>
+              <w:right w:type="dxa" w:w="160"/>
+            </w:tcMar>
+          </w:tcPr>
+          <w:p>
+            <w:r>
+              <w:rPr>
+                <w:rFonts w:ascii="Arial" w:cs="Arial" w:eastAsia="Arial" w:hAnsi="Arial"/>
+                <w:b w:val="false"/>
+                <w:bCs w:val="false"/>
+                <w:color w:val="222222"/>
+                <w:sz w:val="20"/>
+                <w:szCs w:val="20"/>
+              </w:rPr>
+              <w:t xml:space="preserve">line (stacked area, three datasets)</w:t>
+            </w:r>
+          </w:p>
+        </w:tc>
+      </w:tr>
+      <w:tr>
+        <w:tc>
+          <w:tcPr>
+            <w:tcBorders>
+              <w:top w:val="single" w:color="CCCCCC" w:sz="1"/>
+              <w:left w:val="nil"/>
+              <w:bottom w:val="single" w:color="CCCCCC" w:sz="1"/>
+              <w:right w:val="nil"/>
+            </w:tcBorders>
+            <w:shd w:fill="FFFFFF" w:val="clear"/>
+            <w:tcMar>
+              <w:top w:type="dxa" w:w="100"/>
+              <w:left w:type="dxa" w:w="160"/>
+              <w:bottom w:type="dxa" w:w="100"/>
+              <w:right w:type="dxa" w:w="160"/>
+            </w:tcMar>
+          </w:tcPr>
+          <w:p>
+            <w:r>
+              <w:rPr>
+                <w:rFonts w:ascii="Arial" w:cs="Arial" w:eastAsia="Arial" w:hAnsi="Arial"/>
+                <w:b w:val="false"/>
+                <w:bCs w:val="false"/>
+                <w:color w:val="222222"/>
+                <w:sz w:val="20"/>
+                <w:szCs w:val="20"/>
+              </w:rPr>
+              <w:t xml:space="preserve">Area distribution preview</w:t>
+            </w:r>
+          </w:p>
+        </w:tc>
+        <w:tc>
+          <w:tcPr>
+            <w:tcBorders>
+              <w:top w:val="single" w:color="CCCCCC" w:sz="1"/>
+              <w:left w:val="nil"/>
+              <w:bottom w:val="single" w:color="CCCCCC" w:sz="1"/>
+              <w:right w:val="nil"/>
+            </w:tcBorders>
+            <w:shd w:fill="FFFFFF" w:val="clear"/>
+            <w:tcMar>
+              <w:top w:type="dxa" w:w="100"/>
+              <w:left w:type="dxa" w:w="160"/>
+              <w:bottom w:type="dxa" w:w="100"/>
+              <w:right w:type="dxa" w:w="160"/>
+            </w:tcMar>
+          </w:tcPr>
+          <w:p>
+            <w:r>
+              <w:rPr>
+                <w:rFonts w:ascii="Arial" w:cs="Arial" w:eastAsia="Arial" w:hAnsi="Arial"/>
+                <w:b w:val="false"/>
+                <w:bCs w:val="false"/>
+                <w:color w:val="222222"/>
+                <w:sz w:val="20"/>
+                <w:szCs w:val="20"/>
+              </w:rPr>
+              <w:t xml:space="preserve">doughnut</w:t>
+            </w:r>
+          </w:p>
+        </w:tc>
+      </w:tr>
+      <w:tr>
+        <w:tc>
+          <w:tcPr>
+            <w:tcBorders>
+              <w:top w:val="single" w:color="CCCCCC" w:sz="1"/>
+              <w:left w:val="nil"/>
+              <w:bottom w:val="single" w:color="CCCCCC" w:sz="1"/>
+              <w:right w:val="nil"/>
+            </w:tcBorders>
+            <w:shd w:fill="F8F8F8" w:val="clear"/>
+            <w:tcMar>
+              <w:top w:type="dxa" w:w="100"/>
+              <w:left w:type="dxa" w:w="160"/>
+              <w:bottom w:type="dxa" w:w="100"/>
+              <w:right w:type="dxa" w:w="160"/>
+            </w:tcMar>
+          </w:tcPr>
+          <w:p>
+            <w:r>
+              <w:rPr>
+                <w:rFonts w:ascii="Arial" w:cs="Arial" w:eastAsia="Arial" w:hAnsi="Arial"/>
+                <w:b w:val="false"/>
+                <w:bCs w:val="false"/>
+                <w:color w:val="222222"/>
+                <w:sz w:val="20"/>
+                <w:szCs w:val="20"/>
+              </w:rPr>
+              <w:t xml:space="preserve">Area distribution drilldown</w:t>
+            </w:r>
+          </w:p>
+        </w:tc>
+        <w:tc>
+          <w:tcPr>
+            <w:tcBorders>
+              <w:top w:val="single" w:color="CCCCCC" w:sz="1"/>
+              <w:left w:val="nil"/>
+              <w:bottom w:val="single" w:color="CCCCCC" w:sz="1"/>
+              <w:right w:val="nil"/>
+            </w:tcBorders>
+            <w:shd w:fill="F8F8F8" w:val="clear"/>
+            <w:tcMar>
+              <w:top w:type="dxa" w:w="100"/>
+              <w:left w:type="dxa" w:w="160"/>
+              <w:bottom w:type="dxa" w:w="100"/>
+              <w:right w:type="dxa" w:w="160"/>
+            </w:tcMar>
+          </w:tcPr>
+          <w:p>
+            <w:r>
+              <w:rPr>
+                <w:rFonts w:ascii="Arial" w:cs="Arial" w:eastAsia="Arial" w:hAnsi="Arial"/>
+                <w:b w:val="false"/>
+                <w:bCs w:val="false"/>
+                <w:color w:val="222222"/>
+                <w:sz w:val="20"/>
+                <w:szCs w:val="20"/>
+              </w:rPr>
+              <w:t xml:space="preserve">bar (indexAxis: 'y')</w:t>
+            </w:r>
+          </w:p>
+        </w:tc>
+      </w:tr>
+      <w:tr>
+        <w:tc>
+          <w:tcPr>
+            <w:tcBorders>
+              <w:top w:val="single" w:color="CCCCCC" w:sz="1"/>
+              <w:left w:val="nil"/>
+              <w:bottom w:val="single" w:color="CCCCCC" w:sz="1"/>
+              <w:right w:val="nil"/>
+            </w:tcBorders>
+            <w:shd w:fill="FFFFFF" w:val="clear"/>
+            <w:tcMar>
+              <w:top w:type="dxa" w:w="100"/>
+              <w:left w:type="dxa" w:w="160"/>
+              <w:bottom w:type="dxa" w:w="100"/>
+              <w:right w:type="dxa" w:w="160"/>
+            </w:tcMar>
+          </w:tcPr>
+          <w:p>
+            <w:r>
+              <w:rPr>
+                <w:rFonts w:ascii="Arial" w:cs="Arial" w:eastAsia="Arial" w:hAnsi="Arial"/>
+                <w:b w:val="false"/>
+                <w:bCs w:val="false"/>
+                <w:color w:val="222222"/>
+                <w:sz w:val="20"/>
+                <w:szCs w:val="20"/>
+              </w:rPr>
+              <w:t xml:space="preserve">Intent accuracy preview</w:t>
+            </w:r>
+          </w:p>
+        </w:tc>
+        <w:tc>
+          <w:tcPr>
+            <w:tcBorders>
+              <w:top w:val="single" w:color="CCCCCC" w:sz="1"/>
+              <w:left w:val="nil"/>
+              <w:bottom w:val="single" w:color="CCCCCC" w:sz="1"/>
+              <w:right w:val="nil"/>
+            </w:tcBorders>
+            <w:shd w:fill="FFFFFF" w:val="clear"/>
+            <w:tcMar>
+              <w:top w:type="dxa" w:w="100"/>
+              <w:left w:type="dxa" w:w="160"/>
+              <w:bottom w:type="dxa" w:w="100"/>
+              <w:right w:type="dxa" w:w="160"/>
+            </w:tcMar>
+          </w:tcPr>
+          <w:p>
+            <w:r>
+              <w:rPr>
+                <w:rFonts w:ascii="Arial" w:cs="Arial" w:eastAsia="Arial" w:hAnsi="Arial"/>
+                <w:b w:val="false"/>
+                <w:bCs w:val="false"/>
+                <w:color w:val="222222"/>
+                <w:sz w:val="20"/>
+                <w:szCs w:val="20"/>
+              </w:rPr>
+              <w:t xml:space="preserve">line</w:t>
+            </w:r>
+          </w:p>
+        </w:tc>
+      </w:tr>
+      <w:tr>
+        <w:tc>
+          <w:tcPr>
+            <w:tcBorders>
+              <w:top w:val="single" w:color="CCCCCC" w:sz="1"/>
+              <w:left w:val="nil"/>
+              <w:bottom w:val="single" w:color="CCCCCC" w:sz="1"/>
+              <w:right w:val="nil"/>
+            </w:tcBorders>
+            <w:shd w:fill="F8F8F8" w:val="clear"/>
+            <w:tcMar>
+              <w:top w:type="dxa" w:w="100"/>
+              <w:left w:type="dxa" w:w="160"/>
+              <w:bottom w:type="dxa" w:w="100"/>
+              <w:right w:type="dxa" w:w="160"/>
+            </w:tcMar>
+          </w:tcPr>
+          <w:p>
+            <w:r>
+              <w:rPr>
+                <w:rFonts w:ascii="Arial" w:cs="Arial" w:eastAsia="Arial" w:hAnsi="Arial"/>
+                <w:b w:val="false"/>
+                <w:bCs w:val="false"/>
+                <w:color w:val="222222"/>
+                <w:sz w:val="20"/>
+                <w:szCs w:val="20"/>
+              </w:rPr>
+              <w:t xml:space="preserve">Intent accuracy drilldown</w:t>
+            </w:r>
+          </w:p>
+        </w:tc>
+        <w:tc>
+          <w:tcPr>
+            <w:tcBorders>
+              <w:top w:val="single" w:color="CCCCCC" w:sz="1"/>
+              <w:left w:val="nil"/>
+              <w:bottom w:val="single" w:color="CCCCCC" w:sz="1"/>
+              <w:right w:val="nil"/>
+            </w:tcBorders>
+            <w:shd w:fill="F8F8F8" w:val="clear"/>
+            <w:tcMar>
+              <w:top w:type="dxa" w:w="100"/>
+              <w:left w:type="dxa" w:w="160"/>
+              <w:bottom w:type="dxa" w:w="100"/>
+              <w:right w:type="dxa" w:w="160"/>
+            </w:tcMar>
+          </w:tcPr>
+          <w:p>
+            <w:r>
+              <w:rPr>
+                <w:rFonts w:ascii="Arial" w:cs="Arial" w:eastAsia="Arial" w:hAnsi="Arial"/>
+                <w:b w:val="false"/>
+                <w:bCs w:val="false"/>
+                <w:color w:val="222222"/>
+                <w:sz w:val="20"/>
+                <w:szCs w:val="20"/>
+              </w:rPr>
+              <w:t xml:space="preserve">line (with reference line plugin or annotation)</w:t>
+            </w:r>
+          </w:p>
+        </w:tc>
+      </w:tr>
+    </w:tbl>
+    <w:p>
+      <w:pPr>
+        <w:spacing w:before="0" w:after="0"/>
+      </w:pPr>
+      <w:r>
+        <w:rPr>
+          <w:sz w:val="22"/>
+          <w:szCs w:val="22"/>
+        </w:rPr>
+        <w:t xml:space="preserve"/>
+      </w:r>
+    </w:p>
+    <w:p>
+      <w:pPr>
+        <w:spacing w:before="60" w:after="80"/>
+      </w:pPr>
+      <w:r>
+        <w:rPr>
+          <w:rFonts w:ascii="Arial" w:cs="Arial" w:eastAsia="Arial" w:hAnsi="Arial"/>
+          <w:color w:val="222222"/>
+          <w:sz w:val="22"/>
+          <w:szCs w:val="22"/>
+        </w:rPr>
+        <w:t xml:space="preserve">The drilldown panel animation (open/close) is a simple CSS max-height transition on the panel container. No JS animation library needed.</w:t>
+      </w:r>
+    </w:p>
+    <w:p>
+      <w:pPr>
+        <w:spacing w:before="60" w:after="80"/>
+      </w:pPr>
+      <w:r>
+        <w:rPr>
+          <w:rFonts w:ascii="Arial" w:cs="Arial" w:eastAsia="Arial" w:hAnsi="Arial"/>
+          <w:color w:val="222222"/>
+          <w:sz w:val="22"/>
+          <w:szCs w:val="22"/>
+        </w:rPr>
+        <w:t xml:space="preserve">All chart data is computed on render from the existing week data already in localStorage — no new storage schema is required for the charts themselves.</w:t>
+      </w:r>
+    </w:p>
     <w:p>
       <w:pPr>
         <w:spacing w:before="0" w:after="0"/>

</xml_diff>